<commit_message>
Informe y modelo: sensibilidad del universo de commodities, desviaciones documentadas y preguntas para la defensa
- Tabla 3 ETF vs 5 ETF (control del sesgo de selección) en informe, Excel (09_Validacion) y run_all.py
- Sección 5: desviaciones de la regla con fecha y motivo (USO 14-sep, AFL/FRT 21-sep, Low-Vol 30-sep, petróleo 2-oct)
- Anexo B: preguntas anticipadas para la defensa; comisiones de StockTrak como costo operativo

Co-Authored-By: Claude Opus 5.5 <noreply@anthropic.com>
</commit_message>
<xml_diff>
--- a/nexum_proyecto_final/informe/Informe_Final_Nexum.docx
+++ b/nexum_proyecto_final/informe/Informe_Final_Nexum.docx
@@ -7442,6 +7442,266 @@
         <w:tblLook w:firstColumn="1" w:firstRow="1" w:lastColumn="0" w:lastRow="0" w:noHBand="0" w:noVBand="1" w:val="04A0"/>
       </w:tblPr>
       <w:tblGrid>
+        <w:gridCol w:w="1926"/>
+        <w:gridCol w:w="1926"/>
+        <w:gridCol w:w="1926"/>
+        <w:gridCol w:w="1926"/>
+        <w:gridCol w:w="1926"/>
+      </w:tblGrid>
+      <w:tr>
+        <w:tc>
+          <w:tcPr>
+            <w:tcW w:type="dxa" w:w="3515"/>
+            <w:shd w:val="clear" w:color="auto" w:fill="1F3A5F"/>
+          </w:tcPr>
+          <w:p>
+            <w:r/>
+            <w:r>
+              <w:rPr>
+                <w:b/>
+                <w:color w:val="FFFFFF"/>
+                <w:sz w:val="17"/>
+              </w:rPr>
+              <w:t>Universo de commodities</w:t>
+            </w:r>
+          </w:p>
+        </w:tc>
+        <w:tc>
+          <w:tcPr>
+            <w:tcW w:type="dxa" w:w="1474"/>
+            <w:shd w:val="clear" w:color="auto" w:fill="1F3A5F"/>
+          </w:tcPr>
+          <w:p>
+            <w:r/>
+            <w:r>
+              <w:rPr>
+                <w:b/>
+                <w:color w:val="FFFFFF"/>
+                <w:sz w:val="17"/>
+              </w:rPr>
+              <w:t>Cartera: retorno anual</w:t>
+            </w:r>
+          </w:p>
+        </w:tc>
+        <w:tc>
+          <w:tcPr>
+            <w:tcW w:type="dxa" w:w="1020"/>
+            <w:shd w:val="clear" w:color="auto" w:fill="1F3A5F"/>
+          </w:tcPr>
+          <w:p>
+            <w:r/>
+            <w:r>
+              <w:rPr>
+                <w:b/>
+                <w:color w:val="FFFFFF"/>
+                <w:sz w:val="17"/>
+              </w:rPr>
+              <w:t>Sharpe</w:t>
+            </w:r>
+          </w:p>
+        </w:tc>
+        <w:tc>
+          <w:tcPr>
+            <w:tcW w:type="dxa" w:w="1304"/>
+            <w:shd w:val="clear" w:color="auto" w:fill="1F3A5F"/>
+          </w:tcPr>
+          <w:p>
+            <w:r/>
+            <w:r>
+              <w:rPr>
+                <w:b/>
+                <w:color w:val="FFFFFF"/>
+                <w:sz w:val="17"/>
+              </w:rPr>
+              <w:t>Máx. caída</w:t>
+            </w:r>
+          </w:p>
+        </w:tc>
+        <w:tc>
+          <w:tcPr>
+            <w:tcW w:type="dxa" w:w="1757"/>
+            <w:shd w:val="clear" w:color="auto" w:fill="1F3A5F"/>
+          </w:tcPr>
+          <w:p>
+            <w:r/>
+            <w:r>
+              <w:rPr>
+                <w:b/>
+                <w:color w:val="FFFFFF"/>
+                <w:sz w:val="17"/>
+              </w:rPr>
+              <w:t>P(3 objetivos) histórico</w:t>
+            </w:r>
+          </w:p>
+        </w:tc>
+      </w:tr>
+      <w:tr>
+        <w:tc>
+          <w:tcPr>
+            <w:tcW w:type="dxa" w:w="3515"/>
+          </w:tcPr>
+          <w:p>
+            <w:r/>
+            <w:r>
+              <w:rPr>
+                <w:sz w:val="17"/>
+              </w:rPr>
+              <w:t>5 ETF (vigente: GLD, USO, DBA, SLV, CPER)</w:t>
+            </w:r>
+          </w:p>
+        </w:tc>
+        <w:tc>
+          <w:tcPr>
+            <w:tcW w:type="dxa" w:w="1474"/>
+          </w:tcPr>
+          <w:p>
+            <w:r/>
+            <w:r>
+              <w:rPr>
+                <w:sz w:val="17"/>
+              </w:rPr>
+              <w:t>9,99%</w:t>
+            </w:r>
+          </w:p>
+        </w:tc>
+        <w:tc>
+          <w:tcPr>
+            <w:tcW w:type="dxa" w:w="1020"/>
+          </w:tcPr>
+          <w:p>
+            <w:r/>
+            <w:r>
+              <w:rPr>
+                <w:sz w:val="17"/>
+              </w:rPr>
+              <w:t>0,850</w:t>
+            </w:r>
+          </w:p>
+        </w:tc>
+        <w:tc>
+          <w:tcPr>
+            <w:tcW w:type="dxa" w:w="1304"/>
+          </w:tcPr>
+          <w:p>
+            <w:r/>
+            <w:r>
+              <w:rPr>
+                <w:sz w:val="17"/>
+              </w:rPr>
+              <w:t>-20,5%</w:t>
+            </w:r>
+          </w:p>
+        </w:tc>
+        <w:tc>
+          <w:tcPr>
+            <w:tcW w:type="dxa" w:w="1757"/>
+          </w:tcPr>
+          <w:p>
+            <w:r/>
+            <w:r>
+              <w:rPr>
+                <w:sz w:val="17"/>
+              </w:rPr>
+              <w:t>96,0%</w:t>
+            </w:r>
+          </w:p>
+        </w:tc>
+      </w:tr>
+      <w:tr>
+        <w:tc>
+          <w:tcPr>
+            <w:tcW w:type="dxa" w:w="3515"/>
+            <w:shd w:val="clear" w:color="auto" w:fill="F2F5F9"/>
+          </w:tcPr>
+          <w:p>
+            <w:r/>
+            <w:r>
+              <w:rPr>
+                <w:sz w:val="17"/>
+              </w:rPr>
+              <w:t>3 ETF (original: GLD, USO, DBA)</w:t>
+            </w:r>
+          </w:p>
+        </w:tc>
+        <w:tc>
+          <w:tcPr>
+            <w:tcW w:type="dxa" w:w="1474"/>
+            <w:shd w:val="clear" w:color="auto" w:fill="F2F5F9"/>
+          </w:tcPr>
+          <w:p>
+            <w:r/>
+            <w:r>
+              <w:rPr>
+                <w:sz w:val="17"/>
+              </w:rPr>
+              <w:t>9,74%</w:t>
+            </w:r>
+          </w:p>
+        </w:tc>
+        <w:tc>
+          <w:tcPr>
+            <w:tcW w:type="dxa" w:w="1020"/>
+            <w:shd w:val="clear" w:color="auto" w:fill="F2F5F9"/>
+          </w:tcPr>
+          <w:p>
+            <w:r/>
+            <w:r>
+              <w:rPr>
+                <w:sz w:val="17"/>
+              </w:rPr>
+              <w:t>0,834</w:t>
+            </w:r>
+          </w:p>
+        </w:tc>
+        <w:tc>
+          <w:tcPr>
+            <w:tcW w:type="dxa" w:w="1304"/>
+            <w:shd w:val="clear" w:color="auto" w:fill="F2F5F9"/>
+          </w:tcPr>
+          <w:p>
+            <w:r/>
+            <w:r>
+              <w:rPr>
+                <w:sz w:val="17"/>
+              </w:rPr>
+              <w:t>-20,4%</w:t>
+            </w:r>
+          </w:p>
+        </w:tc>
+        <w:tc>
+          <w:tcPr>
+            <w:tcW w:type="dxa" w:w="1757"/>
+            <w:shd w:val="clear" w:color="auto" w:fill="F2F5F9"/>
+          </w:tcPr>
+          <w:p>
+            <w:r/>
+            <w:r>
+              <w:rPr>
+                <w:sz w:val="17"/>
+              </w:rPr>
+              <w:t>94,8%</w:t>
+            </w:r>
+          </w:p>
+        </w:tc>
+      </w:tr>
+    </w:tbl>
+    <w:p>
+      <w:r>
+        <w:rPr>
+          <w:i/>
+          <w:sz w:val="16"/>
+        </w:rPr>
+        <w:t>Control del sesgo de selección: con el universo original de 3 ETF la cartera rinde 0,25 puntos menos al año y la probabilidad de cumplir los tres objetivos baja ~1 punto. La conclusión del IPS no depende de esa decisión.</w:t>
+      </w:r>
+    </w:p>
+    <w:tbl>
+      <w:tblPr>
+        <w:tblStyle w:val="TableGrid"/>
+        <w:tblW w:type="auto" w:w="0"/>
+        <w:jc w:val="center"/>
+        <w:tblLook w:firstColumn="1" w:firstRow="1" w:lastColumn="0" w:lastRow="0" w:noHBand="0" w:noVBand="1" w:val="04A0"/>
+      </w:tblPr>
+      <w:tblGrid>
         <w:gridCol w:w="3211"/>
         <w:gridCol w:w="3211"/>
         <w:gridCol w:w="3211"/>
@@ -7805,9 +8065,342 @@
         <w:t xml:space="preserve">Operaciones: </w:t>
       </w:r>
       <w:r>
-        <w:t>~50 en las primeras tres semanas, en línea con la regla de 150 en 12 semanas.</w:t>
+        <w:t>~50 en las primeras tres semanas, en línea con la regla de 150 en 12 semanas. Las comisiones de la plataforma (~USD 10 por operación, ~USD 1.500 por las 150 exigidas) se tratan como costo operativo de la simulación y no entran en Black-Litterman ni en el Montecarlo.</w:t>
       </w:r>
     </w:p>
+    <w:p>
+      <w:r>
+        <w:rPr>
+          <w:i w:val="0"/>
+        </w:rPr>
+        <w:t>Desviaciones respecto de la regla, documentadas:</w:t>
+      </w:r>
+    </w:p>
+    <w:tbl>
+      <w:tblPr>
+        <w:tblStyle w:val="TableGrid"/>
+        <w:tblW w:type="auto" w:w="0"/>
+        <w:jc w:val="center"/>
+        <w:tblLook w:firstColumn="1" w:firstRow="1" w:lastColumn="0" w:lastRow="0" w:noHBand="0" w:noVBand="1" w:val="04A0"/>
+      </w:tblPr>
+      <w:tblGrid>
+        <w:gridCol w:w="2408"/>
+        <w:gridCol w:w="2408"/>
+        <w:gridCol w:w="2408"/>
+        <w:gridCol w:w="2408"/>
+      </w:tblGrid>
+      <w:tr>
+        <w:tc>
+          <w:tcPr>
+            <w:tcW w:type="dxa" w:w="850"/>
+            <w:shd w:val="clear" w:color="auto" w:fill="1F3A5F"/>
+          </w:tcPr>
+          <w:p>
+            <w:r/>
+            <w:r>
+              <w:rPr>
+                <w:b/>
+                <w:color w:val="FFFFFF"/>
+                <w:sz w:val="15"/>
+              </w:rPr>
+              <w:t>Fecha</w:t>
+            </w:r>
+          </w:p>
+        </w:tc>
+        <w:tc>
+          <w:tcPr>
+            <w:tcW w:type="dxa" w:w="1474"/>
+            <w:shd w:val="clear" w:color="auto" w:fill="1F3A5F"/>
+          </w:tcPr>
+          <w:p>
+            <w:r/>
+            <w:r>
+              <w:rPr>
+                <w:b/>
+                <w:color w:val="FFFFFF"/>
+                <w:sz w:val="15"/>
+              </w:rPr>
+              <w:t>Sleeve</w:t>
+            </w:r>
+          </w:p>
+        </w:tc>
+        <w:tc>
+          <w:tcPr>
+            <w:tcW w:type="dxa" w:w="3061"/>
+            <w:shd w:val="clear" w:color="auto" w:fill="1F3A5F"/>
+          </w:tcPr>
+          <w:p>
+            <w:r/>
+            <w:r>
+              <w:rPr>
+                <w:b/>
+                <w:color w:val="FFFFFF"/>
+                <w:sz w:val="15"/>
+              </w:rPr>
+              <w:t>Desviación</w:t>
+            </w:r>
+          </w:p>
+        </w:tc>
+        <w:tc>
+          <w:tcPr>
+            <w:tcW w:type="dxa" w:w="3685"/>
+            <w:shd w:val="clear" w:color="auto" w:fill="1F3A5F"/>
+          </w:tcPr>
+          <w:p>
+            <w:r/>
+            <w:r>
+              <w:rPr>
+                <w:b/>
+                <w:color w:val="FFFFFF"/>
+                <w:sz w:val="15"/>
+              </w:rPr>
+              <w:t>Motivo / tratamiento</w:t>
+            </w:r>
+          </w:p>
+        </w:tc>
+      </w:tr>
+      <w:tr>
+        <w:tc>
+          <w:tcPr>
+            <w:tcW w:type="dxa" w:w="850"/>
+          </w:tcPr>
+          <w:p>
+            <w:r/>
+            <w:r>
+              <w:rPr>
+                <w:sz w:val="15"/>
+              </w:rPr>
+              <w:t>14-sep</w:t>
+            </w:r>
+          </w:p>
+        </w:tc>
+        <w:tc>
+          <w:tcPr>
+            <w:tcW w:type="dxa" w:w="1474"/>
+          </w:tcPr>
+          <w:p>
+            <w:r/>
+            <w:r>
+              <w:rPr>
+                <w:sz w:val="15"/>
+              </w:rPr>
+              <w:t>Commodities</w:t>
+            </w:r>
+          </w:p>
+        </w:tc>
+        <w:tc>
+          <w:tcPr>
+            <w:tcW w:type="dxa" w:w="3061"/>
+          </w:tcPr>
+          <w:p>
+            <w:r/>
+            <w:r>
+              <w:rPr>
+                <w:sz w:val="15"/>
+              </w:rPr>
+              <w:t>Compra de USO aunque al 31-ago ningún commodity calificaba</w:t>
+            </w:r>
+          </w:p>
+        </w:tc>
+        <w:tc>
+          <w:tcPr>
+            <w:tcW w:type="dxa" w:w="3685"/>
+          </w:tcPr>
+          <w:p>
+            <w:r/>
+            <w:r>
+              <w:rPr>
+                <w:sz w:val="15"/>
+              </w:rPr>
+              <w:t>La señal se recalculó con precios del 14-sep (día de la implementación). Se vendió el 2-oct; la señal de octubre confirmó su salida</w:t>
+            </w:r>
+          </w:p>
+        </w:tc>
+      </w:tr>
+      <w:tr>
+        <w:tc>
+          <w:tcPr>
+            <w:tcW w:type="dxa" w:w="850"/>
+            <w:shd w:val="clear" w:color="auto" w:fill="F2F5F9"/>
+          </w:tcPr>
+          <w:p>
+            <w:r/>
+            <w:r>
+              <w:rPr>
+                <w:sz w:val="15"/>
+              </w:rPr>
+              <w:t>21-sep</w:t>
+            </w:r>
+          </w:p>
+        </w:tc>
+        <w:tc>
+          <w:tcPr>
+            <w:tcW w:type="dxa" w:w="1474"/>
+            <w:shd w:val="clear" w:color="auto" w:fill="F2F5F9"/>
+          </w:tcPr>
+          <w:p>
+            <w:r/>
+            <w:r>
+              <w:rPr>
+                <w:sz w:val="15"/>
+              </w:rPr>
+              <w:t>Low-Volatility</w:t>
+            </w:r>
+          </w:p>
+        </w:tc>
+        <w:tc>
+          <w:tcPr>
+            <w:tcW w:type="dxa" w:w="3061"/>
+            <w:shd w:val="clear" w:color="auto" w:fill="F2F5F9"/>
+          </w:tcPr>
+          <w:p>
+            <w:r/>
+            <w:r>
+              <w:rPr>
+                <w:sz w:val="15"/>
+              </w:rPr>
+              <w:t>Se reemplazaron BRK/B y MCD por AFL y FRT</w:t>
+            </w:r>
+          </w:p>
+        </w:tc>
+        <w:tc>
+          <w:tcPr>
+            <w:tcW w:type="dxa" w:w="3685"/>
+            <w:shd w:val="clear" w:color="auto" w:fill="F2F5F9"/>
+          </w:tcPr>
+          <w:p>
+            <w:r/>
+            <w:r>
+              <w:rPr>
+                <w:sz w:val="15"/>
+              </w:rPr>
+              <w:t>FRT entraba a la selección de la revisión del 18-sep (en lugar de O). AFL y las salidas de BRK/B y MCD no corresponden a la regla: desviación discrecional, se corrige en el rebalanceo de fin de octubre</w:t>
+            </w:r>
+          </w:p>
+        </w:tc>
+      </w:tr>
+      <w:tr>
+        <w:tc>
+          <w:tcPr>
+            <w:tcW w:type="dxa" w:w="850"/>
+          </w:tcPr>
+          <w:p>
+            <w:r/>
+            <w:r>
+              <w:rPr>
+                <w:sz w:val="15"/>
+              </w:rPr>
+              <w:t>30-sep</w:t>
+            </w:r>
+          </w:p>
+        </w:tc>
+        <w:tc>
+          <w:tcPr>
+            <w:tcW w:type="dxa" w:w="1474"/>
+          </w:tcPr>
+          <w:p>
+            <w:r/>
+            <w:r>
+              <w:rPr>
+                <w:sz w:val="15"/>
+              </w:rPr>
+              <w:t>Low-Volatility</w:t>
+            </w:r>
+          </w:p>
+        </w:tc>
+        <w:tc>
+          <w:tcPr>
+            <w:tcW w:type="dxa" w:w="3061"/>
+          </w:tcPr>
+          <w:p>
+            <w:r/>
+            <w:r>
+              <w:rPr>
+                <w:sz w:val="15"/>
+              </w:rPr>
+              <w:t>Salen O y DUK; entran PG, RSG y SNA; se excluye MCD</w:t>
+            </w:r>
+          </w:p>
+        </w:tc>
+        <w:tc>
+          <w:tcPr>
+            <w:tcW w:type="dxa" w:w="3685"/>
+          </w:tcPr>
+          <w:p>
+            <w:r/>
+            <w:r>
+              <w:rPr>
+                <w:sz w:val="15"/>
+              </w:rPr>
+              <w:t>Reducir utilities y REITs (sensibles a tasas) de 50% a ~29% del sleeve; MCD excluida por deterioro de tendencia. Reemplazos en orden del ranking</w:t>
+            </w:r>
+          </w:p>
+        </w:tc>
+      </w:tr>
+      <w:tr>
+        <w:tc>
+          <w:tcPr>
+            <w:tcW w:type="dxa" w:w="850"/>
+            <w:shd w:val="clear" w:color="auto" w:fill="F2F5F9"/>
+          </w:tcPr>
+          <w:p>
+            <w:r/>
+            <w:r>
+              <w:rPr>
+                <w:sz w:val="15"/>
+              </w:rPr>
+              <w:t>2-oct</w:t>
+            </w:r>
+          </w:p>
+        </w:tc>
+        <w:tc>
+          <w:tcPr>
+            <w:tcW w:type="dxa" w:w="1474"/>
+            <w:shd w:val="clear" w:color="auto" w:fill="F2F5F9"/>
+          </w:tcPr>
+          <w:p>
+            <w:r/>
+            <w:r>
+              <w:rPr>
+                <w:sz w:val="15"/>
+              </w:rPr>
+              <w:t>Momentum / Commodities</w:t>
+            </w:r>
+          </w:p>
+        </w:tc>
+        <w:tc>
+          <w:tcPr>
+            <w:tcW w:type="dxa" w:w="3061"/>
+            <w:shd w:val="clear" w:color="auto" w:fill="F2F5F9"/>
+          </w:tcPr>
+          <w:p>
+            <w:r/>
+            <w:r>
+              <w:rPr>
+                <w:sz w:val="15"/>
+              </w:rPr>
+              <w:t>Venta de MPC, VLO y USO</w:t>
+            </w:r>
+          </w:p>
+        </w:tc>
+        <w:tc>
+          <w:tcPr>
+            <w:tcW w:type="dxa" w:w="3685"/>
+            <w:shd w:val="clear" w:color="auto" w:fill="F2F5F9"/>
+          </w:tcPr>
+          <w:p>
+            <w:r/>
+            <w:r>
+              <w:rPr>
+                <w:sz w:val="15"/>
+              </w:rPr>
+              <w:t>Reducir la exposición conjunta al petróleo; MPC y VLO seguían en la señal (decisión de riesgo)</w:t>
+            </w:r>
+          </w:p>
+        </w:tc>
+      </w:tr>
+    </w:tbl>
+    <w:p/>
     <w:p>
       <w:r>
         <w:rPr>
@@ -8901,7 +9494,99 @@
         <w:pStyle w:val="Heading1"/>
       </w:pPr>
       <w:r>
-        <w:t>Anexo B. Reproducibilidad</w:t>
+        <w:t>Anexo B. Preguntas anticipadas para la defensa</w:t>
+      </w:r>
+    </w:p>
+    <w:p>
+      <w:r>
+        <w:rPr>
+          <w:b/>
+        </w:rPr>
+        <w:t xml:space="preserve">¿Por qué ampliaron el universo de commodities de 3 a 5 ETF después de ver el backtest? </w:t>
+      </w:r>
+      <w:r>
+        <w:rPr>
+          <w:i w:val="0"/>
+        </w:rPr>
+        <w:t>Para diversificar entre complejos de commodities: metales preciosos, energía y agrícolas, más metales industriales (plata y cobre). Reconocemos que la elección de SLV y CPER se hizo después de ver el backtest; por eso lo declaramos como sesgo de selección y lo controlamos. Con el universo original de 3 ETF la cartera rinde 0,25 puntos menos al año, el Sharpe baja de 0,85 a 0,83 y la probabilidad de los tres objetivos de 96,0% a 94,8%. La conclusión no depende de esa decisión, y es el sleeve con menor peso (6,1%) justamente por ser el más frágil.</w:t>
+      </w:r>
+    </w:p>
+    <w:p>
+      <w:r>
+        <w:rPr>
+          <w:b/>
+        </w:rPr>
+        <w:t xml:space="preserve">¿Por qué Villarrica tiene prioridad sobre la herencia, si la herencia es el monto mayor? </w:t>
+      </w:r>
+      <w:r>
+        <w:rPr>
+          <w:i w:val="0"/>
+        </w:rPr>
+        <w:t>Porque la herencia no tiene fecha rígida y es un objetivo de riqueza terminal a 50 años: por diseño absorbe la variabilidad de los resultados. Villarrica tiene fecha (la jubilación) y compromete además UF 15.000 de la venta de la casa. Es el orden del enunciado y fue validado con el criterio de flexibilidad. Las palancas siguen ese mismo orden: primero se ajusta la herencia, luego Villarrica, nunca Educación.</w:t>
+      </w:r>
+    </w:p>
+    <w:p>
+      <w:r>
+        <w:rPr>
+          <w:b/>
+        </w:rPr>
+        <w:t xml:space="preserve">¿Por qué la probabilidad de cumplir los tres objetivos es solo 46,5% en el escenario prospectivo? </w:t>
+      </w:r>
+      <w:r>
+        <w:rPr>
+          <w:i w:val="0"/>
+        </w:rPr>
+        <w:t>Porque con supuestos prudentes el retorno real esperado (~4,6%) apenas iguala al requerido (4,56%). Lo presentamos con transparencia en vez de mostrar solo el 96% histórico. Educación está asegurada en todos los escenarios; para Villarrica y la herencia se acordaron palancas que elevan la probabilidad a ~75%.</w:t>
+      </w:r>
+    </w:p>
+    <w:p>
+      <w:r>
+        <w:rPr>
+          <w:b/>
+        </w:rPr>
+        <w:t xml:space="preserve">¿Por qué USD como moneda funcional si las necesidades del cliente están en UF y CLP? </w:t>
+      </w:r>
+      <w:r>
+        <w:rPr>
+          <w:i w:val="0"/>
+        </w:rPr>
+        <w:t>Todo el universo de inversión cotiza en USD y cubrir el tipo de cambio requiere derivados que el perfil excluye. El peso se deprecia cuando caen los mercados (cobertura natural) y el ahorro en USD diversifica el riesgo país de una familia cuyo capital humano y vivienda están en Chile. Las simulaciones se presentan también en UF.</w:t>
+      </w:r>
+    </w:p>
+    <w:p>
+      <w:r>
+        <w:rPr>
+          <w:b/>
+        </w:rPr>
+        <w:t xml:space="preserve">¿Por qué no usan Markowitz si tiene mayor Sharpe? </w:t>
+      </w:r>
+      <w:r>
+        <w:rPr>
+          <w:i w:val="0"/>
+        </w:rPr>
+        <w:t>Porque ese Sharpe es dentro de muestra. En la prueba fuera de muestra (calibrar con 2013-2019 y evaluar 2020-2026), Markowitz cae a 0,45, mientras que Black-Litterman calibrado con la misma información logra 0,65.</w:t>
+      </w:r>
+    </w:p>
+    <w:p>
+      <w:r>
+        <w:rPr>
+          <w:b/>
+        </w:rPr>
+        <w:t xml:space="preserve">¿El modelo que presentan es el mismo que operan en StockTrak? </w:t>
+      </w:r>
+      <w:r>
+        <w:rPr>
+          <w:i w:val="0"/>
+        </w:rPr>
+        <w:t>Sí. Los pesos implementados son los de Black-Litterman y las reglas de las estrategias son las mismas del backtest. Las desviaciones discrecionales están documentadas en la sección 5 con fecha y motivo.</w:t>
+      </w:r>
+    </w:p>
+    <w:p>
+      <w:pPr>
+        <w:pStyle w:val="Heading1"/>
+      </w:pPr>
+      <w:r>
+        <w:t>Anexo C. Reproducibilidad</w:t>
       </w:r>
     </w:p>
     <w:p>

</xml_diff>

<commit_message>
Agregar análisis complementarios: contribución al riesgo, desempleo de Tomás y abanico del patrimonio
Rescatados del trabajo de Francisca (modelo_nexum/) y recalculados con el modelo oficial:
- Contribución al riesgo por activo (Python + fórmulas vivas en Excel, hoja 06)
- Montecarlo con desempleo persistente de Tomás, correlacionado con el mercado, y estrés de pérdida permanente
- Abanico del patrimonio real (percentiles 10-90), histórico y prospectivo
- Informe: nuevas figuras 3 y 7, tabla de capital humano; Excel: hojas 06 y 08 ampliadas

Co-Authored-By: Claude Opus 5.5 <noreply@anthropic.com>
</commit_message>
<xml_diff>
--- a/nexum_proyecto_final/informe/Informe_Final_Nexum.docx
+++ b/nexum_proyecto_final/informe/Informe_Final_Nexum.docx
@@ -2854,8 +2854,67 @@
       <w:r>
         <w:drawing>
           <wp:inline xmlns:a="http://schemas.openxmlformats.org/drawingml/2006/main" xmlns:pic="http://schemas.openxmlformats.org/drawingml/2006/picture">
+            <wp:extent cx="5760000" cy="2400000"/>
+            <wp:docPr id="3" name="Picture 3"/>
+            <wp:cNvGraphicFramePr>
+              <a:graphicFrameLocks noChangeAspect="1"/>
+            </wp:cNvGraphicFramePr>
+            <a:graphic>
+              <a:graphicData uri="http://schemas.openxmlformats.org/drawingml/2006/picture">
+                <pic:pic>
+                  <pic:nvPicPr>
+                    <pic:cNvPr id="0" name="f8_riesgo.png"/>
+                    <pic:cNvPicPr/>
+                  </pic:nvPicPr>
+                  <pic:blipFill>
+                    <a:blip r:embed="rId11"/>
+                    <a:stretch>
+                      <a:fillRect/>
+                    </a:stretch>
+                  </pic:blipFill>
+                  <pic:spPr>
+                    <a:xfrm>
+                      <a:off x="0" y="0"/>
+                      <a:ext cx="5760000" cy="2400000"/>
+                    </a:xfrm>
+                    <a:prstGeom prst="rect"/>
+                  </pic:spPr>
+                </pic:pic>
+              </a:graphicData>
+            </a:graphic>
+          </wp:inline>
+        </w:drawing>
+      </w:r>
+    </w:p>
+    <w:p>
+      <w:pPr>
+        <w:jc w:val="center"/>
+      </w:pPr>
+      <w:r>
+        <w:rPr>
+          <w:i/>
+          <w:sz w:val="16"/>
+        </w:rPr>
+        <w:t>Figura 3. Peso de cada activo frente a su contribución al riesgo total (pesos aprobados, covarianza 2013-2026). Fuente: hoja 06 del modelo.</w:t>
+      </w:r>
+    </w:p>
+    <w:p>
+      <w:r>
+        <w:rPr>
+          <w:i w:val="0"/>
+        </w:rPr>
+        <w:t>Contribución al riesgo: el S&amp;P 500 pesa 37,9% pero aporta 49,5% del riesgo; Momentum pesa 7,1% y aporta 11,9%. Los bonos del Tesoro diversifican: con 16,9% del capital aportan solo 7,4%. El presupuesto de riesgo está dominado por la renta variable, coherente con un perfil moderado-agresivo que necesita prima por riesgo para cumplir sus objetivos.</w:t>
+      </w:r>
+    </w:p>
+    <w:p>
+      <w:pPr>
+        <w:jc w:val="center"/>
+      </w:pPr>
+      <w:r>
+        <w:drawing>
+          <wp:inline xmlns:a="http://schemas.openxmlformats.org/drawingml/2006/main" xmlns:pic="http://schemas.openxmlformats.org/drawingml/2006/picture">
             <wp:extent cx="5760000" cy="2720000"/>
-            <wp:docPr id="3" name="Picture 3"/>
+            <wp:docPr id="4" name="Picture 4"/>
             <wp:cNvGraphicFramePr>
               <a:graphicFrameLocks noChangeAspect="1"/>
             </wp:cNvGraphicFramePr>
@@ -2867,7 +2926,7 @@
                     <pic:cNvPicPr/>
                   </pic:nvPicPr>
                   <pic:blipFill>
-                    <a:blip r:embed="rId11"/>
+                    <a:blip r:embed="rId12"/>
                     <a:stretch>
                       <a:fillRect/>
                     </a:stretch>
@@ -2895,7 +2954,7 @@
           <w:i/>
           <w:sz w:val="16"/>
         </w:rPr>
-        <w:t>Figura 3. Crecimiento de USD 100 (2016-2026). Fuente: resultados/retornos_cartera_benchmark.csv.</w:t>
+        <w:t>Figura 4. Crecimiento de USD 100 (2016-2026). Fuente: resultados/retornos_cartera_benchmark.csv.</w:t>
       </w:r>
     </w:p>
     <w:p>
@@ -2906,7 +2965,7 @@
         <w:drawing>
           <wp:inline xmlns:a="http://schemas.openxmlformats.org/drawingml/2006/main" xmlns:pic="http://schemas.openxmlformats.org/drawingml/2006/picture">
             <wp:extent cx="5760000" cy="2080000"/>
-            <wp:docPr id="4" name="Picture 4"/>
+            <wp:docPr id="5" name="Picture 5"/>
             <wp:cNvGraphicFramePr>
               <a:graphicFrameLocks noChangeAspect="1"/>
             </wp:cNvGraphicFramePr>
@@ -2918,7 +2977,7 @@
                     <pic:cNvPicPr/>
                   </pic:nvPicPr>
                   <pic:blipFill>
-                    <a:blip r:embed="rId12"/>
+                    <a:blip r:embed="rId13"/>
                     <a:stretch>
                       <a:fillRect/>
                     </a:stretch>
@@ -2946,7 +3005,7 @@
           <w:i/>
           <w:sz w:val="16"/>
         </w:rPr>
-        <w:t>Figura 4. Caídas desde el máximo: Nexum frente a la cartera actual de la AGF.</w:t>
+        <w:t>Figura 5. Caídas desde el máximo: Nexum frente a la cartera actual de la AGF.</w:t>
       </w:r>
     </w:p>
     <w:p>
@@ -5085,7 +5144,7 @@
         <w:drawing>
           <wp:inline xmlns:a="http://schemas.openxmlformats.org/drawingml/2006/main" xmlns:pic="http://schemas.openxmlformats.org/drawingml/2006/picture">
             <wp:extent cx="5760000" cy="2560000"/>
-            <wp:docPr id="5" name="Picture 5"/>
+            <wp:docPr id="6" name="Picture 6"/>
             <wp:cNvGraphicFramePr>
               <a:graphicFrameLocks noChangeAspect="1"/>
             </wp:cNvGraphicFramePr>
@@ -5097,7 +5156,7 @@
                     <pic:cNvPicPr/>
                   </pic:nvPicPr>
                   <pic:blipFill>
-                    <a:blip r:embed="rId13"/>
+                    <a:blip r:embed="rId14"/>
                     <a:stretch>
                       <a:fillRect/>
                     </a:stretch>
@@ -5125,7 +5184,7 @@
           <w:i/>
           <w:sz w:val="16"/>
         </w:rPr>
-        <w:t>Figura 5. Probabilidad de cumplir cada objetivo. Fuente: codigo/montecarlo.py; hoja 08_Montecarlo.</w:t>
+        <w:t>Figura 6. Probabilidad de cumplir cada objetivo. Fuente: codigo/montecarlo.py; hoja 08_Montecarlo.</w:t>
       </w:r>
     </w:p>
     <w:tbl>
@@ -6646,6 +6705,1100 @@
       </w:tr>
     </w:tbl>
     <w:p/>
+    <w:p>
+      <w:pPr>
+        <w:jc w:val="center"/>
+      </w:pPr>
+      <w:r>
+        <w:drawing>
+          <wp:inline xmlns:a="http://schemas.openxmlformats.org/drawingml/2006/main" xmlns:pic="http://schemas.openxmlformats.org/drawingml/2006/picture">
+            <wp:extent cx="5760000" cy="2568649"/>
+            <wp:docPr id="7" name="Picture 7"/>
+            <wp:cNvGraphicFramePr>
+              <a:graphicFrameLocks noChangeAspect="1"/>
+            </wp:cNvGraphicFramePr>
+            <a:graphic>
+              <a:graphicData uri="http://schemas.openxmlformats.org/drawingml/2006/picture">
+                <pic:pic>
+                  <pic:nvPicPr>
+                    <pic:cNvPr id="0" name="f7_abanico.png"/>
+                    <pic:cNvPicPr/>
+                  </pic:nvPicPr>
+                  <pic:blipFill>
+                    <a:blip r:embed="rId15"/>
+                    <a:stretch>
+                      <a:fillRect/>
+                    </a:stretch>
+                  </pic:blipFill>
+                  <pic:spPr>
+                    <a:xfrm>
+                      <a:off x="0" y="0"/>
+                      <a:ext cx="5760000" cy="2568649"/>
+                    </a:xfrm>
+                    <a:prstGeom prst="rect"/>
+                  </pic:spPr>
+                </pic:pic>
+              </a:graphicData>
+            </a:graphic>
+          </wp:inline>
+        </w:drawing>
+      </w:r>
+    </w:p>
+    <w:p>
+      <w:pPr>
+        <w:jc w:val="center"/>
+      </w:pPr>
+      <w:r>
+        <w:rPr>
+          <w:i/>
+          <w:sz w:val="16"/>
+        </w:rPr>
+        <w:t>Figura 7. Abanico del patrimonio real (percentiles 10-90). Escalas distintas en cada panel. La caída del año 25 es la compra de Villarrica.</w:t>
+      </w:r>
+    </w:p>
+    <w:p>
+      <w:r>
+        <w:rPr>
+          <w:i w:val="0"/>
+        </w:rPr>
+        <w:t>Distribución del patrimonio (prospectivo, USD de hoy): al iniciar Educación (año 14) la mediana es USD 436.784 y el 10% peor USD 293.358, muy por sobre los ~USD 143.000 que cuesta Educación completa; antes de Villarrica (año 25) la mediana es USD 617.754 frente a un desembolso de ~USD 470.000; al año 50 la mediana es USD 414.318, bajo la meta de herencia de USD 500.000. Es la misma conclusión de la TIR: Educación está holgada, Villarrica es ajustada y la herencia es la variable de ajuste.</w:t>
+      </w:r>
+    </w:p>
+    <w:p>
+      <w:pPr>
+        <w:pStyle w:val="Heading3"/>
+      </w:pPr>
+      <w:r>
+        <w:t>Capital humano: desempleo de Tomás</w:t>
+      </w:r>
+    </w:p>
+    <w:tbl>
+      <w:tblPr>
+        <w:tblStyle w:val="TableGrid"/>
+        <w:tblW w:type="auto" w:w="0"/>
+        <w:jc w:val="center"/>
+        <w:tblLook w:firstColumn="1" w:firstRow="1" w:lastColumn="0" w:lastRow="0" w:noHBand="0" w:noVBand="1" w:val="04A0"/>
+      </w:tblPr>
+      <w:tblGrid>
+        <w:gridCol w:w="1605"/>
+        <w:gridCol w:w="1605"/>
+        <w:gridCol w:w="1605"/>
+        <w:gridCol w:w="1605"/>
+        <w:gridCol w:w="1605"/>
+        <w:gridCol w:w="1605"/>
+      </w:tblGrid>
+      <w:tr>
+        <w:tc>
+          <w:tcPr>
+            <w:tcW w:type="dxa" w:w="3742"/>
+            <w:shd w:val="clear" w:color="auto" w:fill="1F3A5F"/>
+          </w:tcPr>
+          <w:p>
+            <w:r/>
+            <w:r>
+              <w:rPr>
+                <w:b/>
+                <w:color w:val="FFFFFF"/>
+                <w:sz w:val="15"/>
+              </w:rPr>
+              <w:t>Escenario de empleo</w:t>
+            </w:r>
+          </w:p>
+        </w:tc>
+        <w:tc>
+          <w:tcPr>
+            <w:tcW w:type="dxa" w:w="1134"/>
+            <w:shd w:val="clear" w:color="auto" w:fill="1F3A5F"/>
+          </w:tcPr>
+          <w:p>
+            <w:r/>
+            <w:r>
+              <w:rPr>
+                <w:b/>
+                <w:color w:val="FFFFFF"/>
+                <w:sz w:val="15"/>
+              </w:rPr>
+              <w:t>Mercado</w:t>
+            </w:r>
+          </w:p>
+        </w:tc>
+        <w:tc>
+          <w:tcPr>
+            <w:tcW w:type="dxa" w:w="1020"/>
+            <w:shd w:val="clear" w:color="auto" w:fill="1F3A5F"/>
+          </w:tcPr>
+          <w:p>
+            <w:r/>
+            <w:r>
+              <w:rPr>
+                <w:b/>
+                <w:color w:val="FFFFFF"/>
+                <w:sz w:val="15"/>
+              </w:rPr>
+              <w:t>P(Educación)</w:t>
+            </w:r>
+          </w:p>
+        </w:tc>
+        <w:tc>
+          <w:tcPr>
+            <w:tcW w:type="dxa" w:w="1077"/>
+            <w:shd w:val="clear" w:color="auto" w:fill="1F3A5F"/>
+          </w:tcPr>
+          <w:p>
+            <w:r/>
+            <w:r>
+              <w:rPr>
+                <w:b/>
+                <w:color w:val="FFFFFF"/>
+                <w:sz w:val="15"/>
+              </w:rPr>
+              <w:t>P(Villarrica)</w:t>
+            </w:r>
+          </w:p>
+        </w:tc>
+        <w:tc>
+          <w:tcPr>
+            <w:tcW w:type="dxa" w:w="1020"/>
+            <w:shd w:val="clear" w:color="auto" w:fill="1F3A5F"/>
+          </w:tcPr>
+          <w:p>
+            <w:r/>
+            <w:r>
+              <w:rPr>
+                <w:b/>
+                <w:color w:val="FFFFFF"/>
+                <w:sz w:val="15"/>
+              </w:rPr>
+              <w:t>P(Herencia)</w:t>
+            </w:r>
+          </w:p>
+        </w:tc>
+        <w:tc>
+          <w:tcPr>
+            <w:tcW w:type="dxa" w:w="1077"/>
+            <w:shd w:val="clear" w:color="auto" w:fill="1F3A5F"/>
+          </w:tcPr>
+          <w:p>
+            <w:r/>
+            <w:r>
+              <w:rPr>
+                <w:b/>
+                <w:color w:val="FFFFFF"/>
+                <w:sz w:val="15"/>
+              </w:rPr>
+              <w:t>P(3 objetivos)</w:t>
+            </w:r>
+          </w:p>
+        </w:tc>
+      </w:tr>
+      <w:tr>
+        <w:tc>
+          <w:tcPr>
+            <w:tcW w:type="dxa" w:w="3742"/>
+          </w:tcPr>
+          <w:p>
+            <w:r/>
+            <w:r>
+              <w:rPr>
+                <w:sz w:val="15"/>
+              </w:rPr>
+              <w:t>Sin desempleo (base)</w:t>
+            </w:r>
+          </w:p>
+        </w:tc>
+        <w:tc>
+          <w:tcPr>
+            <w:tcW w:type="dxa" w:w="1134"/>
+          </w:tcPr>
+          <w:p>
+            <w:r/>
+            <w:r>
+              <w:rPr>
+                <w:sz w:val="15"/>
+              </w:rPr>
+              <w:t>Histórico</w:t>
+            </w:r>
+          </w:p>
+        </w:tc>
+        <w:tc>
+          <w:tcPr>
+            <w:tcW w:type="dxa" w:w="1020"/>
+          </w:tcPr>
+          <w:p>
+            <w:r/>
+            <w:r>
+              <w:rPr>
+                <w:sz w:val="15"/>
+              </w:rPr>
+              <w:t>100,0%</w:t>
+            </w:r>
+          </w:p>
+        </w:tc>
+        <w:tc>
+          <w:tcPr>
+            <w:tcW w:type="dxa" w:w="1077"/>
+          </w:tcPr>
+          <w:p>
+            <w:r/>
+            <w:r>
+              <w:rPr>
+                <w:sz w:val="15"/>
+              </w:rPr>
+              <w:t>98,1%</w:t>
+            </w:r>
+          </w:p>
+        </w:tc>
+        <w:tc>
+          <w:tcPr>
+            <w:tcW w:type="dxa" w:w="1020"/>
+          </w:tcPr>
+          <w:p>
+            <w:r/>
+            <w:r>
+              <w:rPr>
+                <w:sz w:val="15"/>
+              </w:rPr>
+              <w:t>96,0%</w:t>
+            </w:r>
+          </w:p>
+        </w:tc>
+        <w:tc>
+          <w:tcPr>
+            <w:tcW w:type="dxa" w:w="1077"/>
+          </w:tcPr>
+          <w:p>
+            <w:r/>
+            <w:r>
+              <w:rPr>
+                <w:sz w:val="15"/>
+              </w:rPr>
+              <w:t>96,0%</w:t>
+            </w:r>
+          </w:p>
+        </w:tc>
+      </w:tr>
+      <w:tr>
+        <w:tc>
+          <w:tcPr>
+            <w:tcW w:type="dxa" w:w="3742"/>
+            <w:shd w:val="clear" w:color="auto" w:fill="F2F5F9"/>
+          </w:tcPr>
+          <w:p>
+            <w:r/>
+            <w:r>
+              <w:rPr>
+                <w:sz w:val="15"/>
+              </w:rPr>
+              <w:t>Sin desempleo (base)</w:t>
+            </w:r>
+          </w:p>
+        </w:tc>
+        <w:tc>
+          <w:tcPr>
+            <w:tcW w:type="dxa" w:w="1134"/>
+            <w:shd w:val="clear" w:color="auto" w:fill="F2F5F9"/>
+          </w:tcPr>
+          <w:p>
+            <w:r/>
+            <w:r>
+              <w:rPr>
+                <w:sz w:val="15"/>
+              </w:rPr>
+              <w:t>Prospectivo</w:t>
+            </w:r>
+          </w:p>
+        </w:tc>
+        <w:tc>
+          <w:tcPr>
+            <w:tcW w:type="dxa" w:w="1020"/>
+            <w:shd w:val="clear" w:color="auto" w:fill="F2F5F9"/>
+          </w:tcPr>
+          <w:p>
+            <w:r/>
+            <w:r>
+              <w:rPr>
+                <w:sz w:val="15"/>
+              </w:rPr>
+              <w:t>100,0%</w:t>
+            </w:r>
+          </w:p>
+        </w:tc>
+        <w:tc>
+          <w:tcPr>
+            <w:tcW w:type="dxa" w:w="1077"/>
+            <w:shd w:val="clear" w:color="auto" w:fill="F2F5F9"/>
+          </w:tcPr>
+          <w:p>
+            <w:r/>
+            <w:r>
+              <w:rPr>
+                <w:sz w:val="15"/>
+              </w:rPr>
+              <w:t>71,3%</w:t>
+            </w:r>
+          </w:p>
+        </w:tc>
+        <w:tc>
+          <w:tcPr>
+            <w:tcW w:type="dxa" w:w="1020"/>
+            <w:shd w:val="clear" w:color="auto" w:fill="F2F5F9"/>
+          </w:tcPr>
+          <w:p>
+            <w:r/>
+            <w:r>
+              <w:rPr>
+                <w:sz w:val="15"/>
+              </w:rPr>
+              <w:t>46,5%</w:t>
+            </w:r>
+          </w:p>
+        </w:tc>
+        <w:tc>
+          <w:tcPr>
+            <w:tcW w:type="dxa" w:w="1077"/>
+            <w:shd w:val="clear" w:color="auto" w:fill="F2F5F9"/>
+          </w:tcPr>
+          <w:p>
+            <w:r/>
+            <w:r>
+              <w:rPr>
+                <w:sz w:val="15"/>
+              </w:rPr>
+              <w:t>46,5%</w:t>
+            </w:r>
+          </w:p>
+        </w:tc>
+      </w:tr>
+      <w:tr>
+        <w:tc>
+          <w:tcPr>
+            <w:tcW w:type="dxa" w:w="3742"/>
+          </w:tcPr>
+          <w:p>
+            <w:r/>
+            <w:r>
+              <w:rPr>
+                <w:sz w:val="15"/>
+              </w:rPr>
+              <w:t>5% anual, independiente del mercado; reempleo en ~2 años</w:t>
+            </w:r>
+          </w:p>
+        </w:tc>
+        <w:tc>
+          <w:tcPr>
+            <w:tcW w:type="dxa" w:w="1134"/>
+          </w:tcPr>
+          <w:p>
+            <w:r/>
+            <w:r>
+              <w:rPr>
+                <w:sz w:val="15"/>
+              </w:rPr>
+              <w:t>Histórico</w:t>
+            </w:r>
+          </w:p>
+        </w:tc>
+        <w:tc>
+          <w:tcPr>
+            <w:tcW w:type="dxa" w:w="1020"/>
+          </w:tcPr>
+          <w:p>
+            <w:r/>
+            <w:r>
+              <w:rPr>
+                <w:sz w:val="15"/>
+              </w:rPr>
+              <w:t>100,0%</w:t>
+            </w:r>
+          </w:p>
+        </w:tc>
+        <w:tc>
+          <w:tcPr>
+            <w:tcW w:type="dxa" w:w="1077"/>
+          </w:tcPr>
+          <w:p>
+            <w:r/>
+            <w:r>
+              <w:rPr>
+                <w:sz w:val="15"/>
+              </w:rPr>
+              <w:t>97,4%</w:t>
+            </w:r>
+          </w:p>
+        </w:tc>
+        <w:tc>
+          <w:tcPr>
+            <w:tcW w:type="dxa" w:w="1020"/>
+          </w:tcPr>
+          <w:p>
+            <w:r/>
+            <w:r>
+              <w:rPr>
+                <w:sz w:val="15"/>
+              </w:rPr>
+              <w:t>94,8%</w:t>
+            </w:r>
+          </w:p>
+        </w:tc>
+        <w:tc>
+          <w:tcPr>
+            <w:tcW w:type="dxa" w:w="1077"/>
+          </w:tcPr>
+          <w:p>
+            <w:r/>
+            <w:r>
+              <w:rPr>
+                <w:sz w:val="15"/>
+              </w:rPr>
+              <w:t>94,8%</w:t>
+            </w:r>
+          </w:p>
+        </w:tc>
+      </w:tr>
+      <w:tr>
+        <w:tc>
+          <w:tcPr>
+            <w:tcW w:type="dxa" w:w="3742"/>
+            <w:shd w:val="clear" w:color="auto" w:fill="F2F5F9"/>
+          </w:tcPr>
+          <w:p>
+            <w:r/>
+            <w:r>
+              <w:rPr>
+                <w:sz w:val="15"/>
+              </w:rPr>
+              <w:t>5% anual, independiente del mercado; reempleo en ~2 años</w:t>
+            </w:r>
+          </w:p>
+        </w:tc>
+        <w:tc>
+          <w:tcPr>
+            <w:tcW w:type="dxa" w:w="1134"/>
+            <w:shd w:val="clear" w:color="auto" w:fill="F2F5F9"/>
+          </w:tcPr>
+          <w:p>
+            <w:r/>
+            <w:r>
+              <w:rPr>
+                <w:sz w:val="15"/>
+              </w:rPr>
+              <w:t>Prospectivo</w:t>
+            </w:r>
+          </w:p>
+        </w:tc>
+        <w:tc>
+          <w:tcPr>
+            <w:tcW w:type="dxa" w:w="1020"/>
+            <w:shd w:val="clear" w:color="auto" w:fill="F2F5F9"/>
+          </w:tcPr>
+          <w:p>
+            <w:r/>
+            <w:r>
+              <w:rPr>
+                <w:sz w:val="15"/>
+              </w:rPr>
+              <w:t>100,0%</w:t>
+            </w:r>
+          </w:p>
+        </w:tc>
+        <w:tc>
+          <w:tcPr>
+            <w:tcW w:type="dxa" w:w="1077"/>
+            <w:shd w:val="clear" w:color="auto" w:fill="F2F5F9"/>
+          </w:tcPr>
+          <w:p>
+            <w:r/>
+            <w:r>
+              <w:rPr>
+                <w:sz w:val="15"/>
+              </w:rPr>
+              <w:t>66,8%</w:t>
+            </w:r>
+          </w:p>
+        </w:tc>
+        <w:tc>
+          <w:tcPr>
+            <w:tcW w:type="dxa" w:w="1020"/>
+            <w:shd w:val="clear" w:color="auto" w:fill="F2F5F9"/>
+          </w:tcPr>
+          <w:p>
+            <w:r/>
+            <w:r>
+              <w:rPr>
+                <w:sz w:val="15"/>
+              </w:rPr>
+              <w:t>42,4%</w:t>
+            </w:r>
+          </w:p>
+        </w:tc>
+        <w:tc>
+          <w:tcPr>
+            <w:tcW w:type="dxa" w:w="1077"/>
+            <w:shd w:val="clear" w:color="auto" w:fill="F2F5F9"/>
+          </w:tcPr>
+          <w:p>
+            <w:r/>
+            <w:r>
+              <w:rPr>
+                <w:sz w:val="15"/>
+              </w:rPr>
+              <w:t>42,4%</w:t>
+            </w:r>
+          </w:p>
+        </w:tc>
+      </w:tr>
+      <w:tr>
+        <w:tc>
+          <w:tcPr>
+            <w:tcW w:type="dxa" w:w="3742"/>
+          </w:tcPr>
+          <w:p>
+            <w:r/>
+            <w:r>
+              <w:rPr>
+                <w:sz w:val="15"/>
+              </w:rPr>
+              <w:t>5% normal y 25% si la cartera cayó &gt;10% en 12 meses; reempleo ~2 años</w:t>
+            </w:r>
+          </w:p>
+        </w:tc>
+        <w:tc>
+          <w:tcPr>
+            <w:tcW w:type="dxa" w:w="1134"/>
+          </w:tcPr>
+          <w:p>
+            <w:r/>
+            <w:r>
+              <w:rPr>
+                <w:sz w:val="15"/>
+              </w:rPr>
+              <w:t>Histórico</w:t>
+            </w:r>
+          </w:p>
+        </w:tc>
+        <w:tc>
+          <w:tcPr>
+            <w:tcW w:type="dxa" w:w="1020"/>
+          </w:tcPr>
+          <w:p>
+            <w:r/>
+            <w:r>
+              <w:rPr>
+                <w:sz w:val="15"/>
+              </w:rPr>
+              <w:t>100,0%</w:t>
+            </w:r>
+          </w:p>
+        </w:tc>
+        <w:tc>
+          <w:tcPr>
+            <w:tcW w:type="dxa" w:w="1077"/>
+          </w:tcPr>
+          <w:p>
+            <w:r/>
+            <w:r>
+              <w:rPr>
+                <w:sz w:val="15"/>
+              </w:rPr>
+              <w:t>97,1%</w:t>
+            </w:r>
+          </w:p>
+        </w:tc>
+        <w:tc>
+          <w:tcPr>
+            <w:tcW w:type="dxa" w:w="1020"/>
+          </w:tcPr>
+          <w:p>
+            <w:r/>
+            <w:r>
+              <w:rPr>
+                <w:sz w:val="15"/>
+              </w:rPr>
+              <w:t>94,4%</w:t>
+            </w:r>
+          </w:p>
+        </w:tc>
+        <w:tc>
+          <w:tcPr>
+            <w:tcW w:type="dxa" w:w="1077"/>
+          </w:tcPr>
+          <w:p>
+            <w:r/>
+            <w:r>
+              <w:rPr>
+                <w:sz w:val="15"/>
+              </w:rPr>
+              <w:t>94,4%</w:t>
+            </w:r>
+          </w:p>
+        </w:tc>
+      </w:tr>
+      <w:tr>
+        <w:tc>
+          <w:tcPr>
+            <w:tcW w:type="dxa" w:w="3742"/>
+            <w:shd w:val="clear" w:color="auto" w:fill="F2F5F9"/>
+          </w:tcPr>
+          <w:p>
+            <w:r/>
+            <w:r>
+              <w:rPr>
+                <w:sz w:val="15"/>
+              </w:rPr>
+              <w:t>5% normal y 25% si la cartera cayó &gt;10% en 12 meses; reempleo ~2 años</w:t>
+            </w:r>
+          </w:p>
+        </w:tc>
+        <w:tc>
+          <w:tcPr>
+            <w:tcW w:type="dxa" w:w="1134"/>
+            <w:shd w:val="clear" w:color="auto" w:fill="F2F5F9"/>
+          </w:tcPr>
+          <w:p>
+            <w:r/>
+            <w:r>
+              <w:rPr>
+                <w:sz w:val="15"/>
+              </w:rPr>
+              <w:t>Prospectivo</w:t>
+            </w:r>
+          </w:p>
+        </w:tc>
+        <w:tc>
+          <w:tcPr>
+            <w:tcW w:type="dxa" w:w="1020"/>
+            <w:shd w:val="clear" w:color="auto" w:fill="F2F5F9"/>
+          </w:tcPr>
+          <w:p>
+            <w:r/>
+            <w:r>
+              <w:rPr>
+                <w:sz w:val="15"/>
+              </w:rPr>
+              <w:t>100,0%</w:t>
+            </w:r>
+          </w:p>
+        </w:tc>
+        <w:tc>
+          <w:tcPr>
+            <w:tcW w:type="dxa" w:w="1077"/>
+            <w:shd w:val="clear" w:color="auto" w:fill="F2F5F9"/>
+          </w:tcPr>
+          <w:p>
+            <w:r/>
+            <w:r>
+              <w:rPr>
+                <w:sz w:val="15"/>
+              </w:rPr>
+              <w:t>65,4%</w:t>
+            </w:r>
+          </w:p>
+        </w:tc>
+        <w:tc>
+          <w:tcPr>
+            <w:tcW w:type="dxa" w:w="1020"/>
+            <w:shd w:val="clear" w:color="auto" w:fill="F2F5F9"/>
+          </w:tcPr>
+          <w:p>
+            <w:r/>
+            <w:r>
+              <w:rPr>
+                <w:sz w:val="15"/>
+              </w:rPr>
+              <w:t>41,4%</w:t>
+            </w:r>
+          </w:p>
+        </w:tc>
+        <w:tc>
+          <w:tcPr>
+            <w:tcW w:type="dxa" w:w="1077"/>
+            <w:shd w:val="clear" w:color="auto" w:fill="F2F5F9"/>
+          </w:tcPr>
+          <w:p>
+            <w:r/>
+            <w:r>
+              <w:rPr>
+                <w:sz w:val="15"/>
+              </w:rPr>
+              <w:t>41,4%</w:t>
+            </w:r>
+          </w:p>
+        </w:tc>
+      </w:tr>
+      <w:tr>
+        <w:tc>
+          <w:tcPr>
+            <w:tcW w:type="dxa" w:w="3742"/>
+          </w:tcPr>
+          <w:p>
+            <w:r/>
+            <w:r>
+              <w:rPr>
+                <w:sz w:val="15"/>
+              </w:rPr>
+              <w:t>10% normal y 40% si la cartera cayó &gt;10%; reempleo ~2 años</w:t>
+            </w:r>
+          </w:p>
+        </w:tc>
+        <w:tc>
+          <w:tcPr>
+            <w:tcW w:type="dxa" w:w="1134"/>
+          </w:tcPr>
+          <w:p>
+            <w:r/>
+            <w:r>
+              <w:rPr>
+                <w:sz w:val="15"/>
+              </w:rPr>
+              <w:t>Histórico</w:t>
+            </w:r>
+          </w:p>
+        </w:tc>
+        <w:tc>
+          <w:tcPr>
+            <w:tcW w:type="dxa" w:w="1020"/>
+          </w:tcPr>
+          <w:p>
+            <w:r/>
+            <w:r>
+              <w:rPr>
+                <w:sz w:val="15"/>
+              </w:rPr>
+              <w:t>100,0%</w:t>
+            </w:r>
+          </w:p>
+        </w:tc>
+        <w:tc>
+          <w:tcPr>
+            <w:tcW w:type="dxa" w:w="1077"/>
+          </w:tcPr>
+          <w:p>
+            <w:r/>
+            <w:r>
+              <w:rPr>
+                <w:sz w:val="15"/>
+              </w:rPr>
+              <w:t>96,4%</w:t>
+            </w:r>
+          </w:p>
+        </w:tc>
+        <w:tc>
+          <w:tcPr>
+            <w:tcW w:type="dxa" w:w="1020"/>
+          </w:tcPr>
+          <w:p>
+            <w:r/>
+            <w:r>
+              <w:rPr>
+                <w:sz w:val="15"/>
+              </w:rPr>
+              <w:t>93,0%</w:t>
+            </w:r>
+          </w:p>
+        </w:tc>
+        <w:tc>
+          <w:tcPr>
+            <w:tcW w:type="dxa" w:w="1077"/>
+          </w:tcPr>
+          <w:p>
+            <w:r/>
+            <w:r>
+              <w:rPr>
+                <w:sz w:val="15"/>
+              </w:rPr>
+              <w:t>93,0%</w:t>
+            </w:r>
+          </w:p>
+        </w:tc>
+      </w:tr>
+      <w:tr>
+        <w:tc>
+          <w:tcPr>
+            <w:tcW w:type="dxa" w:w="3742"/>
+            <w:shd w:val="clear" w:color="auto" w:fill="F2F5F9"/>
+          </w:tcPr>
+          <w:p>
+            <w:r/>
+            <w:r>
+              <w:rPr>
+                <w:sz w:val="15"/>
+              </w:rPr>
+              <w:t>10% normal y 40% si la cartera cayó &gt;10%; reempleo ~2 años</w:t>
+            </w:r>
+          </w:p>
+        </w:tc>
+        <w:tc>
+          <w:tcPr>
+            <w:tcW w:type="dxa" w:w="1134"/>
+            <w:shd w:val="clear" w:color="auto" w:fill="F2F5F9"/>
+          </w:tcPr>
+          <w:p>
+            <w:r/>
+            <w:r>
+              <w:rPr>
+                <w:sz w:val="15"/>
+              </w:rPr>
+              <w:t>Prospectivo</w:t>
+            </w:r>
+          </w:p>
+        </w:tc>
+        <w:tc>
+          <w:tcPr>
+            <w:tcW w:type="dxa" w:w="1020"/>
+            <w:shd w:val="clear" w:color="auto" w:fill="F2F5F9"/>
+          </w:tcPr>
+          <w:p>
+            <w:r/>
+            <w:r>
+              <w:rPr>
+                <w:sz w:val="15"/>
+              </w:rPr>
+              <w:t>100,0%</w:t>
+            </w:r>
+          </w:p>
+        </w:tc>
+        <w:tc>
+          <w:tcPr>
+            <w:tcW w:type="dxa" w:w="1077"/>
+            <w:shd w:val="clear" w:color="auto" w:fill="F2F5F9"/>
+          </w:tcPr>
+          <w:p>
+            <w:r/>
+            <w:r>
+              <w:rPr>
+                <w:sz w:val="15"/>
+              </w:rPr>
+              <w:t>61,1%</w:t>
+            </w:r>
+          </w:p>
+        </w:tc>
+        <w:tc>
+          <w:tcPr>
+            <w:tcW w:type="dxa" w:w="1020"/>
+            <w:shd w:val="clear" w:color="auto" w:fill="F2F5F9"/>
+          </w:tcPr>
+          <w:p>
+            <w:r/>
+            <w:r>
+              <w:rPr>
+                <w:sz w:val="15"/>
+              </w:rPr>
+              <w:t>37,7%</w:t>
+            </w:r>
+          </w:p>
+        </w:tc>
+        <w:tc>
+          <w:tcPr>
+            <w:tcW w:type="dxa" w:w="1077"/>
+            <w:shd w:val="clear" w:color="auto" w:fill="F2F5F9"/>
+          </w:tcPr>
+          <w:p>
+            <w:r/>
+            <w:r>
+              <w:rPr>
+                <w:sz w:val="15"/>
+              </w:rPr>
+              <w:t>37,7%</w:t>
+            </w:r>
+          </w:p>
+        </w:tc>
+      </w:tr>
+      <w:tr>
+        <w:tc>
+          <w:tcPr>
+            <w:tcW w:type="dxa" w:w="3742"/>
+          </w:tcPr>
+          <w:p>
+            <w:r/>
+            <w:r>
+              <w:rPr>
+                <w:sz w:val="15"/>
+              </w:rPr>
+              <w:t>Estrés: 6% anual y pérdida PERMANENTE (sin reempleo)</w:t>
+            </w:r>
+          </w:p>
+        </w:tc>
+        <w:tc>
+          <w:tcPr>
+            <w:tcW w:type="dxa" w:w="1134"/>
+          </w:tcPr>
+          <w:p>
+            <w:r/>
+            <w:r>
+              <w:rPr>
+                <w:sz w:val="15"/>
+              </w:rPr>
+              <w:t>Histórico</w:t>
+            </w:r>
+          </w:p>
+        </w:tc>
+        <w:tc>
+          <w:tcPr>
+            <w:tcW w:type="dxa" w:w="1020"/>
+          </w:tcPr>
+          <w:p>
+            <w:r/>
+            <w:r>
+              <w:rPr>
+                <w:sz w:val="15"/>
+              </w:rPr>
+              <w:t>100,0%</w:t>
+            </w:r>
+          </w:p>
+        </w:tc>
+        <w:tc>
+          <w:tcPr>
+            <w:tcW w:type="dxa" w:w="1077"/>
+          </w:tcPr>
+          <w:p>
+            <w:r/>
+            <w:r>
+              <w:rPr>
+                <w:sz w:val="15"/>
+              </w:rPr>
+              <w:t>91,2%</w:t>
+            </w:r>
+          </w:p>
+        </w:tc>
+        <w:tc>
+          <w:tcPr>
+            <w:tcW w:type="dxa" w:w="1020"/>
+          </w:tcPr>
+          <w:p>
+            <w:r/>
+            <w:r>
+              <w:rPr>
+                <w:sz w:val="15"/>
+              </w:rPr>
+              <w:t>86,6%</w:t>
+            </w:r>
+          </w:p>
+        </w:tc>
+        <w:tc>
+          <w:tcPr>
+            <w:tcW w:type="dxa" w:w="1077"/>
+          </w:tcPr>
+          <w:p>
+            <w:r/>
+            <w:r>
+              <w:rPr>
+                <w:sz w:val="15"/>
+              </w:rPr>
+              <w:t>86,6%</w:t>
+            </w:r>
+          </w:p>
+        </w:tc>
+      </w:tr>
+      <w:tr>
+        <w:tc>
+          <w:tcPr>
+            <w:tcW w:type="dxa" w:w="3742"/>
+            <w:shd w:val="clear" w:color="auto" w:fill="F2F5F9"/>
+          </w:tcPr>
+          <w:p>
+            <w:r/>
+            <w:r>
+              <w:rPr>
+                <w:sz w:val="15"/>
+              </w:rPr>
+              <w:t>Estrés: 6% anual y pérdida PERMANENTE (sin reempleo)</w:t>
+            </w:r>
+          </w:p>
+        </w:tc>
+        <w:tc>
+          <w:tcPr>
+            <w:tcW w:type="dxa" w:w="1134"/>
+            <w:shd w:val="clear" w:color="auto" w:fill="F2F5F9"/>
+          </w:tcPr>
+          <w:p>
+            <w:r/>
+            <w:r>
+              <w:rPr>
+                <w:sz w:val="15"/>
+              </w:rPr>
+              <w:t>Prospectivo</w:t>
+            </w:r>
+          </w:p>
+        </w:tc>
+        <w:tc>
+          <w:tcPr>
+            <w:tcW w:type="dxa" w:w="1020"/>
+            <w:shd w:val="clear" w:color="auto" w:fill="F2F5F9"/>
+          </w:tcPr>
+          <w:p>
+            <w:r/>
+            <w:r>
+              <w:rPr>
+                <w:sz w:val="15"/>
+              </w:rPr>
+              <w:t>99,6%</w:t>
+            </w:r>
+          </w:p>
+        </w:tc>
+        <w:tc>
+          <w:tcPr>
+            <w:tcW w:type="dxa" w:w="1077"/>
+            <w:shd w:val="clear" w:color="auto" w:fill="F2F5F9"/>
+          </w:tcPr>
+          <w:p>
+            <w:r/>
+            <w:r>
+              <w:rPr>
+                <w:sz w:val="15"/>
+              </w:rPr>
+              <w:t>50,0%</w:t>
+            </w:r>
+          </w:p>
+        </w:tc>
+        <w:tc>
+          <w:tcPr>
+            <w:tcW w:type="dxa" w:w="1020"/>
+            <w:shd w:val="clear" w:color="auto" w:fill="F2F5F9"/>
+          </w:tcPr>
+          <w:p>
+            <w:r/>
+            <w:r>
+              <w:rPr>
+                <w:sz w:val="15"/>
+              </w:rPr>
+              <w:t>30,2%</w:t>
+            </w:r>
+          </w:p>
+        </w:tc>
+        <w:tc>
+          <w:tcPr>
+            <w:tcW w:type="dxa" w:w="1077"/>
+            <w:shd w:val="clear" w:color="auto" w:fill="F2F5F9"/>
+          </w:tcPr>
+          <w:p>
+            <w:r/>
+            <w:r>
+              <w:rPr>
+                <w:sz w:val="15"/>
+              </w:rPr>
+              <w:t>30,2%</w:t>
+            </w:r>
+          </w:p>
+        </w:tc>
+      </w:tr>
+    </w:tbl>
+    <w:p>
+      <w:r>
+        <w:rPr>
+          <w:i/>
+          <w:sz w:val="16"/>
+        </w:rPr>
+        <w:t>El empleo de Tomás (software) se comporta como una acción tecnológica: la probabilidad de perderlo sube cuando la cartera cae. Mientras está desempleado no aporta; se reemplea con 50% anual (~2 años en promedio). El escenario de estrés supone pérdida permanente.</w:t>
+      </w:r>
+    </w:p>
+    <w:p>
+      <w:r>
+        <w:rPr>
+          <w:i w:val="0"/>
+        </w:rPr>
+        <w:t>Lectura: Educación resiste incluso la pérdida permanente del empleo (99,6% en el escenario prospectivo). El riesgo de capital humano recae sobre Villarrica y la herencia: con desempleo correlacionado con el mercado, la probabilidad conjunta histórica baja de 96,0% a 93,0%. Mitigantes: fondo de emergencia fuera del mandato, seguro de vida e invalidez, y el límite a tecnología en la cartera para no duplicar la exposición del ingreso de Tomás.</w:t>
+      </w:r>
+    </w:p>
     <w:p>
       <w:pPr>
         <w:pStyle w:val="Heading2"/>
@@ -7383,7 +8536,7 @@
         <w:drawing>
           <wp:inline xmlns:a="http://schemas.openxmlformats.org/drawingml/2006/main" xmlns:pic="http://schemas.openxmlformats.org/drawingml/2006/picture">
             <wp:extent cx="5760000" cy="2400000"/>
-            <wp:docPr id="6" name="Picture 6"/>
+            <wp:docPr id="8" name="Picture 8"/>
             <wp:cNvGraphicFramePr>
               <a:graphicFrameLocks noChangeAspect="1"/>
             </wp:cNvGraphicFramePr>
@@ -7395,7 +8548,7 @@
                     <pic:cNvPicPr/>
                   </pic:nvPicPr>
                   <pic:blipFill>
-                    <a:blip r:embed="rId14"/>
+                    <a:blip r:embed="rId16"/>
                     <a:stretch>
                       <a:fillRect/>
                     </a:stretch>
@@ -7423,7 +8576,7 @@
           <w:i/>
           <w:sz w:val="16"/>
         </w:rPr>
-        <w:t>Figura 6. Robustez: Sharpe 2013-2026 de cada variante de parámetros (un cambio a la vez). Fuente: codigo/validacion.py.</w:t>
+        <w:t>Figura 8. Robustez: Sharpe 2013-2026 de cada variante de parámetros (un cambio a la vez). Fuente: codigo/validacion.py.</w:t>
       </w:r>
     </w:p>
     <w:p>

</xml_diff>

<commit_message>
Informe: forward USD/CLP, benchmark por clase de activo y revisión del rebalanceo
- codigo/analisis_adicional.py (nuevo): benchmark por clase de activo 2013-2026 y
  2016-2026 con atribución, resultado en vivo por clase desde el 14-sep (exports de
  StockTrak del 6-oct), forward USD/CLP del 28-sep (escenarios, simulación en CLP y
  USD, liquidez, razón de cobertura), bandas de rebalanceo, regla de commodities,
  activos adicionales (AGG, EFA) y control de calendario del backtest (--desfase).
- informe.py: forward en 2.6, 2.8, 3.4, 5, 6 y Anexo B; benchmark por clase en 3.5;
  evidencia de bandas en 2.8; activos adicionales en 3.3; tabla en vivo por clase en 5.
- Informe_Final_Nexum.docx regenerado; LEEME actualizado.

Co-Authored-By: Claude Opus 5.5 <noreply@anthropic.com>
Claude-Session: https://claude.ai/code/session_01T5hAYzxrHpdpyuLVyANGG6
</commit_message>
<xml_diff>
--- a/nexum_proyecto_final/informe/Informe_Final_Nexum.docx
+++ b/nexum_proyecto_final/informe/Informe_Final_Nexum.docx
@@ -193,6 +193,20 @@
         <w:rPr>
           <w:b/>
         </w:rPr>
+        <w:t xml:space="preserve">Riesgo cambiario. </w:t>
+      </w:r>
+      <w:r>
+        <w:t>El 28-sep-2026 se contrató un forward de venta de USD 104.000 a un año (~70% de la cartera), cerca de la cobertura que minimiza el riesgo medido en pesos: en la simulación, la volatilidad anual en pesos baja de 13,9% a 10,3%.</w:t>
+      </w:r>
+    </w:p>
+    <w:p>
+      <w:pPr>
+        <w:pStyle w:val="ListBullet"/>
+      </w:pPr>
+      <w:r>
+        <w:rPr>
+          <w:b/>
+        </w:rPr>
         <w:t xml:space="preserve">Recomendación. </w:t>
       </w:r>
       <w:r>
@@ -1899,7 +1913,7 @@
         <w:t xml:space="preserve">Éticas e idoneidad (CFA, Estándar III.C): </w:t>
       </w:r>
       <w:r>
-        <w:t>sin derivados complejos, criptoactivos, apalancamiento ni ventas cortas, por el nivel de conocimiento declarado.</w:t>
+        <w:t>sin derivados complejos, criptoactivos, apalancamiento ni ventas cortas, por el nivel de conocimiento declarado. Única excepción: forwards de venta de USD contra CLP con un banco regulado, solo como cobertura cambiaria (monto menor al valor de la cartera y plazo de hasta un año), explicados a los clientes y aceptados por ellos (sección 3.4).</w:t>
       </w:r>
     </w:p>
     <w:p>
@@ -3279,8 +3293,48 @@
           </w:p>
         </w:tc>
       </w:tr>
+      <w:tr>
+        <w:tc>
+          <w:tcPr>
+            <w:tcW w:type="dxa" w:w="2041"/>
+            <w:shd w:val="clear" w:color="auto" w:fill="F2F5F9"/>
+          </w:tcPr>
+          <w:p>
+            <w:r/>
+            <w:r>
+              <w:rPr>
+                <w:sz w:val="17"/>
+              </w:rPr>
+              <w:t>Cobertura cambiaria</w:t>
+            </w:r>
+          </w:p>
+        </w:tc>
+        <w:tc>
+          <w:tcPr>
+            <w:tcW w:type="dxa" w:w="7030"/>
+            <w:shd w:val="clear" w:color="auto" w:fill="F2F5F9"/>
+          </w:tcPr>
+          <w:p>
+            <w:r/>
+            <w:r>
+              <w:rPr>
+                <w:sz w:val="17"/>
+              </w:rPr>
+              <w:t>Forward de venta de USD a un año por ~70% de la cartera (sección 3.4); al vencimiento se evalúa renovarlo con la razón de cobertura vigente</w:t>
+            </w:r>
+          </w:p>
+        </w:tc>
+      </w:tr>
     </w:tbl>
     <w:p/>
+    <w:p>
+      <w:r>
+        <w:rPr>
+          <w:i w:val="0"/>
+        </w:rPr>
+        <w:t>Las bandas no son restrictivas. En el backtest 2013-2026, las bandas vigentes (±5 / ±2) se activan 0,8 veces al año (~17 órdenes) y mantienen la cartera a 0,5% de tracking error de los pesos aprobados. Bandas de ±3 / ±1 duplicarían los rebalanceos (2,1 al año) sin mejorar el resultado, y el rebalanceo mensual exigiría ~81 órdenes al año. No rebalancear nunca deja la cartera con 2,0% de desvío y más volatilidad (11,0% vs 9,9%). Las operaciones que exige StockTrak provienen de la rotación dentro de los sleeves activos, no de las bandas.</w:t>
+      </w:r>
+    </w:p>
     <w:p>
       <w:pPr>
         <w:pStyle w:val="Heading2"/>
@@ -4246,11 +4300,684 @@
       </w:r>
     </w:p>
     <w:p>
+      <w:r>
+        <w:rPr>
+          <w:i w:val="0"/>
+        </w:rPr>
+        <w:t>Activos adicionales evaluados (octubre de 2026). Agregar un activo cambia la asignación estratégica, por lo que exige recalibrar Black-Litterman y modificar este IPS; no es una decisión de rebalanceo. Se evaluaron los dos candidatos con datos suficientes:</w:t>
+      </w:r>
+    </w:p>
+    <w:tbl>
+      <w:tblPr>
+        <w:tblStyle w:val="TableGrid"/>
+        <w:tblW w:type="auto" w:w="0"/>
+        <w:jc w:val="center"/>
+        <w:tblLook w:firstColumn="1" w:firstRow="1" w:lastColumn="0" w:lastRow="0" w:noHBand="0" w:noVBand="1" w:val="04A0"/>
+      </w:tblPr>
+      <w:tblGrid>
+        <w:gridCol w:w="1204"/>
+        <w:gridCol w:w="1204"/>
+        <w:gridCol w:w="1204"/>
+        <w:gridCol w:w="1204"/>
+        <w:gridCol w:w="1204"/>
+        <w:gridCol w:w="1204"/>
+        <w:gridCol w:w="1204"/>
+        <w:gridCol w:w="1204"/>
+      </w:tblGrid>
+      <w:tr>
+        <w:tc>
+          <w:tcPr>
+            <w:tcW w:type="dxa" w:w="2948"/>
+            <w:shd w:val="clear" w:color="auto" w:fill="1F3A5F"/>
+          </w:tcPr>
+          <w:p>
+            <w:r/>
+            <w:r>
+              <w:rPr>
+                <w:b/>
+                <w:color w:val="FFFFFF"/>
+                <w:sz w:val="15"/>
+              </w:rPr>
+              <w:t>Variante</w:t>
+            </w:r>
+          </w:p>
+        </w:tc>
+        <w:tc>
+          <w:tcPr>
+            <w:tcW w:type="dxa" w:w="907"/>
+            <w:shd w:val="clear" w:color="auto" w:fill="1F3A5F"/>
+          </w:tcPr>
+          <w:p>
+            <w:r/>
+            <w:r>
+              <w:rPr>
+                <w:b/>
+                <w:color w:val="FFFFFF"/>
+                <w:sz w:val="15"/>
+              </w:rPr>
+              <w:t>Retorno anual</w:t>
+            </w:r>
+          </w:p>
+        </w:tc>
+        <w:tc>
+          <w:tcPr>
+            <w:tcW w:type="dxa" w:w="907"/>
+            <w:shd w:val="clear" w:color="auto" w:fill="1F3A5F"/>
+          </w:tcPr>
+          <w:p>
+            <w:r/>
+            <w:r>
+              <w:rPr>
+                <w:b/>
+                <w:color w:val="FFFFFF"/>
+                <w:sz w:val="15"/>
+              </w:rPr>
+              <w:t>Volatilidad</w:t>
+            </w:r>
+          </w:p>
+        </w:tc>
+        <w:tc>
+          <w:tcPr>
+            <w:tcW w:type="dxa" w:w="680"/>
+            <w:shd w:val="clear" w:color="auto" w:fill="1F3A5F"/>
+          </w:tcPr>
+          <w:p>
+            <w:r/>
+            <w:r>
+              <w:rPr>
+                <w:b/>
+                <w:color w:val="FFFFFF"/>
+                <w:sz w:val="15"/>
+              </w:rPr>
+              <w:t>Sharpe</w:t>
+            </w:r>
+          </w:p>
+        </w:tc>
+        <w:tc>
+          <w:tcPr>
+            <w:tcW w:type="dxa" w:w="907"/>
+            <w:shd w:val="clear" w:color="auto" w:fill="1F3A5F"/>
+          </w:tcPr>
+          <w:p>
+            <w:r/>
+            <w:r>
+              <w:rPr>
+                <w:b/>
+                <w:color w:val="FFFFFF"/>
+                <w:sz w:val="15"/>
+              </w:rPr>
+              <w:t>Máx. caída</w:t>
+            </w:r>
+          </w:p>
+        </w:tc>
+        <w:tc>
+          <w:tcPr>
+            <w:tcW w:type="dxa" w:w="680"/>
+            <w:shd w:val="clear" w:color="auto" w:fill="1F3A5F"/>
+          </w:tcPr>
+          <w:p>
+            <w:r/>
+            <w:r>
+              <w:rPr>
+                <w:b/>
+                <w:color w:val="FFFFFF"/>
+                <w:sz w:val="15"/>
+              </w:rPr>
+              <w:t>TE</w:t>
+            </w:r>
+          </w:p>
+        </w:tc>
+        <w:tc>
+          <w:tcPr>
+            <w:tcW w:type="dxa" w:w="1020"/>
+            <w:shd w:val="clear" w:color="auto" w:fill="1F3A5F"/>
+          </w:tcPr>
+          <w:p>
+            <w:r/>
+            <w:r>
+              <w:rPr>
+                <w:b/>
+                <w:color w:val="FFFFFF"/>
+                <w:sz w:val="15"/>
+              </w:rPr>
+              <w:t>P(3) histórico</w:t>
+            </w:r>
+          </w:p>
+        </w:tc>
+        <w:tc>
+          <w:tcPr>
+            <w:tcW w:type="dxa" w:w="1020"/>
+            <w:shd w:val="clear" w:color="auto" w:fill="1F3A5F"/>
+          </w:tcPr>
+          <w:p>
+            <w:r/>
+            <w:r>
+              <w:rPr>
+                <w:b/>
+                <w:color w:val="FFFFFF"/>
+                <w:sz w:val="15"/>
+              </w:rPr>
+              <w:t>P(3) prospectivo</w:t>
+            </w:r>
+          </w:p>
+        </w:tc>
+      </w:tr>
+      <w:tr>
+        <w:tc>
+          <w:tcPr>
+            <w:tcW w:type="dxa" w:w="2948"/>
+          </w:tcPr>
+          <w:p>
+            <w:r/>
+            <w:r>
+              <w:rPr>
+                <w:sz w:val="15"/>
+              </w:rPr>
+              <w:t>Vigente</w:t>
+            </w:r>
+          </w:p>
+        </w:tc>
+        <w:tc>
+          <w:tcPr>
+            <w:tcW w:type="dxa" w:w="907"/>
+          </w:tcPr>
+          <w:p>
+            <w:r/>
+            <w:r>
+              <w:rPr>
+                <w:sz w:val="15"/>
+              </w:rPr>
+              <w:t>10,0%</w:t>
+            </w:r>
+          </w:p>
+        </w:tc>
+        <w:tc>
+          <w:tcPr>
+            <w:tcW w:type="dxa" w:w="907"/>
+          </w:tcPr>
+          <w:p>
+            <w:r/>
+            <w:r>
+              <w:rPr>
+                <w:sz w:val="15"/>
+              </w:rPr>
+              <w:t>9,9%</w:t>
+            </w:r>
+          </w:p>
+        </w:tc>
+        <w:tc>
+          <w:tcPr>
+            <w:tcW w:type="dxa" w:w="680"/>
+          </w:tcPr>
+          <w:p>
+            <w:r/>
+            <w:r>
+              <w:rPr>
+                <w:sz w:val="15"/>
+              </w:rPr>
+              <w:t>0,85</w:t>
+            </w:r>
+          </w:p>
+        </w:tc>
+        <w:tc>
+          <w:tcPr>
+            <w:tcW w:type="dxa" w:w="907"/>
+          </w:tcPr>
+          <w:p>
+            <w:r/>
+            <w:r>
+              <w:rPr>
+                <w:sz w:val="15"/>
+              </w:rPr>
+              <w:t>-20,5%</w:t>
+            </w:r>
+          </w:p>
+        </w:tc>
+        <w:tc>
+          <w:tcPr>
+            <w:tcW w:type="dxa" w:w="680"/>
+          </w:tcPr>
+          <w:p>
+            <w:r/>
+            <w:r>
+              <w:rPr>
+                <w:sz w:val="15"/>
+              </w:rPr>
+              <w:t>1,9%</w:t>
+            </w:r>
+          </w:p>
+        </w:tc>
+        <w:tc>
+          <w:tcPr>
+            <w:tcW w:type="dxa" w:w="1020"/>
+          </w:tcPr>
+          <w:p>
+            <w:r/>
+            <w:r>
+              <w:rPr>
+                <w:sz w:val="15"/>
+              </w:rPr>
+              <w:t>96,0%</w:t>
+            </w:r>
+          </w:p>
+        </w:tc>
+        <w:tc>
+          <w:tcPr>
+            <w:tcW w:type="dxa" w:w="1020"/>
+          </w:tcPr>
+          <w:p>
+            <w:r/>
+            <w:r>
+              <w:rPr>
+                <w:sz w:val="15"/>
+              </w:rPr>
+              <w:t>46,5%</w:t>
+            </w:r>
+          </w:p>
+        </w:tc>
+      </w:tr>
+      <w:tr>
+        <w:tc>
+          <w:tcPr>
+            <w:tcW w:type="dxa" w:w="2948"/>
+            <w:shd w:val="clear" w:color="auto" w:fill="F2F5F9"/>
+          </w:tcPr>
+          <w:p>
+            <w:r/>
+            <w:r>
+              <w:rPr>
+                <w:sz w:val="15"/>
+              </w:rPr>
+              <w:t>Duración intermedia: 50% de la renta fija en AGG</w:t>
+            </w:r>
+          </w:p>
+        </w:tc>
+        <w:tc>
+          <w:tcPr>
+            <w:tcW w:type="dxa" w:w="907"/>
+            <w:shd w:val="clear" w:color="auto" w:fill="F2F5F9"/>
+          </w:tcPr>
+          <w:p>
+            <w:r/>
+            <w:r>
+              <w:rPr>
+                <w:sz w:val="15"/>
+              </w:rPr>
+              <w:t>10,0%</w:t>
+            </w:r>
+          </w:p>
+        </w:tc>
+        <w:tc>
+          <w:tcPr>
+            <w:tcW w:type="dxa" w:w="907"/>
+            <w:shd w:val="clear" w:color="auto" w:fill="F2F5F9"/>
+          </w:tcPr>
+          <w:p>
+            <w:r/>
+            <w:r>
+              <w:rPr>
+                <w:sz w:val="15"/>
+              </w:rPr>
+              <w:t>9,4%</w:t>
+            </w:r>
+          </w:p>
+        </w:tc>
+        <w:tc>
+          <w:tcPr>
+            <w:tcW w:type="dxa" w:w="680"/>
+            <w:shd w:val="clear" w:color="auto" w:fill="F2F5F9"/>
+          </w:tcPr>
+          <w:p>
+            <w:r/>
+            <w:r>
+              <w:rPr>
+                <w:sz w:val="15"/>
+              </w:rPr>
+              <w:t>0,89</w:t>
+            </w:r>
+          </w:p>
+        </w:tc>
+        <w:tc>
+          <w:tcPr>
+            <w:tcW w:type="dxa" w:w="907"/>
+            <w:shd w:val="clear" w:color="auto" w:fill="F2F5F9"/>
+          </w:tcPr>
+          <w:p>
+            <w:r/>
+            <w:r>
+              <w:rPr>
+                <w:sz w:val="15"/>
+              </w:rPr>
+              <w:t>-18,4%</w:t>
+            </w:r>
+          </w:p>
+        </w:tc>
+        <w:tc>
+          <w:tcPr>
+            <w:tcW w:type="dxa" w:w="680"/>
+            <w:shd w:val="clear" w:color="auto" w:fill="F2F5F9"/>
+          </w:tcPr>
+          <w:p>
+            <w:r/>
+            <w:r>
+              <w:rPr>
+                <w:sz w:val="15"/>
+              </w:rPr>
+              <w:t>2,2%</w:t>
+            </w:r>
+          </w:p>
+        </w:tc>
+        <w:tc>
+          <w:tcPr>
+            <w:tcW w:type="dxa" w:w="1020"/>
+            <w:shd w:val="clear" w:color="auto" w:fill="F2F5F9"/>
+          </w:tcPr>
+          <w:p>
+            <w:r/>
+            <w:r>
+              <w:rPr>
+                <w:sz w:val="15"/>
+              </w:rPr>
+              <w:t>96,8%</w:t>
+            </w:r>
+          </w:p>
+        </w:tc>
+        <w:tc>
+          <w:tcPr>
+            <w:tcW w:type="dxa" w:w="1020"/>
+            <w:shd w:val="clear" w:color="auto" w:fill="F2F5F9"/>
+          </w:tcPr>
+          <w:p>
+            <w:r/>
+            <w:r>
+              <w:rPr>
+                <w:sz w:val="15"/>
+              </w:rPr>
+              <w:t>44,1%</w:t>
+            </w:r>
+          </w:p>
+        </w:tc>
+      </w:tr>
+      <w:tr>
+        <w:tc>
+          <w:tcPr>
+            <w:tcW w:type="dxa" w:w="2948"/>
+          </w:tcPr>
+          <w:p>
+            <w:r/>
+            <w:r>
+              <w:rPr>
+                <w:sz w:val="15"/>
+              </w:rPr>
+              <w:t>Internacional: 5 pp del S&amp;P 500 a EFA</w:t>
+            </w:r>
+          </w:p>
+        </w:tc>
+        <w:tc>
+          <w:tcPr>
+            <w:tcW w:type="dxa" w:w="907"/>
+          </w:tcPr>
+          <w:p>
+            <w:r/>
+            <w:r>
+              <w:rPr>
+                <w:sz w:val="15"/>
+              </w:rPr>
+              <w:t>9,6%</w:t>
+            </w:r>
+          </w:p>
+        </w:tc>
+        <w:tc>
+          <w:tcPr>
+            <w:tcW w:type="dxa" w:w="907"/>
+          </w:tcPr>
+          <w:p>
+            <w:r/>
+            <w:r>
+              <w:rPr>
+                <w:sz w:val="15"/>
+              </w:rPr>
+              <w:t>9,9%</w:t>
+            </w:r>
+          </w:p>
+        </w:tc>
+        <w:tc>
+          <w:tcPr>
+            <w:tcW w:type="dxa" w:w="680"/>
+          </w:tcPr>
+          <w:p>
+            <w:r/>
+            <w:r>
+              <w:rPr>
+                <w:sz w:val="15"/>
+              </w:rPr>
+              <w:t>0,82</w:t>
+            </w:r>
+          </w:p>
+        </w:tc>
+        <w:tc>
+          <w:tcPr>
+            <w:tcW w:type="dxa" w:w="907"/>
+          </w:tcPr>
+          <w:p>
+            <w:r/>
+            <w:r>
+              <w:rPr>
+                <w:sz w:val="15"/>
+              </w:rPr>
+              <w:t>-20,7%</w:t>
+            </w:r>
+          </w:p>
+        </w:tc>
+        <w:tc>
+          <w:tcPr>
+            <w:tcW w:type="dxa" w:w="680"/>
+          </w:tcPr>
+          <w:p>
+            <w:r/>
+            <w:r>
+              <w:rPr>
+                <w:sz w:val="15"/>
+              </w:rPr>
+              <w:t>2,0%</w:t>
+            </w:r>
+          </w:p>
+        </w:tc>
+        <w:tc>
+          <w:tcPr>
+            <w:tcW w:type="dxa" w:w="1020"/>
+          </w:tcPr>
+          <w:p>
+            <w:r/>
+            <w:r>
+              <w:rPr>
+                <w:sz w:val="15"/>
+              </w:rPr>
+              <w:t>94,2%</w:t>
+            </w:r>
+          </w:p>
+        </w:tc>
+        <w:tc>
+          <w:tcPr>
+            <w:tcW w:type="dxa" w:w="1020"/>
+          </w:tcPr>
+          <w:p>
+            <w:r/>
+            <w:r>
+              <w:rPr>
+                <w:sz w:val="15"/>
+              </w:rPr>
+              <w:t>47,2%</w:t>
+            </w:r>
+          </w:p>
+        </w:tc>
+      </w:tr>
+      <w:tr>
+        <w:tc>
+          <w:tcPr>
+            <w:tcW w:type="dxa" w:w="2948"/>
+            <w:shd w:val="clear" w:color="auto" w:fill="F2F5F9"/>
+          </w:tcPr>
+          <w:p>
+            <w:r/>
+            <w:r>
+              <w:rPr>
+                <w:sz w:val="15"/>
+              </w:rPr>
+              <w:t>Ambos cambios</w:t>
+            </w:r>
+          </w:p>
+        </w:tc>
+        <w:tc>
+          <w:tcPr>
+            <w:tcW w:type="dxa" w:w="907"/>
+            <w:shd w:val="clear" w:color="auto" w:fill="F2F5F9"/>
+          </w:tcPr>
+          <w:p>
+            <w:r/>
+            <w:r>
+              <w:rPr>
+                <w:sz w:val="15"/>
+              </w:rPr>
+              <w:t>9,7%</w:t>
+            </w:r>
+          </w:p>
+        </w:tc>
+        <w:tc>
+          <w:tcPr>
+            <w:tcW w:type="dxa" w:w="907"/>
+            <w:shd w:val="clear" w:color="auto" w:fill="F2F5F9"/>
+          </w:tcPr>
+          <w:p>
+            <w:r/>
+            <w:r>
+              <w:rPr>
+                <w:sz w:val="15"/>
+              </w:rPr>
+              <w:t>9,4%</w:t>
+            </w:r>
+          </w:p>
+        </w:tc>
+        <w:tc>
+          <w:tcPr>
+            <w:tcW w:type="dxa" w:w="680"/>
+            <w:shd w:val="clear" w:color="auto" w:fill="F2F5F9"/>
+          </w:tcPr>
+          <w:p>
+            <w:r/>
+            <w:r>
+              <w:rPr>
+                <w:sz w:val="15"/>
+              </w:rPr>
+              <w:t>0,87</w:t>
+            </w:r>
+          </w:p>
+        </w:tc>
+        <w:tc>
+          <w:tcPr>
+            <w:tcW w:type="dxa" w:w="907"/>
+            <w:shd w:val="clear" w:color="auto" w:fill="F2F5F9"/>
+          </w:tcPr>
+          <w:p>
+            <w:r/>
+            <w:r>
+              <w:rPr>
+                <w:sz w:val="15"/>
+              </w:rPr>
+              <w:t>-18,6%</w:t>
+            </w:r>
+          </w:p>
+        </w:tc>
+        <w:tc>
+          <w:tcPr>
+            <w:tcW w:type="dxa" w:w="680"/>
+            <w:shd w:val="clear" w:color="auto" w:fill="F2F5F9"/>
+          </w:tcPr>
+          <w:p>
+            <w:r/>
+            <w:r>
+              <w:rPr>
+                <w:sz w:val="15"/>
+              </w:rPr>
+              <w:t>2,2%</w:t>
+            </w:r>
+          </w:p>
+        </w:tc>
+        <w:tc>
+          <w:tcPr>
+            <w:tcW w:type="dxa" w:w="1020"/>
+            <w:shd w:val="clear" w:color="auto" w:fill="F2F5F9"/>
+          </w:tcPr>
+          <w:p>
+            <w:r/>
+            <w:r>
+              <w:rPr>
+                <w:sz w:val="15"/>
+              </w:rPr>
+              <w:t>95,3%</w:t>
+            </w:r>
+          </w:p>
+        </w:tc>
+        <w:tc>
+          <w:tcPr>
+            <w:tcW w:type="dxa" w:w="1020"/>
+            <w:shd w:val="clear" w:color="auto" w:fill="F2F5F9"/>
+          </w:tcPr>
+          <w:p>
+            <w:r/>
+            <w:r>
+              <w:rPr>
+                <w:sz w:val="15"/>
+              </w:rPr>
+              <w:t>44,8%</w:t>
+            </w:r>
+          </w:p>
+        </w:tc>
+      </w:tr>
+    </w:tbl>
+    <w:p>
+      <w:r>
+        <w:rPr>
+          <w:i/>
+          <w:sz w:val="16"/>
+        </w:rPr>
+        <w:t>Backtest 2013-2026 en USD. Prospectivo: supuesto propio de 2,4% real para AGG (menor duración que TLH, 2,6%) y 5,5% para EFA. Fuente: codigo/analisis_adicional.py.</w:t>
+      </w:r>
+    </w:p>
+    <w:p>
+      <w:pPr>
+        <w:pStyle w:val="ListBullet"/>
+      </w:pPr>
+      <w:r>
+        <w:rPr>
+          <w:b/>
+        </w:rPr>
+        <w:t xml:space="preserve">Bonos de duración intermedia (AGG, proxy de VCIT o SCHP): </w:t>
+      </w:r>
+      <w:r>
+        <w:t>bajan la volatilidad (9,9% → 9,4%) y la caída máxima, pero con supuestos prudentes la probabilidad conjunta cae de 46,5% a 44,1%, porque el plan necesita la prima por plazo. TLH además diversifica mejor que AGG frente al S&amp;P 500. Se mantiene la renta fija larga y se reevalúa en la revisión anual.</w:t>
+      </w:r>
+    </w:p>
+    <w:p>
+      <w:pPr>
+        <w:pStyle w:val="ListBullet"/>
+      </w:pPr>
+      <w:r>
+        <w:rPr>
+          <w:b/>
+        </w:rPr>
+        <w:t xml:space="preserve">Acciones internacionales (EFA): </w:t>
+      </w:r>
+      <w:r>
+        <w:t>correlación de 0,82 con el S&amp;P 500; en el backtest empeoran el resultado (94,2% vs 96,0%) y hacia adelante suman menos de un punto (47,2%). No justifican un cambio de política.</w:t>
+      </w:r>
+    </w:p>
+    <w:p>
       <w:pPr>
         <w:pStyle w:val="Heading2"/>
       </w:pPr>
       <w:r>
-        <w:t>3.4 Moneda funcional: USD, con simulaciones en UF</w:t>
+        <w:t>3.4 Moneda funcional: USD, con simulaciones en UF y cobertura con forward</w:t>
       </w:r>
     </w:p>
     <w:p>
@@ -4258,7 +4985,7 @@
         <w:rPr>
           <w:i w:val="0"/>
         </w:rPr>
-        <w:t>La moneda funcional es el USD porque todo el universo de inversión cotiza en dólares y cubrir el tipo de cambio exigiría derivados que el perfil excluye. Las necesidades del cliente (UF/CLP) se evalúan explícitamente: el Montecarlo se presenta también en UF.</w:t>
+        <w:t>La moneda funcional es el USD porque todo el universo de inversión cotiza en dólares. Las necesidades del cliente (UF/CLP) se evalúan explícitamente: el Montecarlo se presenta también en UF y, desde el 28-sep-2026, parte del riesgo cambiario de corto plazo se cubre con un forward (ver más abajo).</w:t>
       </w:r>
     </w:p>
     <w:p>
@@ -4305,6 +5032,1042 @@
     </w:p>
     <w:p>
       <w:pPr>
+        <w:pStyle w:val="Heading3"/>
+      </w:pPr>
+      <w:r>
+        <w:t>Cobertura cambiaria con forward USD/CLP</w:t>
+      </w:r>
+    </w:p>
+    <w:p>
+      <w:r>
+        <w:rPr>
+          <w:i w:val="0"/>
+        </w:rPr>
+        <w:t>El 28 de septiembre de 2026 Nexum contrató un forward con BDCH: vende USD 104.000 a CLP 963,08 por dólar, con vencimiento el 30 de septiembre de 2027. El precio es el spot de CLP 967,32 menos 4,24 puntos forward. Los puntos negativos reflejan que la tasa en pesos es menor que la tasa en dólares (paridad cubierta de tasas): cubrirse cuesta 0,44% del monto, unos USD 456 si el dólar no se mueve. El contrato no se opera en StockTrak; se registra y valoriza aparte.</w:t>
+      </w:r>
+    </w:p>
+    <w:tbl>
+      <w:tblPr>
+        <w:tblStyle w:val="TableGrid"/>
+        <w:tblW w:type="auto" w:w="0"/>
+        <w:jc w:val="center"/>
+        <w:tblLook w:firstColumn="1" w:firstRow="1" w:lastColumn="0" w:lastRow="0" w:noHBand="0" w:noVBand="1" w:val="04A0"/>
+      </w:tblPr>
+      <w:tblGrid>
+        <w:gridCol w:w="2408"/>
+        <w:gridCol w:w="2408"/>
+        <w:gridCol w:w="2408"/>
+        <w:gridCol w:w="2408"/>
+      </w:tblGrid>
+      <w:tr>
+        <w:tc>
+          <w:tcPr>
+            <w:tcW w:type="dxa" w:w="2268"/>
+            <w:shd w:val="clear" w:color="auto" w:fill="1F3A5F"/>
+          </w:tcPr>
+          <w:p>
+            <w:r/>
+            <w:r>
+              <w:rPr>
+                <w:b/>
+                <w:color w:val="FFFFFF"/>
+                <w:sz w:val="17"/>
+              </w:rPr>
+              <w:t>Dólar al vencimiento (CLP)</w:t>
+            </w:r>
+          </w:p>
+        </w:tc>
+        <w:tc>
+          <w:tcPr>
+            <w:tcW w:type="dxa" w:w="2268"/>
+            <w:shd w:val="clear" w:color="auto" w:fill="1F3A5F"/>
+          </w:tcPr>
+          <w:p>
+            <w:r/>
+            <w:r>
+              <w:rPr>
+                <w:b/>
+                <w:color w:val="FFFFFF"/>
+                <w:sz w:val="17"/>
+              </w:rPr>
+              <w:t>Compensación (MM CLP)</w:t>
+            </w:r>
+          </w:p>
+        </w:tc>
+        <w:tc>
+          <w:tcPr>
+            <w:tcW w:type="dxa" w:w="2268"/>
+            <w:shd w:val="clear" w:color="auto" w:fill="1F3A5F"/>
+          </w:tcPr>
+          <w:p>
+            <w:r/>
+            <w:r>
+              <w:rPr>
+                <w:b/>
+                <w:color w:val="FFFFFF"/>
+                <w:sz w:val="17"/>
+              </w:rPr>
+              <w:t>Compensación (USD)</w:t>
+            </w:r>
+          </w:p>
+        </w:tc>
+        <w:tc>
+          <w:tcPr>
+            <w:tcW w:type="dxa" w:w="2268"/>
+            <w:shd w:val="clear" w:color="auto" w:fill="1F3A5F"/>
+          </w:tcPr>
+          <w:p>
+            <w:r/>
+            <w:r>
+              <w:rPr>
+                <w:b/>
+                <w:color w:val="FFFFFF"/>
+                <w:sz w:val="17"/>
+              </w:rPr>
+              <w:t>Para Nexum</w:t>
+            </w:r>
+          </w:p>
+        </w:tc>
+      </w:tr>
+      <w:tr>
+        <w:tc>
+          <w:tcPr>
+            <w:tcW w:type="dxa" w:w="2268"/>
+          </w:tcPr>
+          <w:p>
+            <w:r/>
+            <w:r>
+              <w:rPr>
+                <w:sz w:val="17"/>
+              </w:rPr>
+              <w:t>850,00</w:t>
+            </w:r>
+          </w:p>
+        </w:tc>
+        <w:tc>
+          <w:tcPr>
+            <w:tcW w:type="dxa" w:w="2268"/>
+          </w:tcPr>
+          <w:p>
+            <w:r/>
+            <w:r>
+              <w:rPr>
+                <w:sz w:val="17"/>
+              </w:rPr>
+              <w:t>11,76</w:t>
+            </w:r>
+          </w:p>
+        </w:tc>
+        <w:tc>
+          <w:tcPr>
+            <w:tcW w:type="dxa" w:w="2268"/>
+          </w:tcPr>
+          <w:p>
+            <w:r/>
+            <w:r>
+              <w:rPr>
+                <w:sz w:val="17"/>
+              </w:rPr>
+              <w:t>13.836</w:t>
+            </w:r>
+          </w:p>
+        </w:tc>
+        <w:tc>
+          <w:tcPr>
+            <w:tcW w:type="dxa" w:w="2268"/>
+          </w:tcPr>
+          <w:p>
+            <w:r/>
+            <w:r>
+              <w:rPr>
+                <w:sz w:val="17"/>
+              </w:rPr>
+              <w:t>Nexum recibe</w:t>
+            </w:r>
+          </w:p>
+        </w:tc>
+      </w:tr>
+      <w:tr>
+        <w:tc>
+          <w:tcPr>
+            <w:tcW w:type="dxa" w:w="2268"/>
+            <w:shd w:val="clear" w:color="auto" w:fill="F2F5F9"/>
+          </w:tcPr>
+          <w:p>
+            <w:r/>
+            <w:r>
+              <w:rPr>
+                <w:sz w:val="17"/>
+              </w:rPr>
+              <w:t>900,00</w:t>
+            </w:r>
+          </w:p>
+        </w:tc>
+        <w:tc>
+          <w:tcPr>
+            <w:tcW w:type="dxa" w:w="2268"/>
+            <w:shd w:val="clear" w:color="auto" w:fill="F2F5F9"/>
+          </w:tcPr>
+          <w:p>
+            <w:r/>
+            <w:r>
+              <w:rPr>
+                <w:sz w:val="17"/>
+              </w:rPr>
+              <w:t>6,56</w:t>
+            </w:r>
+          </w:p>
+        </w:tc>
+        <w:tc>
+          <w:tcPr>
+            <w:tcW w:type="dxa" w:w="2268"/>
+            <w:shd w:val="clear" w:color="auto" w:fill="F2F5F9"/>
+          </w:tcPr>
+          <w:p>
+            <w:r/>
+            <w:r>
+              <w:rPr>
+                <w:sz w:val="17"/>
+              </w:rPr>
+              <w:t>7.289</w:t>
+            </w:r>
+          </w:p>
+        </w:tc>
+        <w:tc>
+          <w:tcPr>
+            <w:tcW w:type="dxa" w:w="2268"/>
+            <w:shd w:val="clear" w:color="auto" w:fill="F2F5F9"/>
+          </w:tcPr>
+          <w:p>
+            <w:r/>
+            <w:r>
+              <w:rPr>
+                <w:sz w:val="17"/>
+              </w:rPr>
+              <w:t>Nexum recibe</w:t>
+            </w:r>
+          </w:p>
+        </w:tc>
+      </w:tr>
+      <w:tr>
+        <w:tc>
+          <w:tcPr>
+            <w:tcW w:type="dxa" w:w="2268"/>
+          </w:tcPr>
+          <w:p>
+            <w:r/>
+            <w:r>
+              <w:rPr>
+                <w:sz w:val="17"/>
+              </w:rPr>
+              <w:t>950,00</w:t>
+            </w:r>
+          </w:p>
+        </w:tc>
+        <w:tc>
+          <w:tcPr>
+            <w:tcW w:type="dxa" w:w="2268"/>
+          </w:tcPr>
+          <w:p>
+            <w:r/>
+            <w:r>
+              <w:rPr>
+                <w:sz w:val="17"/>
+              </w:rPr>
+              <w:t>1,36</w:t>
+            </w:r>
+          </w:p>
+        </w:tc>
+        <w:tc>
+          <w:tcPr>
+            <w:tcW w:type="dxa" w:w="2268"/>
+          </w:tcPr>
+          <w:p>
+            <w:r/>
+            <w:r>
+              <w:rPr>
+                <w:sz w:val="17"/>
+              </w:rPr>
+              <w:t>1.432</w:t>
+            </w:r>
+          </w:p>
+        </w:tc>
+        <w:tc>
+          <w:tcPr>
+            <w:tcW w:type="dxa" w:w="2268"/>
+          </w:tcPr>
+          <w:p>
+            <w:r/>
+            <w:r>
+              <w:rPr>
+                <w:sz w:val="17"/>
+              </w:rPr>
+              <w:t>Nexum recibe</w:t>
+            </w:r>
+          </w:p>
+        </w:tc>
+      </w:tr>
+      <w:tr>
+        <w:tc>
+          <w:tcPr>
+            <w:tcW w:type="dxa" w:w="2268"/>
+            <w:shd w:val="clear" w:color="auto" w:fill="F2F5F9"/>
+          </w:tcPr>
+          <w:p>
+            <w:r/>
+            <w:r>
+              <w:rPr>
+                <w:sz w:val="17"/>
+              </w:rPr>
+              <w:t>963,08</w:t>
+            </w:r>
+          </w:p>
+        </w:tc>
+        <w:tc>
+          <w:tcPr>
+            <w:tcW w:type="dxa" w:w="2268"/>
+            <w:shd w:val="clear" w:color="auto" w:fill="F2F5F9"/>
+          </w:tcPr>
+          <w:p>
+            <w:r/>
+            <w:r>
+              <w:rPr>
+                <w:sz w:val="17"/>
+              </w:rPr>
+              <w:t>0,00</w:t>
+            </w:r>
+          </w:p>
+        </w:tc>
+        <w:tc>
+          <w:tcPr>
+            <w:tcW w:type="dxa" w:w="2268"/>
+            <w:shd w:val="clear" w:color="auto" w:fill="F2F5F9"/>
+          </w:tcPr>
+          <w:p>
+            <w:r/>
+            <w:r>
+              <w:rPr>
+                <w:sz w:val="17"/>
+              </w:rPr>
+              <w:t>0</w:t>
+            </w:r>
+          </w:p>
+        </w:tc>
+        <w:tc>
+          <w:tcPr>
+            <w:tcW w:type="dxa" w:w="2268"/>
+            <w:shd w:val="clear" w:color="auto" w:fill="F2F5F9"/>
+          </w:tcPr>
+          <w:p>
+            <w:r/>
+            <w:r>
+              <w:rPr>
+                <w:sz w:val="17"/>
+              </w:rPr>
+              <w:t>—</w:t>
+            </w:r>
+          </w:p>
+        </w:tc>
+      </w:tr>
+      <w:tr>
+        <w:tc>
+          <w:tcPr>
+            <w:tcW w:type="dxa" w:w="2268"/>
+          </w:tcPr>
+          <w:p>
+            <w:r/>
+            <w:r>
+              <w:rPr>
+                <w:sz w:val="17"/>
+              </w:rPr>
+              <w:t>1.000,00</w:t>
+            </w:r>
+          </w:p>
+        </w:tc>
+        <w:tc>
+          <w:tcPr>
+            <w:tcW w:type="dxa" w:w="2268"/>
+          </w:tcPr>
+          <w:p>
+            <w:r/>
+            <w:r>
+              <w:rPr>
+                <w:sz w:val="17"/>
+              </w:rPr>
+              <w:t>-3,84</w:t>
+            </w:r>
+          </w:p>
+        </w:tc>
+        <w:tc>
+          <w:tcPr>
+            <w:tcW w:type="dxa" w:w="2268"/>
+          </w:tcPr>
+          <w:p>
+            <w:r/>
+            <w:r>
+              <w:rPr>
+                <w:sz w:val="17"/>
+              </w:rPr>
+              <w:t>-3.840</w:t>
+            </w:r>
+          </w:p>
+        </w:tc>
+        <w:tc>
+          <w:tcPr>
+            <w:tcW w:type="dxa" w:w="2268"/>
+          </w:tcPr>
+          <w:p>
+            <w:r/>
+            <w:r>
+              <w:rPr>
+                <w:sz w:val="17"/>
+              </w:rPr>
+              <w:t>Nexum paga</w:t>
+            </w:r>
+          </w:p>
+        </w:tc>
+      </w:tr>
+      <w:tr>
+        <w:tc>
+          <w:tcPr>
+            <w:tcW w:type="dxa" w:w="2268"/>
+            <w:shd w:val="clear" w:color="auto" w:fill="F2F5F9"/>
+          </w:tcPr>
+          <w:p>
+            <w:r/>
+            <w:r>
+              <w:rPr>
+                <w:sz w:val="17"/>
+              </w:rPr>
+              <w:t>1.050,00</w:t>
+            </w:r>
+          </w:p>
+        </w:tc>
+        <w:tc>
+          <w:tcPr>
+            <w:tcW w:type="dxa" w:w="2268"/>
+            <w:shd w:val="clear" w:color="auto" w:fill="F2F5F9"/>
+          </w:tcPr>
+          <w:p>
+            <w:r/>
+            <w:r>
+              <w:rPr>
+                <w:sz w:val="17"/>
+              </w:rPr>
+              <w:t>-9,04</w:t>
+            </w:r>
+          </w:p>
+        </w:tc>
+        <w:tc>
+          <w:tcPr>
+            <w:tcW w:type="dxa" w:w="2268"/>
+            <w:shd w:val="clear" w:color="auto" w:fill="F2F5F9"/>
+          </w:tcPr>
+          <w:p>
+            <w:r/>
+            <w:r>
+              <w:rPr>
+                <w:sz w:val="17"/>
+              </w:rPr>
+              <w:t>-8.609</w:t>
+            </w:r>
+          </w:p>
+        </w:tc>
+        <w:tc>
+          <w:tcPr>
+            <w:tcW w:type="dxa" w:w="2268"/>
+            <w:shd w:val="clear" w:color="auto" w:fill="F2F5F9"/>
+          </w:tcPr>
+          <w:p>
+            <w:r/>
+            <w:r>
+              <w:rPr>
+                <w:sz w:val="17"/>
+              </w:rPr>
+              <w:t>Nexum paga</w:t>
+            </w:r>
+          </w:p>
+        </w:tc>
+      </w:tr>
+      <w:tr>
+        <w:tc>
+          <w:tcPr>
+            <w:tcW w:type="dxa" w:w="2268"/>
+          </w:tcPr>
+          <w:p>
+            <w:r/>
+            <w:r>
+              <w:rPr>
+                <w:sz w:val="17"/>
+              </w:rPr>
+              <w:t>1.100,00</w:t>
+            </w:r>
+          </w:p>
+        </w:tc>
+        <w:tc>
+          <w:tcPr>
+            <w:tcW w:type="dxa" w:w="2268"/>
+          </w:tcPr>
+          <w:p>
+            <w:r/>
+            <w:r>
+              <w:rPr>
+                <w:sz w:val="17"/>
+              </w:rPr>
+              <w:t>-14,24</w:t>
+            </w:r>
+          </w:p>
+        </w:tc>
+        <w:tc>
+          <w:tcPr>
+            <w:tcW w:type="dxa" w:w="2268"/>
+          </w:tcPr>
+          <w:p>
+            <w:r/>
+            <w:r>
+              <w:rPr>
+                <w:sz w:val="17"/>
+              </w:rPr>
+              <w:t>-12.945</w:t>
+            </w:r>
+          </w:p>
+        </w:tc>
+        <w:tc>
+          <w:tcPr>
+            <w:tcW w:type="dxa" w:w="2268"/>
+          </w:tcPr>
+          <w:p>
+            <w:r/>
+            <w:r>
+              <w:rPr>
+                <w:sz w:val="17"/>
+              </w:rPr>
+              <w:t>Nexum paga</w:t>
+            </w:r>
+          </w:p>
+        </w:tc>
+      </w:tr>
+    </w:tbl>
+    <w:p>
+      <w:r>
+        <w:rPr>
+          <w:i/>
+          <w:sz w:val="16"/>
+        </w:rPr>
+        <w:t>Compensación = USD 104.000 × (precio forward − dólar al vencimiento). Si el dólar sube, Nexum paga la diferencia, pero la cartera en USD vale más en pesos; si baja, Nexum recibe la diferencia y compensa la pérdida de valor en pesos.</w:t>
+      </w:r>
+    </w:p>
+    <w:p>
+      <w:r>
+        <w:rPr>
+          <w:i w:val="0"/>
+        </w:rPr>
+        <w:t>Por qué ese monto. USD 104.000 cubren 69% del mandato (70% del valor de la cartera ese día). Como el peso se deprecia cuando caen los mercados (cobertura natural, correlación -0,39), cubrir el 100% no minimiza el riesgo en pesos: en la simulación, la volatilidad en pesos es mínima con una cobertura de ~75%, muy cerca del 70% contratado.</w:t>
+      </w:r>
+    </w:p>
+    <w:tbl>
+      <w:tblPr>
+        <w:tblStyle w:val="TableGrid"/>
+        <w:tblW w:type="auto" w:w="0"/>
+        <w:jc w:val="center"/>
+        <w:tblLook w:firstColumn="1" w:firstRow="1" w:lastColumn="0" w:lastRow="0" w:noHBand="0" w:noVBand="1" w:val="04A0"/>
+      </w:tblPr>
+      <w:tblGrid>
+        <w:gridCol w:w="1605"/>
+        <w:gridCol w:w="1605"/>
+        <w:gridCol w:w="1605"/>
+        <w:gridCol w:w="1605"/>
+        <w:gridCol w:w="1605"/>
+        <w:gridCol w:w="1605"/>
+      </w:tblGrid>
+      <w:tr>
+        <w:tc>
+          <w:tcPr>
+            <w:tcW w:type="dxa" w:w="2381"/>
+            <w:shd w:val="clear" w:color="auto" w:fill="1F3A5F"/>
+          </w:tcPr>
+          <w:p>
+            <w:r/>
+            <w:r>
+              <w:rPr>
+                <w:b/>
+                <w:color w:val="FFFFFF"/>
+                <w:sz w:val="17"/>
+              </w:rPr>
+              <w:t>Medido en</w:t>
+            </w:r>
+          </w:p>
+        </w:tc>
+        <w:tc>
+          <w:tcPr>
+            <w:tcW w:type="dxa" w:w="1587"/>
+            <w:shd w:val="clear" w:color="auto" w:fill="1F3A5F"/>
+          </w:tcPr>
+          <w:p>
+            <w:r/>
+            <w:r>
+              <w:rPr>
+                <w:b/>
+                <w:color w:val="FFFFFF"/>
+                <w:sz w:val="17"/>
+              </w:rPr>
+              <w:t>Cartera</w:t>
+            </w:r>
+          </w:p>
+        </w:tc>
+        <w:tc>
+          <w:tcPr>
+            <w:tcW w:type="dxa" w:w="1474"/>
+            <w:shd w:val="clear" w:color="auto" w:fill="1F3A5F"/>
+          </w:tcPr>
+          <w:p>
+            <w:r/>
+            <w:r>
+              <w:rPr>
+                <w:b/>
+                <w:color w:val="FFFFFF"/>
+                <w:sz w:val="17"/>
+              </w:rPr>
+              <w:t>Retorno medio 12 meses</w:t>
+            </w:r>
+          </w:p>
+        </w:tc>
+        <w:tc>
+          <w:tcPr>
+            <w:tcW w:type="dxa" w:w="1247"/>
+            <w:shd w:val="clear" w:color="auto" w:fill="1F3A5F"/>
+          </w:tcPr>
+          <w:p>
+            <w:r/>
+            <w:r>
+              <w:rPr>
+                <w:b/>
+                <w:color w:val="FFFFFF"/>
+                <w:sz w:val="17"/>
+              </w:rPr>
+              <w:t>Volatilidad</w:t>
+            </w:r>
+          </w:p>
+        </w:tc>
+        <w:tc>
+          <w:tcPr>
+            <w:tcW w:type="dxa" w:w="1134"/>
+            <w:shd w:val="clear" w:color="auto" w:fill="1F3A5F"/>
+          </w:tcPr>
+          <w:p>
+            <w:r/>
+            <w:r>
+              <w:rPr>
+                <w:b/>
+                <w:color w:val="FFFFFF"/>
+                <w:sz w:val="17"/>
+              </w:rPr>
+              <w:t>Peor 5%</w:t>
+            </w:r>
+          </w:p>
+        </w:tc>
+        <w:tc>
+          <w:tcPr>
+            <w:tcW w:type="dxa" w:w="1361"/>
+            <w:shd w:val="clear" w:color="auto" w:fill="1F3A5F"/>
+          </w:tcPr>
+          <w:p>
+            <w:r/>
+            <w:r>
+              <w:rPr>
+                <w:b/>
+                <w:color w:val="FFFFFF"/>
+                <w:sz w:val="17"/>
+              </w:rPr>
+              <w:t>P(pérdida &gt; 10%)</w:t>
+            </w:r>
+          </w:p>
+        </w:tc>
+      </w:tr>
+      <w:tr>
+        <w:tc>
+          <w:tcPr>
+            <w:tcW w:type="dxa" w:w="2381"/>
+          </w:tcPr>
+          <w:p>
+            <w:r/>
+            <w:r>
+              <w:rPr>
+                <w:sz w:val="17"/>
+              </w:rPr>
+              <w:t>CLP (moneda de las metas)</w:t>
+            </w:r>
+          </w:p>
+        </w:tc>
+        <w:tc>
+          <w:tcPr>
+            <w:tcW w:type="dxa" w:w="1587"/>
+          </w:tcPr>
+          <w:p>
+            <w:r/>
+            <w:r>
+              <w:rPr>
+                <w:sz w:val="17"/>
+              </w:rPr>
+              <w:t>Sin cobertura</w:t>
+            </w:r>
+          </w:p>
+        </w:tc>
+        <w:tc>
+          <w:tcPr>
+            <w:tcW w:type="dxa" w:w="1474"/>
+          </w:tcPr>
+          <w:p>
+            <w:r/>
+            <w:r>
+              <w:rPr>
+                <w:sz w:val="17"/>
+              </w:rPr>
+              <w:t>10,9%</w:t>
+            </w:r>
+          </w:p>
+        </w:tc>
+        <w:tc>
+          <w:tcPr>
+            <w:tcW w:type="dxa" w:w="1247"/>
+          </w:tcPr>
+          <w:p>
+            <w:r/>
+            <w:r>
+              <w:rPr>
+                <w:sz w:val="17"/>
+              </w:rPr>
+              <w:t>13,9%</w:t>
+            </w:r>
+          </w:p>
+        </w:tc>
+        <w:tc>
+          <w:tcPr>
+            <w:tcW w:type="dxa" w:w="1134"/>
+          </w:tcPr>
+          <w:p>
+            <w:r/>
+            <w:r>
+              <w:rPr>
+                <w:sz w:val="17"/>
+              </w:rPr>
+              <w:t>-10,6%</w:t>
+            </w:r>
+          </w:p>
+        </w:tc>
+        <w:tc>
+          <w:tcPr>
+            <w:tcW w:type="dxa" w:w="1361"/>
+          </w:tcPr>
+          <w:p>
+            <w:r/>
+            <w:r>
+              <w:rPr>
+                <w:sz w:val="17"/>
+              </w:rPr>
+              <w:t>5,6%</w:t>
+            </w:r>
+          </w:p>
+        </w:tc>
+      </w:tr>
+      <w:tr>
+        <w:tc>
+          <w:tcPr>
+            <w:tcW w:type="dxa" w:w="2381"/>
+            <w:shd w:val="clear" w:color="auto" w:fill="F2F5F9"/>
+          </w:tcPr>
+          <w:p>
+            <w:r/>
+            <w:r>
+              <w:rPr>
+                <w:sz w:val="17"/>
+              </w:rPr>
+              <w:t>CLP (moneda de las metas)</w:t>
+            </w:r>
+          </w:p>
+        </w:tc>
+        <w:tc>
+          <w:tcPr>
+            <w:tcW w:type="dxa" w:w="1587"/>
+            <w:shd w:val="clear" w:color="auto" w:fill="F2F5F9"/>
+          </w:tcPr>
+          <w:p>
+            <w:r/>
+            <w:r>
+              <w:rPr>
+                <w:sz w:val="17"/>
+              </w:rPr>
+              <w:t>Con el forward</w:t>
+            </w:r>
+          </w:p>
+        </w:tc>
+        <w:tc>
+          <w:tcPr>
+            <w:tcW w:type="dxa" w:w="1474"/>
+            <w:shd w:val="clear" w:color="auto" w:fill="F2F5F9"/>
+          </w:tcPr>
+          <w:p>
+            <w:r/>
+            <w:r>
+              <w:rPr>
+                <w:sz w:val="17"/>
+              </w:rPr>
+              <w:t>10,0%</w:t>
+            </w:r>
+          </w:p>
+        </w:tc>
+        <w:tc>
+          <w:tcPr>
+            <w:tcW w:type="dxa" w:w="1247"/>
+            <w:shd w:val="clear" w:color="auto" w:fill="F2F5F9"/>
+          </w:tcPr>
+          <w:p>
+            <w:r/>
+            <w:r>
+              <w:rPr>
+                <w:sz w:val="17"/>
+              </w:rPr>
+              <w:t>10,3%</w:t>
+            </w:r>
+          </w:p>
+        </w:tc>
+        <w:tc>
+          <w:tcPr>
+            <w:tcW w:type="dxa" w:w="1134"/>
+            <w:shd w:val="clear" w:color="auto" w:fill="F2F5F9"/>
+          </w:tcPr>
+          <w:p>
+            <w:r/>
+            <w:r>
+              <w:rPr>
+                <w:sz w:val="17"/>
+              </w:rPr>
+              <w:t>-6,4%</w:t>
+            </w:r>
+          </w:p>
+        </w:tc>
+        <w:tc>
+          <w:tcPr>
+            <w:tcW w:type="dxa" w:w="1361"/>
+            <w:shd w:val="clear" w:color="auto" w:fill="F2F5F9"/>
+          </w:tcPr>
+          <w:p>
+            <w:r/>
+            <w:r>
+              <w:rPr>
+                <w:sz w:val="17"/>
+              </w:rPr>
+              <w:t>2,1%</w:t>
+            </w:r>
+          </w:p>
+        </w:tc>
+      </w:tr>
+      <w:tr>
+        <w:tc>
+          <w:tcPr>
+            <w:tcW w:type="dxa" w:w="2381"/>
+          </w:tcPr>
+          <w:p>
+            <w:r/>
+            <w:r>
+              <w:rPr>
+                <w:sz w:val="17"/>
+              </w:rPr>
+              <w:t>USD (moneda funcional)</w:t>
+            </w:r>
+          </w:p>
+        </w:tc>
+        <w:tc>
+          <w:tcPr>
+            <w:tcW w:type="dxa" w:w="1587"/>
+          </w:tcPr>
+          <w:p>
+            <w:r/>
+            <w:r>
+              <w:rPr>
+                <w:sz w:val="17"/>
+              </w:rPr>
+              <w:t>Sin cobertura</w:t>
+            </w:r>
+          </w:p>
+        </w:tc>
+        <w:tc>
+          <w:tcPr>
+            <w:tcW w:type="dxa" w:w="1474"/>
+          </w:tcPr>
+          <w:p>
+            <w:r/>
+            <w:r>
+              <w:rPr>
+                <w:sz w:val="17"/>
+              </w:rPr>
+              <w:t>10,6%</w:t>
+            </w:r>
+          </w:p>
+        </w:tc>
+        <w:tc>
+          <w:tcPr>
+            <w:tcW w:type="dxa" w:w="1247"/>
+          </w:tcPr>
+          <w:p>
+            <w:r/>
+            <w:r>
+              <w:rPr>
+                <w:sz w:val="17"/>
+              </w:rPr>
+              <w:t>11,0%</w:t>
+            </w:r>
+          </w:p>
+        </w:tc>
+        <w:tc>
+          <w:tcPr>
+            <w:tcW w:type="dxa" w:w="1134"/>
+          </w:tcPr>
+          <w:p>
+            <w:r/>
+            <w:r>
+              <w:rPr>
+                <w:sz w:val="17"/>
+              </w:rPr>
+              <w:t>-7,2%</w:t>
+            </w:r>
+          </w:p>
+        </w:tc>
+        <w:tc>
+          <w:tcPr>
+            <w:tcW w:type="dxa" w:w="1361"/>
+          </w:tcPr>
+          <w:p>
+            <w:r/>
+            <w:r>
+              <w:rPr>
+                <w:sz w:val="17"/>
+              </w:rPr>
+              <w:t>2,8%</w:t>
+            </w:r>
+          </w:p>
+        </w:tc>
+      </w:tr>
+      <w:tr>
+        <w:tc>
+          <w:tcPr>
+            <w:tcW w:type="dxa" w:w="2381"/>
+            <w:shd w:val="clear" w:color="auto" w:fill="F2F5F9"/>
+          </w:tcPr>
+          <w:p>
+            <w:r/>
+            <w:r>
+              <w:rPr>
+                <w:sz w:val="17"/>
+              </w:rPr>
+              <w:t>USD (moneda funcional)</w:t>
+            </w:r>
+          </w:p>
+        </w:tc>
+        <w:tc>
+          <w:tcPr>
+            <w:tcW w:type="dxa" w:w="1587"/>
+            <w:shd w:val="clear" w:color="auto" w:fill="F2F5F9"/>
+          </w:tcPr>
+          <w:p>
+            <w:r/>
+            <w:r>
+              <w:rPr>
+                <w:sz w:val="17"/>
+              </w:rPr>
+              <w:t>Con el forward</w:t>
+            </w:r>
+          </w:p>
+        </w:tc>
+        <w:tc>
+          <w:tcPr>
+            <w:tcW w:type="dxa" w:w="1474"/>
+            <w:shd w:val="clear" w:color="auto" w:fill="F2F5F9"/>
+          </w:tcPr>
+          <w:p>
+            <w:r/>
+            <w:r>
+              <w:rPr>
+                <w:sz w:val="17"/>
+              </w:rPr>
+              <w:t>10,8%</w:t>
+            </w:r>
+          </w:p>
+        </w:tc>
+        <w:tc>
+          <w:tcPr>
+            <w:tcW w:type="dxa" w:w="1247"/>
+            <w:shd w:val="clear" w:color="auto" w:fill="F2F5F9"/>
+          </w:tcPr>
+          <w:p>
+            <w:r/>
+            <w:r>
+              <w:rPr>
+                <w:sz w:val="17"/>
+              </w:rPr>
+              <w:t>16,4%</w:t>
+            </w:r>
+          </w:p>
+        </w:tc>
+        <w:tc>
+          <w:tcPr>
+            <w:tcW w:type="dxa" w:w="1134"/>
+            <w:shd w:val="clear" w:color="auto" w:fill="F2F5F9"/>
+          </w:tcPr>
+          <w:p>
+            <w:r/>
+            <w:r>
+              <w:rPr>
+                <w:sz w:val="17"/>
+              </w:rPr>
+              <w:t>-15,7%</w:t>
+            </w:r>
+          </w:p>
+        </w:tc>
+        <w:tc>
+          <w:tcPr>
+            <w:tcW w:type="dxa" w:w="1361"/>
+            <w:shd w:val="clear" w:color="auto" w:fill="F2F5F9"/>
+          </w:tcPr>
+          <w:p>
+            <w:r/>
+            <w:r>
+              <w:rPr>
+                <w:sz w:val="17"/>
+              </w:rPr>
+              <w:t>10,1%</w:t>
+            </w:r>
+          </w:p>
+        </w:tc>
+      </w:tr>
+    </w:tbl>
+    <w:p>
+      <w:r>
+        <w:rPr>
+          <w:i/>
+          <w:sz w:val="16"/>
+        </w:rPr>
+        <w:t>20.000 escenarios de 12 meses por bootstrap de los retornos mensuales conjuntos de la cartera y del USD/CLP (2013-2026), con el dólar sin tendencia. Fuente: codigo/analisis_adicional.py.</w:t>
+      </w:r>
+    </w:p>
+    <w:p>
+      <w:r>
+        <w:rPr>
+          <w:i w:val="0"/>
+        </w:rPr>
+        <w:t>Lectura. Medido en pesos, la moneda de las metas, el forward baja la volatilidad de 13,9% a 10,3% y el peor 5% de -10,6% a -6,4%. Medido en dólares, la aumenta (11,0% → 16,4%): en los peores años de la cartera el peso se deprecia y el forward se paga (en promedio USD 8.660 en el 10% de peores años). Es el costo de medir el riesgo en la moneda de las metas, que es la que importa para la familia.</w:t>
+      </w:r>
+    </w:p>
+    <w:p>
+      <w:r>
+        <w:rPr>
+          <w:i w:val="0"/>
+        </w:rPr>
+        <w:t>Liquidez. En 42% de los escenarios la compensación supera la reserva cambiaria de 2% (USD 3.000, que alcanza hasta un dólar de CLP 992); en el 5% más adverso Nexum paga ~USD 19.498. Ese pago se financia con SGOV y venta de activos en USD, que en ese mismo escenario valen más en pesos. El valor de mercado del forward se informa mensualmente y la renovación se decide al vencimiento.</w:t>
+      </w:r>
+    </w:p>
+    <w:p>
+      <w:pPr>
         <w:pStyle w:val="Heading2"/>
       </w:pPr>
       <w:r>
@@ -4657,6 +6420,675 @@
           <w:sz w:val="16"/>
         </w:rPr>
         <w:t>Benchmark compuesto ponderado por la asignación estratégica y expresado en USD. Reemplaza la tasa de política de la Fed y el MSCI ACWI de la versión anterior, que no eran invertibles ni representaban el universo. Limitación: QMOM existe desde dic-2015, por lo que las métricas relativas usan 2016-2026.</w:t>
+      </w:r>
+    </w:p>
+    <w:p>
+      <w:pPr>
+        <w:pStyle w:val="Heading3"/>
+      </w:pPr>
+      <w:r>
+        <w:t>Benchmark por clase de activo</w:t>
+      </w:r>
+    </w:p>
+    <w:p>
+      <w:r>
+        <w:rPr>
+          <w:i w:val="0"/>
+        </w:rPr>
+        <w:t>El benchmark por sleeve mide si cada estrategia cumple su regla. El benchmark por clase de activo responde otra pregunta: si las decisiones dentro de cada clase (factores en renta variable, duración en renta fija, señal en commodities) agregan valor frente al índice amplio de esa clase. Cada clase se compara con un índice invertible del mismo universo:</w:t>
+      </w:r>
+    </w:p>
+    <w:tbl>
+      <w:tblPr>
+        <w:tblStyle w:val="TableGrid"/>
+        <w:tblW w:type="auto" w:w="0"/>
+        <w:jc w:val="center"/>
+        <w:tblLook w:firstColumn="1" w:firstRow="1" w:lastColumn="0" w:lastRow="0" w:noHBand="0" w:noVBand="1" w:val="04A0"/>
+      </w:tblPr>
+      <w:tblGrid>
+        <w:gridCol w:w="1204"/>
+        <w:gridCol w:w="1204"/>
+        <w:gridCol w:w="1204"/>
+        <w:gridCol w:w="1204"/>
+        <w:gridCol w:w="1204"/>
+        <w:gridCol w:w="1204"/>
+        <w:gridCol w:w="1204"/>
+        <w:gridCol w:w="1204"/>
+      </w:tblGrid>
+      <w:tr>
+        <w:tc>
+          <w:tcPr>
+            <w:tcW w:type="dxa" w:w="1701"/>
+            <w:shd w:val="clear" w:color="auto" w:fill="1F3A5F"/>
+          </w:tcPr>
+          <w:p>
+            <w:r/>
+            <w:r>
+              <w:rPr>
+                <w:b/>
+                <w:color w:val="FFFFFF"/>
+                <w:sz w:val="15"/>
+              </w:rPr>
+              <w:t>Clase (peso)</w:t>
+            </w:r>
+          </w:p>
+        </w:tc>
+        <w:tc>
+          <w:tcPr>
+            <w:tcW w:type="dxa" w:w="1871"/>
+            <w:shd w:val="clear" w:color="auto" w:fill="1F3A5F"/>
+          </w:tcPr>
+          <w:p>
+            <w:r/>
+            <w:r>
+              <w:rPr>
+                <w:b/>
+                <w:color w:val="FFFFFF"/>
+                <w:sz w:val="15"/>
+              </w:rPr>
+              <w:t>Benchmark</w:t>
+            </w:r>
+          </w:p>
+        </w:tc>
+        <w:tc>
+          <w:tcPr>
+            <w:tcW w:type="dxa" w:w="850"/>
+            <w:shd w:val="clear" w:color="auto" w:fill="1F3A5F"/>
+          </w:tcPr>
+          <w:p>
+            <w:r/>
+            <w:r>
+              <w:rPr>
+                <w:b/>
+                <w:color w:val="FFFFFF"/>
+                <w:sz w:val="15"/>
+              </w:rPr>
+              <w:t>Retorno Nexum</w:t>
+            </w:r>
+          </w:p>
+        </w:tc>
+        <w:tc>
+          <w:tcPr>
+            <w:tcW w:type="dxa" w:w="907"/>
+            <w:shd w:val="clear" w:color="auto" w:fill="1F3A5F"/>
+          </w:tcPr>
+          <w:p>
+            <w:r/>
+            <w:r>
+              <w:rPr>
+                <w:b/>
+                <w:color w:val="FFFFFF"/>
+                <w:sz w:val="15"/>
+              </w:rPr>
+              <w:t>Retorno benchmark</w:t>
+            </w:r>
+          </w:p>
+        </w:tc>
+        <w:tc>
+          <w:tcPr>
+            <w:tcW w:type="dxa" w:w="1134"/>
+            <w:shd w:val="clear" w:color="auto" w:fill="1F3A5F"/>
+          </w:tcPr>
+          <w:p>
+            <w:r/>
+            <w:r>
+              <w:rPr>
+                <w:b/>
+                <w:color w:val="FFFFFF"/>
+                <w:sz w:val="15"/>
+              </w:rPr>
+              <w:t>Vol. Nexum / benchmark</w:t>
+            </w:r>
+          </w:p>
+        </w:tc>
+        <w:tc>
+          <w:tcPr>
+            <w:tcW w:type="dxa" w:w="1247"/>
+            <w:shd w:val="clear" w:color="auto" w:fill="1F3A5F"/>
+          </w:tcPr>
+          <w:p>
+            <w:r/>
+            <w:r>
+              <w:rPr>
+                <w:b/>
+                <w:color w:val="FFFFFF"/>
+                <w:sz w:val="15"/>
+              </w:rPr>
+              <w:t>Máx. caída Nexum / benchmark</w:t>
+            </w:r>
+          </w:p>
+        </w:tc>
+        <w:tc>
+          <w:tcPr>
+            <w:tcW w:type="dxa" w:w="624"/>
+            <w:shd w:val="clear" w:color="auto" w:fill="1F3A5F"/>
+          </w:tcPr>
+          <w:p>
+            <w:r/>
+            <w:r>
+              <w:rPr>
+                <w:b/>
+                <w:color w:val="FFFFFF"/>
+                <w:sz w:val="15"/>
+              </w:rPr>
+              <w:t>TE</w:t>
+            </w:r>
+          </w:p>
+        </w:tc>
+        <w:tc>
+          <w:tcPr>
+            <w:tcW w:type="dxa" w:w="907"/>
+            <w:shd w:val="clear" w:color="auto" w:fill="1F3A5F"/>
+          </w:tcPr>
+          <w:p>
+            <w:r/>
+            <w:r>
+              <w:rPr>
+                <w:b/>
+                <w:color w:val="FFFFFF"/>
+                <w:sz w:val="15"/>
+              </w:rPr>
+              <w:t>Aporte al retorno activo</w:t>
+            </w:r>
+          </w:p>
+        </w:tc>
+      </w:tr>
+      <w:tr>
+        <w:tc>
+          <w:tcPr>
+            <w:tcW w:type="dxa" w:w="1701"/>
+          </w:tcPr>
+          <w:p>
+            <w:r/>
+            <w:r>
+              <w:rPr>
+                <w:sz w:val="15"/>
+              </w:rPr>
+              <w:t>Renta variable EE.UU. (62,4%)</w:t>
+            </w:r>
+          </w:p>
+        </w:tc>
+        <w:tc>
+          <w:tcPr>
+            <w:tcW w:type="dxa" w:w="1871"/>
+          </w:tcPr>
+          <w:p>
+            <w:r/>
+            <w:r>
+              <w:rPr>
+                <w:sz w:val="15"/>
+              </w:rPr>
+              <w:t>S&amp;P 500 (SPY)</w:t>
+            </w:r>
+          </w:p>
+        </w:tc>
+        <w:tc>
+          <w:tcPr>
+            <w:tcW w:type="dxa" w:w="850"/>
+          </w:tcPr>
+          <w:p>
+            <w:r/>
+            <w:r>
+              <w:rPr>
+                <w:sz w:val="15"/>
+              </w:rPr>
+              <w:t>13,9%</w:t>
+            </w:r>
+          </w:p>
+        </w:tc>
+        <w:tc>
+          <w:tcPr>
+            <w:tcW w:type="dxa" w:w="907"/>
+          </w:tcPr>
+          <w:p>
+            <w:r/>
+            <w:r>
+              <w:rPr>
+                <w:sz w:val="15"/>
+              </w:rPr>
+              <w:t>15,1%</w:t>
+            </w:r>
+          </w:p>
+        </w:tc>
+        <w:tc>
+          <w:tcPr>
+            <w:tcW w:type="dxa" w:w="1134"/>
+          </w:tcPr>
+          <w:p>
+            <w:r/>
+            <w:r>
+              <w:rPr>
+                <w:sz w:val="15"/>
+              </w:rPr>
+              <w:t>13,7% / 15,1%</w:t>
+            </w:r>
+          </w:p>
+        </w:tc>
+        <w:tc>
+          <w:tcPr>
+            <w:tcW w:type="dxa" w:w="1247"/>
+          </w:tcPr>
+          <w:p>
+            <w:r/>
+            <w:r>
+              <w:rPr>
+                <w:sz w:val="15"/>
+              </w:rPr>
+              <w:t>-19,5% / -23,9%</w:t>
+            </w:r>
+          </w:p>
+        </w:tc>
+        <w:tc>
+          <w:tcPr>
+            <w:tcW w:type="dxa" w:w="624"/>
+          </w:tcPr>
+          <w:p>
+            <w:r/>
+            <w:r>
+              <w:rPr>
+                <w:sz w:val="15"/>
+              </w:rPr>
+              <w:t>4,0%</w:t>
+            </w:r>
+          </w:p>
+        </w:tc>
+        <w:tc>
+          <w:tcPr>
+            <w:tcW w:type="dxa" w:w="907"/>
+          </w:tcPr>
+          <w:p>
+            <w:r/>
+            <w:r>
+              <w:rPr>
+                <w:sz w:val="15"/>
+              </w:rPr>
+              <w:t>-0,79 pp</w:t>
+            </w:r>
+          </w:p>
+        </w:tc>
+      </w:tr>
+      <w:tr>
+        <w:tc>
+          <w:tcPr>
+            <w:tcW w:type="dxa" w:w="1701"/>
+            <w:shd w:val="clear" w:color="auto" w:fill="F2F5F9"/>
+          </w:tcPr>
+          <w:p>
+            <w:r/>
+            <w:r>
+              <w:rPr>
+                <w:sz w:val="15"/>
+              </w:rPr>
+              <w:t>Renta fija larga EE.UU. (31,5%)</w:t>
+            </w:r>
+          </w:p>
+        </w:tc>
+        <w:tc>
+          <w:tcPr>
+            <w:tcW w:type="dxa" w:w="1871"/>
+            <w:shd w:val="clear" w:color="auto" w:fill="F2F5F9"/>
+          </w:tcPr>
+          <w:p>
+            <w:r/>
+            <w:r>
+              <w:rPr>
+                <w:sz w:val="15"/>
+              </w:rPr>
+              <w:t>Tesoro y corporativos largos 50/50 (TLH/VCLT)</w:t>
+            </w:r>
+          </w:p>
+        </w:tc>
+        <w:tc>
+          <w:tcPr>
+            <w:tcW w:type="dxa" w:w="850"/>
+            <w:shd w:val="clear" w:color="auto" w:fill="F2F5F9"/>
+          </w:tcPr>
+          <w:p>
+            <w:r/>
+            <w:r>
+              <w:rPr>
+                <w:sz w:val="15"/>
+              </w:rPr>
+              <w:t>1,3%</w:t>
+            </w:r>
+          </w:p>
+        </w:tc>
+        <w:tc>
+          <w:tcPr>
+            <w:tcW w:type="dxa" w:w="907"/>
+            <w:shd w:val="clear" w:color="auto" w:fill="F2F5F9"/>
+          </w:tcPr>
+          <w:p>
+            <w:r/>
+            <w:r>
+              <w:rPr>
+                <w:sz w:val="15"/>
+              </w:rPr>
+              <w:t>1,4%</w:t>
+            </w:r>
+          </w:p>
+        </w:tc>
+        <w:tc>
+          <w:tcPr>
+            <w:tcW w:type="dxa" w:w="1134"/>
+            <w:shd w:val="clear" w:color="auto" w:fill="F2F5F9"/>
+          </w:tcPr>
+          <w:p>
+            <w:r/>
+            <w:r>
+              <w:rPr>
+                <w:sz w:val="15"/>
+              </w:rPr>
+              <w:t>10,5% / 10,6%</w:t>
+            </w:r>
+          </w:p>
+        </w:tc>
+        <w:tc>
+          <w:tcPr>
+            <w:tcW w:type="dxa" w:w="1247"/>
+            <w:shd w:val="clear" w:color="auto" w:fill="F2F5F9"/>
+          </w:tcPr>
+          <w:p>
+            <w:r/>
+            <w:r>
+              <w:rPr>
+                <w:sz w:val="15"/>
+              </w:rPr>
+              <w:t>-36,0% / -35,7%</w:t>
+            </w:r>
+          </w:p>
+        </w:tc>
+        <w:tc>
+          <w:tcPr>
+            <w:tcW w:type="dxa" w:w="624"/>
+            <w:shd w:val="clear" w:color="auto" w:fill="F2F5F9"/>
+          </w:tcPr>
+          <w:p>
+            <w:r/>
+            <w:r>
+              <w:rPr>
+                <w:sz w:val="15"/>
+              </w:rPr>
+              <w:t>0,3%</w:t>
+            </w:r>
+          </w:p>
+        </w:tc>
+        <w:tc>
+          <w:tcPr>
+            <w:tcW w:type="dxa" w:w="907"/>
+            <w:shd w:val="clear" w:color="auto" w:fill="F2F5F9"/>
+          </w:tcPr>
+          <w:p>
+            <w:r/>
+            <w:r>
+              <w:rPr>
+                <w:sz w:val="15"/>
+              </w:rPr>
+              <w:t>-0,04 pp</w:t>
+            </w:r>
+          </w:p>
+        </w:tc>
+      </w:tr>
+      <w:tr>
+        <w:tc>
+          <w:tcPr>
+            <w:tcW w:type="dxa" w:w="1701"/>
+          </w:tcPr>
+          <w:p>
+            <w:r/>
+            <w:r>
+              <w:rPr>
+                <w:sz w:val="15"/>
+              </w:rPr>
+              <w:t>Commodities (6,1%)</w:t>
+            </w:r>
+          </w:p>
+        </w:tc>
+        <w:tc>
+          <w:tcPr>
+            <w:tcW w:type="dxa" w:w="1871"/>
+          </w:tcPr>
+          <w:p>
+            <w:r/>
+            <w:r>
+              <w:rPr>
+                <w:sz w:val="15"/>
+              </w:rPr>
+              <w:t>Mezcla igual ponderada GLD/USO/DBA/SLV/CPER</w:t>
+            </w:r>
+          </w:p>
+        </w:tc>
+        <w:tc>
+          <w:tcPr>
+            <w:tcW w:type="dxa" w:w="850"/>
+          </w:tcPr>
+          <w:p>
+            <w:r/>
+            <w:r>
+              <w:rPr>
+                <w:sz w:val="15"/>
+              </w:rPr>
+              <w:t>10,6%</w:t>
+            </w:r>
+          </w:p>
+        </w:tc>
+        <w:tc>
+          <w:tcPr>
+            <w:tcW w:type="dxa" w:w="907"/>
+          </w:tcPr>
+          <w:p>
+            <w:r/>
+            <w:r>
+              <w:rPr>
+                <w:sz w:val="15"/>
+              </w:rPr>
+              <w:t>12,1%</w:t>
+            </w:r>
+          </w:p>
+        </w:tc>
+        <w:tc>
+          <w:tcPr>
+            <w:tcW w:type="dxa" w:w="1134"/>
+          </w:tcPr>
+          <w:p>
+            <w:r/>
+            <w:r>
+              <w:rPr>
+                <w:sz w:val="15"/>
+              </w:rPr>
+              <w:t>19,2% / 15,3%</w:t>
+            </w:r>
+          </w:p>
+        </w:tc>
+        <w:tc>
+          <w:tcPr>
+            <w:tcW w:type="dxa" w:w="1247"/>
+          </w:tcPr>
+          <w:p>
+            <w:r/>
+            <w:r>
+              <w:rPr>
+                <w:sz w:val="15"/>
+              </w:rPr>
+              <w:t>-31,4% / -29,8%</w:t>
+            </w:r>
+          </w:p>
+        </w:tc>
+        <w:tc>
+          <w:tcPr>
+            <w:tcW w:type="dxa" w:w="624"/>
+          </w:tcPr>
+          <w:p>
+            <w:r/>
+            <w:r>
+              <w:rPr>
+                <w:sz w:val="15"/>
+              </w:rPr>
+              <w:t>17,5%</w:t>
+            </w:r>
+          </w:p>
+        </w:tc>
+        <w:tc>
+          <w:tcPr>
+            <w:tcW w:type="dxa" w:w="907"/>
+          </w:tcPr>
+          <w:p>
+            <w:r/>
+            <w:r>
+              <w:rPr>
+                <w:sz w:val="15"/>
+              </w:rPr>
+              <w:t>-0,04 pp</w:t>
+            </w:r>
+          </w:p>
+        </w:tc>
+      </w:tr>
+      <w:tr>
+        <w:tc>
+          <w:tcPr>
+            <w:tcW w:type="dxa" w:w="1701"/>
+            <w:shd w:val="clear" w:color="auto" w:fill="F2F5F9"/>
+          </w:tcPr>
+          <w:p>
+            <w:r/>
+            <w:r>
+              <w:rPr>
+                <w:sz w:val="15"/>
+              </w:rPr>
+              <w:t>Liquidez (reserva 4%)</w:t>
+            </w:r>
+          </w:p>
+        </w:tc>
+        <w:tc>
+          <w:tcPr>
+            <w:tcW w:type="dxa" w:w="1871"/>
+            <w:shd w:val="clear" w:color="auto" w:fill="F2F5F9"/>
+          </w:tcPr>
+          <w:p>
+            <w:r/>
+            <w:r>
+              <w:rPr>
+                <w:sz w:val="15"/>
+              </w:rPr>
+              <w:t>T-Bills 0-3 meses (BIL/SGOV)</w:t>
+            </w:r>
+          </w:p>
+        </w:tc>
+        <w:tc>
+          <w:tcPr>
+            <w:tcW w:type="dxa" w:w="850"/>
+            <w:shd w:val="clear" w:color="auto" w:fill="F2F5F9"/>
+          </w:tcPr>
+          <w:p>
+            <w:r/>
+            <w:r>
+              <w:rPr>
+                <w:sz w:val="15"/>
+              </w:rPr>
+              <w:t>—</w:t>
+            </w:r>
+          </w:p>
+        </w:tc>
+        <w:tc>
+          <w:tcPr>
+            <w:tcW w:type="dxa" w:w="907"/>
+            <w:shd w:val="clear" w:color="auto" w:fill="F2F5F9"/>
+          </w:tcPr>
+          <w:p>
+            <w:r/>
+            <w:r>
+              <w:rPr>
+                <w:sz w:val="15"/>
+              </w:rPr>
+              <w:t>—</w:t>
+            </w:r>
+          </w:p>
+        </w:tc>
+        <w:tc>
+          <w:tcPr>
+            <w:tcW w:type="dxa" w:w="1134"/>
+            <w:shd w:val="clear" w:color="auto" w:fill="F2F5F9"/>
+          </w:tcPr>
+          <w:p>
+            <w:r/>
+            <w:r>
+              <w:rPr>
+                <w:sz w:val="15"/>
+              </w:rPr>
+              <w:t>—</w:t>
+            </w:r>
+          </w:p>
+        </w:tc>
+        <w:tc>
+          <w:tcPr>
+            <w:tcW w:type="dxa" w:w="1247"/>
+            <w:shd w:val="clear" w:color="auto" w:fill="F2F5F9"/>
+          </w:tcPr>
+          <w:p>
+            <w:r/>
+            <w:r>
+              <w:rPr>
+                <w:sz w:val="15"/>
+              </w:rPr>
+              <w:t>—</w:t>
+            </w:r>
+          </w:p>
+        </w:tc>
+        <w:tc>
+          <w:tcPr>
+            <w:tcW w:type="dxa" w:w="624"/>
+            <w:shd w:val="clear" w:color="auto" w:fill="F2F5F9"/>
+          </w:tcPr>
+          <w:p>
+            <w:r/>
+            <w:r>
+              <w:rPr>
+                <w:sz w:val="15"/>
+              </w:rPr>
+              <w:t>—</w:t>
+            </w:r>
+          </w:p>
+        </w:tc>
+        <w:tc>
+          <w:tcPr>
+            <w:tcW w:type="dxa" w:w="907"/>
+            <w:shd w:val="clear" w:color="auto" w:fill="F2F5F9"/>
+          </w:tcPr>
+          <w:p>
+            <w:r/>
+            <w:r>
+              <w:rPr>
+                <w:sz w:val="15"/>
+              </w:rPr>
+              <w:t>fuera de la asignación</w:t>
+            </w:r>
+          </w:p>
+        </w:tc>
+      </w:tr>
+    </w:tbl>
+    <w:p>
+      <w:r>
+        <w:rPr>
+          <w:i/>
+          <w:sz w:val="16"/>
+        </w:rPr>
+        <w:t>2016-2026, USD. Renta fija: 50% TLH + 50% VCLT como proxy invertible del Bloomberg U.S. Long Government/Credit (BLV no está en la base de datos). Commodities: el Bloomberg Commodity Index sería el índice amplio, pero no está en la base; se usa la mezcla igual ponderada de los 5 ETF. Fuente: codigo/analisis_adicional.py.</w:t>
+      </w:r>
+    </w:p>
+    <w:p>
+      <w:r>
+        <w:rPr>
+          <w:i w:val="0"/>
+        </w:rPr>
+        <w:t>Lectura. El benchmark por clase rindió 10,7% anual frente a 9,9% de Nexum (tracking error 2,9%, dentro del objetivo de 3%). Casi toda la diferencia viene de la renta variable: Low-Volatility y Momentum rindieron 1,26 puntos menos al año que el S&amp;P 500 en una década excepcional para el índice, pero con menos volatilidad (13,7% vs 15,1%), una caída máxima menor (-19,5% vs -23,9%) y el mismo Sharpe (0,87 vs 0,87). Es decir, el satélite de renta variable cumplió su función de bajar el riesgo, no de superar al índice. La renta fija es pasiva y replica su benchmark (TE 0,3%). En 2013-2026 el resultado es similar (10,0% vs 10,3%), con un aporte positivo de commodities.</w:t>
+      </w:r>
+    </w:p>
+    <w:p>
+      <w:r>
+        <w:rPr>
+          <w:i w:val="0"/>
+        </w:rPr>
+        <w:t>Decisión de duración. Frente a los bonos amplios de EE.UU. (AGG, duración ~6), la renta fija larga de Nexum rindió casi lo mismo en 2013-2026 (1,4% vs 1,7%) con el doble de volatilidad, protegió más en la crisis de 2020 (2,3% vs 1,0%) y cayó más en el alza de tasas de 2022 (-25,3% vs -13,0%). La duración larga es una decisión estratégica coherente con metas a 14-50 años, y por eso el benchmark de la clase es de largo plazo y no el AGG.</w:t>
       </w:r>
     </w:p>
     <w:p>
@@ -9215,6 +11647,20 @@
         <w:rPr>
           <w:b/>
         </w:rPr>
+        <w:t xml:space="preserve">Cobertura cambiaria: </w:t>
+      </w:r>
+      <w:r>
+        <w:t>el 28-sep se contrató fuera de StockTrak un forward de venta de USD 104.000 a CLP 963,08 con vencimiento el 30-sep-2027 (sección 3.4).</w:t>
+      </w:r>
+    </w:p>
+    <w:p>
+      <w:pPr>
+        <w:pStyle w:val="ListBullet"/>
+      </w:pPr>
+      <w:r>
+        <w:rPr>
+          <w:b/>
+        </w:rPr>
         <w:t xml:space="preserve">Operaciones: </w:t>
       </w:r>
       <w:r>
@@ -9562,6 +12008,575 @@
         <w:t>Momentum es el sleeve con mejor desempeño en vivo (≈ +3,7% desde el 14-sep frente a ≈ +2,4% de QMOM). La cartera total se ve afectada por la subida de la tasa a 10 años a 5,3%, que golpea al núcleo de renta fija larga (~30% de la cartera). Es el principal riesgo de corto plazo y está identificado en la sección 6.</w:t>
       </w:r>
     </w:p>
+    <w:tbl>
+      <w:tblPr>
+        <w:tblStyle w:val="TableGrid"/>
+        <w:tblW w:type="auto" w:w="0"/>
+        <w:jc w:val="center"/>
+        <w:tblLook w:firstColumn="1" w:firstRow="1" w:lastColumn="0" w:lastRow="0" w:noHBand="0" w:noVBand="1" w:val="04A0"/>
+      </w:tblPr>
+      <w:tblGrid>
+        <w:gridCol w:w="1376"/>
+        <w:gridCol w:w="1376"/>
+        <w:gridCol w:w="1376"/>
+        <w:gridCol w:w="1376"/>
+        <w:gridCol w:w="1376"/>
+        <w:gridCol w:w="1376"/>
+        <w:gridCol w:w="1376"/>
+      </w:tblGrid>
+      <w:tr>
+        <w:tc>
+          <w:tcPr>
+            <w:tcW w:type="dxa" w:w="1928"/>
+            <w:shd w:val="clear" w:color="auto" w:fill="1F3A5F"/>
+          </w:tcPr>
+          <w:p>
+            <w:r/>
+            <w:r>
+              <w:rPr>
+                <w:b/>
+                <w:color w:val="FFFFFF"/>
+                <w:sz w:val="15"/>
+              </w:rPr>
+              <w:t>Clase</w:t>
+            </w:r>
+          </w:p>
+        </w:tc>
+        <w:tc>
+          <w:tcPr>
+            <w:tcW w:type="dxa" w:w="1361"/>
+            <w:shd w:val="clear" w:color="auto" w:fill="1F3A5F"/>
+          </w:tcPr>
+          <w:p>
+            <w:r/>
+            <w:r>
+              <w:rPr>
+                <w:b/>
+                <w:color w:val="FFFFFF"/>
+                <w:sz w:val="15"/>
+              </w:rPr>
+              <w:t>Invertido el 14-sep</w:t>
+            </w:r>
+          </w:p>
+        </w:tc>
+        <w:tc>
+          <w:tcPr>
+            <w:tcW w:type="dxa" w:w="1134"/>
+            <w:shd w:val="clear" w:color="auto" w:fill="1F3A5F"/>
+          </w:tcPr>
+          <w:p>
+            <w:r/>
+            <w:r>
+              <w:rPr>
+                <w:b/>
+                <w:color w:val="FFFFFF"/>
+                <w:sz w:val="15"/>
+              </w:rPr>
+              <w:t>Resultado (USD)</w:t>
+            </w:r>
+          </w:p>
+        </w:tc>
+        <w:tc>
+          <w:tcPr>
+            <w:tcW w:type="dxa" w:w="1020"/>
+            <w:shd w:val="clear" w:color="auto" w:fill="1F3A5F"/>
+          </w:tcPr>
+          <w:p>
+            <w:r/>
+            <w:r>
+              <w:rPr>
+                <w:b/>
+                <w:color w:val="FFFFFF"/>
+                <w:sz w:val="15"/>
+              </w:rPr>
+              <w:t>Retorno Nexum</w:t>
+            </w:r>
+          </w:p>
+        </w:tc>
+        <w:tc>
+          <w:tcPr>
+            <w:tcW w:type="dxa" w:w="1814"/>
+            <w:shd w:val="clear" w:color="auto" w:fill="1F3A5F"/>
+          </w:tcPr>
+          <w:p>
+            <w:r/>
+            <w:r>
+              <w:rPr>
+                <w:b/>
+                <w:color w:val="FFFFFF"/>
+                <w:sz w:val="15"/>
+              </w:rPr>
+              <w:t>Benchmark</w:t>
+            </w:r>
+          </w:p>
+        </w:tc>
+        <w:tc>
+          <w:tcPr>
+            <w:tcW w:type="dxa" w:w="1020"/>
+            <w:shd w:val="clear" w:color="auto" w:fill="1F3A5F"/>
+          </w:tcPr>
+          <w:p>
+            <w:r/>
+            <w:r>
+              <w:rPr>
+                <w:b/>
+                <w:color w:val="FFFFFF"/>
+                <w:sz w:val="15"/>
+              </w:rPr>
+              <w:t>Retorno benchmark</w:t>
+            </w:r>
+          </w:p>
+        </w:tc>
+        <w:tc>
+          <w:tcPr>
+            <w:tcW w:type="dxa" w:w="907"/>
+            <w:shd w:val="clear" w:color="auto" w:fill="1F3A5F"/>
+          </w:tcPr>
+          <w:p>
+            <w:r/>
+            <w:r>
+              <w:rPr>
+                <w:b/>
+                <w:color w:val="FFFFFF"/>
+                <w:sz w:val="15"/>
+              </w:rPr>
+              <w:t>Diferencia</w:t>
+            </w:r>
+          </w:p>
+        </w:tc>
+      </w:tr>
+      <w:tr>
+        <w:tc>
+          <w:tcPr>
+            <w:tcW w:type="dxa" w:w="1928"/>
+          </w:tcPr>
+          <w:p>
+            <w:r/>
+            <w:r>
+              <w:rPr>
+                <w:sz w:val="15"/>
+              </w:rPr>
+              <w:t>Renta variable EE.UU.</w:t>
+            </w:r>
+          </w:p>
+        </w:tc>
+        <w:tc>
+          <w:tcPr>
+            <w:tcW w:type="dxa" w:w="1361"/>
+          </w:tcPr>
+          <w:p>
+            <w:r/>
+            <w:r>
+              <w:rPr>
+                <w:sz w:val="15"/>
+              </w:rPr>
+              <w:t>USD 86.857</w:t>
+            </w:r>
+          </w:p>
+        </w:tc>
+        <w:tc>
+          <w:tcPr>
+            <w:tcW w:type="dxa" w:w="1134"/>
+          </w:tcPr>
+          <w:p>
+            <w:r/>
+            <w:r>
+              <w:rPr>
+                <w:sz w:val="15"/>
+              </w:rPr>
+              <w:t>488</w:t>
+            </w:r>
+          </w:p>
+        </w:tc>
+        <w:tc>
+          <w:tcPr>
+            <w:tcW w:type="dxa" w:w="1020"/>
+          </w:tcPr>
+          <w:p>
+            <w:r/>
+            <w:r>
+              <w:rPr>
+                <w:sz w:val="15"/>
+              </w:rPr>
+              <w:t>0,56%</w:t>
+            </w:r>
+          </w:p>
+        </w:tc>
+        <w:tc>
+          <w:tcPr>
+            <w:tcW w:type="dxa" w:w="1814"/>
+          </w:tcPr>
+          <w:p>
+            <w:r/>
+            <w:r>
+              <w:rPr>
+                <w:sz w:val="15"/>
+              </w:rPr>
+              <w:t>S&amp;P 500 (SPY)</w:t>
+            </w:r>
+          </w:p>
+        </w:tc>
+        <w:tc>
+          <w:tcPr>
+            <w:tcW w:type="dxa" w:w="1020"/>
+          </w:tcPr>
+          <w:p>
+            <w:r/>
+            <w:r>
+              <w:rPr>
+                <w:sz w:val="15"/>
+              </w:rPr>
+              <w:t>2,49%</w:t>
+            </w:r>
+          </w:p>
+        </w:tc>
+        <w:tc>
+          <w:tcPr>
+            <w:tcW w:type="dxa" w:w="907"/>
+          </w:tcPr>
+          <w:p>
+            <w:r/>
+            <w:r>
+              <w:rPr>
+                <w:sz w:val="15"/>
+              </w:rPr>
+              <w:t>-1,93 pp</w:t>
+            </w:r>
+          </w:p>
+        </w:tc>
+      </w:tr>
+      <w:tr>
+        <w:tc>
+          <w:tcPr>
+            <w:tcW w:type="dxa" w:w="1928"/>
+            <w:shd w:val="clear" w:color="auto" w:fill="F2F5F9"/>
+          </w:tcPr>
+          <w:p>
+            <w:r/>
+            <w:r>
+              <w:rPr>
+                <w:sz w:val="15"/>
+              </w:rPr>
+              <w:t>Renta fija larga EE.UU.</w:t>
+            </w:r>
+          </w:p>
+        </w:tc>
+        <w:tc>
+          <w:tcPr>
+            <w:tcW w:type="dxa" w:w="1361"/>
+            <w:shd w:val="clear" w:color="auto" w:fill="F2F5F9"/>
+          </w:tcPr>
+          <w:p>
+            <w:r/>
+            <w:r>
+              <w:rPr>
+                <w:sz w:val="15"/>
+              </w:rPr>
+              <w:t>USD 45.179</w:t>
+            </w:r>
+          </w:p>
+        </w:tc>
+        <w:tc>
+          <w:tcPr>
+            <w:tcW w:type="dxa" w:w="1134"/>
+            <w:shd w:val="clear" w:color="auto" w:fill="F2F5F9"/>
+          </w:tcPr>
+          <w:p>
+            <w:r/>
+            <w:r>
+              <w:rPr>
+                <w:sz w:val="15"/>
+              </w:rPr>
+              <w:t>-1.505</w:t>
+            </w:r>
+          </w:p>
+        </w:tc>
+        <w:tc>
+          <w:tcPr>
+            <w:tcW w:type="dxa" w:w="1020"/>
+            <w:shd w:val="clear" w:color="auto" w:fill="F2F5F9"/>
+          </w:tcPr>
+          <w:p>
+            <w:r/>
+            <w:r>
+              <w:rPr>
+                <w:sz w:val="15"/>
+              </w:rPr>
+              <w:t>-3,33%</w:t>
+            </w:r>
+          </w:p>
+        </w:tc>
+        <w:tc>
+          <w:tcPr>
+            <w:tcW w:type="dxa" w:w="1814"/>
+            <w:shd w:val="clear" w:color="auto" w:fill="F2F5F9"/>
+          </w:tcPr>
+          <w:p>
+            <w:r/>
+            <w:r>
+              <w:rPr>
+                <w:sz w:val="15"/>
+              </w:rPr>
+              <w:t>TLH/VCLT 50/50</w:t>
+            </w:r>
+          </w:p>
+        </w:tc>
+        <w:tc>
+          <w:tcPr>
+            <w:tcW w:type="dxa" w:w="1020"/>
+            <w:shd w:val="clear" w:color="auto" w:fill="F2F5F9"/>
+          </w:tcPr>
+          <w:p>
+            <w:r/>
+            <w:r>
+              <w:rPr>
+                <w:sz w:val="15"/>
+              </w:rPr>
+              <w:t>-3,27%</w:t>
+            </w:r>
+          </w:p>
+        </w:tc>
+        <w:tc>
+          <w:tcPr>
+            <w:tcW w:type="dxa" w:w="907"/>
+            <w:shd w:val="clear" w:color="auto" w:fill="F2F5F9"/>
+          </w:tcPr>
+          <w:p>
+            <w:r/>
+            <w:r>
+              <w:rPr>
+                <w:sz w:val="15"/>
+              </w:rPr>
+              <w:t>-0,06 pp</w:t>
+            </w:r>
+          </w:p>
+        </w:tc>
+      </w:tr>
+      <w:tr>
+        <w:tc>
+          <w:tcPr>
+            <w:tcW w:type="dxa" w:w="1928"/>
+          </w:tcPr>
+          <w:p>
+            <w:r/>
+            <w:r>
+              <w:rPr>
+                <w:sz w:val="15"/>
+              </w:rPr>
+              <w:t>Commodities</w:t>
+            </w:r>
+          </w:p>
+        </w:tc>
+        <w:tc>
+          <w:tcPr>
+            <w:tcW w:type="dxa" w:w="1361"/>
+          </w:tcPr>
+          <w:p>
+            <w:r/>
+            <w:r>
+              <w:rPr>
+                <w:sz w:val="15"/>
+              </w:rPr>
+              <w:t>USD 8.706</w:t>
+            </w:r>
+          </w:p>
+        </w:tc>
+        <w:tc>
+          <w:tcPr>
+            <w:tcW w:type="dxa" w:w="1134"/>
+          </w:tcPr>
+          <w:p>
+            <w:r/>
+            <w:r>
+              <w:rPr>
+                <w:sz w:val="15"/>
+              </w:rPr>
+              <w:t>-707</w:t>
+            </w:r>
+          </w:p>
+        </w:tc>
+        <w:tc>
+          <w:tcPr>
+            <w:tcW w:type="dxa" w:w="1020"/>
+          </w:tcPr>
+          <w:p>
+            <w:r/>
+            <w:r>
+              <w:rPr>
+                <w:sz w:val="15"/>
+              </w:rPr>
+              <w:t>-8,12%</w:t>
+            </w:r>
+          </w:p>
+        </w:tc>
+        <w:tc>
+          <w:tcPr>
+            <w:tcW w:type="dxa" w:w="1814"/>
+          </w:tcPr>
+          <w:p>
+            <w:r/>
+            <w:r>
+              <w:rPr>
+                <w:sz w:val="15"/>
+              </w:rPr>
+              <w:t>Mezcla de 5 ETF</w:t>
+            </w:r>
+          </w:p>
+        </w:tc>
+        <w:tc>
+          <w:tcPr>
+            <w:tcW w:type="dxa" w:w="1020"/>
+          </w:tcPr>
+          <w:p>
+            <w:r/>
+            <w:r>
+              <w:rPr>
+                <w:sz w:val="15"/>
+              </w:rPr>
+              <w:t>-1,54%</w:t>
+            </w:r>
+          </w:p>
+        </w:tc>
+        <w:tc>
+          <w:tcPr>
+            <w:tcW w:type="dxa" w:w="907"/>
+          </w:tcPr>
+          <w:p>
+            <w:r/>
+            <w:r>
+              <w:rPr>
+                <w:sz w:val="15"/>
+              </w:rPr>
+              <w:t>-6,58 pp</w:t>
+            </w:r>
+          </w:p>
+        </w:tc>
+      </w:tr>
+      <w:tr>
+        <w:tc>
+          <w:tcPr>
+            <w:tcW w:type="dxa" w:w="1928"/>
+            <w:shd w:val="clear" w:color="auto" w:fill="F2F5F9"/>
+          </w:tcPr>
+          <w:p>
+            <w:r/>
+            <w:r>
+              <w:rPr>
+                <w:sz w:val="15"/>
+              </w:rPr>
+              <w:t>Liquidez (reserva)</w:t>
+            </w:r>
+          </w:p>
+        </w:tc>
+        <w:tc>
+          <w:tcPr>
+            <w:tcW w:type="dxa" w:w="1361"/>
+            <w:shd w:val="clear" w:color="auto" w:fill="F2F5F9"/>
+          </w:tcPr>
+          <w:p>
+            <w:r/>
+            <w:r>
+              <w:rPr>
+                <w:sz w:val="15"/>
+              </w:rPr>
+              <w:t>USD 6.937</w:t>
+            </w:r>
+          </w:p>
+        </w:tc>
+        <w:tc>
+          <w:tcPr>
+            <w:tcW w:type="dxa" w:w="1134"/>
+            <w:shd w:val="clear" w:color="auto" w:fill="F2F5F9"/>
+          </w:tcPr>
+          <w:p>
+            <w:r/>
+            <w:r>
+              <w:rPr>
+                <w:sz w:val="15"/>
+              </w:rPr>
+              <w:t>6</w:t>
+            </w:r>
+          </w:p>
+        </w:tc>
+        <w:tc>
+          <w:tcPr>
+            <w:tcW w:type="dxa" w:w="1020"/>
+            <w:shd w:val="clear" w:color="auto" w:fill="F2F5F9"/>
+          </w:tcPr>
+          <w:p>
+            <w:r/>
+            <w:r>
+              <w:rPr>
+                <w:sz w:val="15"/>
+              </w:rPr>
+              <w:t>0,09%</w:t>
+            </w:r>
+          </w:p>
+        </w:tc>
+        <w:tc>
+          <w:tcPr>
+            <w:tcW w:type="dxa" w:w="1814"/>
+            <w:shd w:val="clear" w:color="auto" w:fill="F2F5F9"/>
+          </w:tcPr>
+          <w:p>
+            <w:r/>
+            <w:r>
+              <w:rPr>
+                <w:sz w:val="15"/>
+              </w:rPr>
+              <w:t>T-Bills 0-3 meses (SGOV)</w:t>
+            </w:r>
+          </w:p>
+        </w:tc>
+        <w:tc>
+          <w:tcPr>
+            <w:tcW w:type="dxa" w:w="1020"/>
+            <w:shd w:val="clear" w:color="auto" w:fill="F2F5F9"/>
+          </w:tcPr>
+          <w:p>
+            <w:r/>
+            <w:r>
+              <w:rPr>
+                <w:sz w:val="15"/>
+              </w:rPr>
+              <w:t>0,23%</w:t>
+            </w:r>
+          </w:p>
+        </w:tc>
+        <w:tc>
+          <w:tcPr>
+            <w:tcW w:type="dxa" w:w="907"/>
+            <w:shd w:val="clear" w:color="auto" w:fill="F2F5F9"/>
+          </w:tcPr>
+          <w:p>
+            <w:r/>
+            <w:r>
+              <w:rPr>
+                <w:sz w:val="15"/>
+              </w:rPr>
+              <w:t>-0,14 pp</w:t>
+            </w:r>
+          </w:p>
+        </w:tc>
+      </w:tr>
+    </w:tbl>
+    <w:p>
+      <w:r>
+        <w:rPr>
+          <w:i/>
+          <w:sz w:val="16"/>
+        </w:rPr>
+        <w:t>Desde el 14-sep hasta el 6-oct (exports de StockTrak). El resultado incluye dividendos y comisiones de USD 10; los benchmarks parten de nuestro precio de entrada (o del cierre del 14-sep) con dividendos reinvertidos. La suma de los resultados cuadra con la pérdida total de la cuenta. Fuente: codigo/analisis_adicional.py.</w:t>
+      </w:r>
+    </w:p>
+    <w:p>
+      <w:r>
+        <w:rPr>
+          <w:i w:val="0"/>
+        </w:rPr>
+        <w:t>Por clase de activo: la renta fija replica su benchmark, como corresponde a un núcleo pasivo; la renta variable queda 1,9 puntos bajo el S&amp;P 500, en parte por las comisiones (48 operaciones, USD 480) y en parte por el sesgo defensivo de Low-Volatility en un mercado al alza; commodities queda 6,6 puntos bajo su benchmark por la pérdida en USO, ya liquidado.</w:t>
+      </w:r>
+    </w:p>
     <w:p>
       <w:pPr>
         <w:pStyle w:val="Heading1"/>
@@ -9856,7 +12871,7 @@
               <w:rPr>
                 <w:sz w:val="17"/>
               </w:rPr>
-              <w:t>Cobertura natural (correlación negativa); simulaciones en UF; reserva cambiaria de 2%</w:t>
+              <w:t>Forward de venta de USD 104.000 a un año (~70%, cerca de la cobertura de mínimo riesgo en pesos); cobertura natural; simulaciones en UF; reserva cambiaria de 2%</w:t>
             </w:r>
           </w:p>
         </w:tc>
@@ -9873,7 +12888,7 @@
               <w:rPr>
                 <w:sz w:val="17"/>
               </w:rPr>
-              <w:t>Empleo de Tomás</w:t>
+              <w:t>Liquidez del forward</w:t>
             </w:r>
           </w:p>
         </w:tc>
@@ -9888,7 +12903,7 @@
               <w:rPr>
                 <w:sz w:val="17"/>
               </w:rPr>
-              <w:t>Aportes condicionados a seguir empleado</w:t>
+              <w:t>Si el dólar sube, Nexum paga la compensación al vencimiento (sept-2027)</w:t>
             </w:r>
           </w:p>
         </w:tc>
@@ -9896,6 +12911,50 @@
           <w:tcPr>
             <w:tcW w:type="dxa" w:w="3855"/>
             <w:shd w:val="clear" w:color="auto" w:fill="F2F5F9"/>
+          </w:tcPr>
+          <w:p>
+            <w:r/>
+            <w:r>
+              <w:rPr>
+                <w:sz w:val="17"/>
+              </w:rPr>
+              <w:t>Se paga con SGOV y venta de activos en USD, que en ese escenario valen más en pesos; supera la reserva de 2% en 42% de los escenarios; valor de mercado informado mensualmente</w:t>
+            </w:r>
+          </w:p>
+        </w:tc>
+      </w:tr>
+      <w:tr>
+        <w:tc>
+          <w:tcPr>
+            <w:tcW w:type="dxa" w:w="2041"/>
+          </w:tcPr>
+          <w:p>
+            <w:r/>
+            <w:r>
+              <w:rPr>
+                <w:sz w:val="17"/>
+              </w:rPr>
+              <w:t>Empleo de Tomás</w:t>
+            </w:r>
+          </w:p>
+        </w:tc>
+        <w:tc>
+          <w:tcPr>
+            <w:tcW w:type="dxa" w:w="3175"/>
+          </w:tcPr>
+          <w:p>
+            <w:r/>
+            <w:r>
+              <w:rPr>
+                <w:sz w:val="17"/>
+              </w:rPr>
+              <w:t>Aportes condicionados a seguir empleado</w:t>
+            </w:r>
+          </w:p>
+        </w:tc>
+        <w:tc>
+          <w:tcPr>
+            <w:tcW w:type="dxa" w:w="3855"/>
           </w:tcPr>
           <w:p>
             <w:r/>
@@ -10703,7 +13762,35 @@
         <w:rPr>
           <w:i w:val="0"/>
         </w:rPr>
-        <w:t>Todo el universo de inversión cotiza en USD y cubrir el tipo de cambio requiere derivados que el perfil excluye. El peso se deprecia cuando caen los mercados (cobertura natural) y el ahorro en USD diversifica el riesgo país de una familia cuyo capital humano y vivienda están en Chile. Las simulaciones se presentan también en UF.</w:t>
+        <w:t>Todo el universo de inversión cotiza en USD. El peso se deprecia cuando caen los mercados (cobertura natural) y el ahorro en USD diversifica el riesgo país de una familia cuyo capital humano y vivienda están en Chile. Las simulaciones se presentan también en UF, y el riesgo cambiario de corto plazo se cubre parcialmente con un forward.</w:t>
+      </w:r>
+    </w:p>
+    <w:p>
+      <w:r>
+        <w:rPr>
+          <w:b/>
+        </w:rPr>
+        <w:t xml:space="preserve">Si el perfil excluye derivados, ¿por qué firmaron un forward? </w:t>
+      </w:r>
+      <w:r>
+        <w:rPr>
+          <w:i w:val="0"/>
+        </w:rPr>
+        <w:t>El perfil excluye derivados complejos, apalancamiento y especulación. Un forward de monedas es el derivado más simple, se usa solo para cubrir y el monto es menor que la cartera, así que no apalanca. Cubre 70% de la cartera: más cobertura no reduce el riesgo en pesos, porque el peso ya se deprecia cuando caen los mercados. Su costo es bajo (0,44% del monto) y su riesgo es de liquidez: si el dólar sube hay que pagar la compensación, pero en ese escenario la cartera vale más en pesos.</w:t>
+      </w:r>
+    </w:p>
+    <w:p>
+      <w:r>
+        <w:rPr>
+          <w:b/>
+        </w:rPr>
+        <w:t xml:space="preserve">¿Contra qué se evalúa cada clase de activo? </w:t>
+      </w:r>
+      <w:r>
+        <w:rPr>
+          <w:i w:val="0"/>
+        </w:rPr>
+        <w:t>Renta variable contra el S&amp;P 500, renta fija larga contra un índice de bonos largos de gobierno y corporativos, commodities contra la mezcla de sus 5 ETF y la reserva contra T-Bills. Frente a ese benchmark, Nexum rindió 9,9% vs 10,7% en 2016-2026, con menos volatilidad y caídas más bajas: el satélite de renta variable baja el riesgo, no busca superar al índice en un mercado alcista.</w:t>
       </w:r>
     </w:p>
     <w:p>
@@ -10764,6 +13851,14 @@
       </w:pPr>
       <w:r>
         <w:t>codigo/run_all.py corre todo; codigo/excel_modelo.py genera el Excel; codigo/figuras.py e informe.py, este documento; codigo/senales.py, las señales de operación.</w:t>
+      </w:r>
+    </w:p>
+    <w:p>
+      <w:pPr>
+        <w:pStyle w:val="ListBullet"/>
+      </w:pPr>
+      <w:r>
+        <w:t>codigo/analisis_adicional.py: benchmark por clase de activo, resultado en vivo por clase, forward USD/CLP, bandas de rebalanceo y activos adicionales (resultados/analisis_adicional.xlsx).</w:t>
       </w:r>
     </w:p>
     <w:p>

</xml_diff>

<commit_message>
Benchmark de renta fija: Bloomberg U.S. Long Government/Credit Index
Se nombra explícitamente el índice de Bloomberg (el que sigue BLV) como benchmark de la
clase renta fija larga, con 50% TLH + 50% VCLT como proxy invertible, en el análisis,
la sección 3.5 y el Anexo B del informe.

Co-Authored-By: Claude Opus 5.5 <noreply@anthropic.com>
Claude-Session: https://claude.ai/code/session_01T5hAYzxrHpdpyuLVyANGG6
</commit_message>
<xml_diff>
--- a/nexum_proyecto_final/informe/Informe_Final_Nexum.docx
+++ b/nexum_proyecto_final/informe/Informe_Final_Nexum.docx
@@ -6734,7 +6734,7 @@
               <w:rPr>
                 <w:sz w:val="15"/>
               </w:rPr>
-              <w:t>Tesoro y corporativos largos 50/50 (TLH/VCLT)</w:t>
+              <w:t>Bloomberg U.S. Long Government/Credit (proxy: 50% TLH + 50% VCLT)</w:t>
             </w:r>
           </w:p>
         </w:tc>
@@ -7088,7 +7088,7 @@
         <w:rPr>
           <w:i w:val="0"/>
         </w:rPr>
-        <w:t>Decisión de duración. Frente a los bonos amplios de EE.UU. (AGG, duración ~6), la renta fija larga de Nexum rindió casi lo mismo en 2013-2026 (1,4% vs 1,7%) con el doble de volatilidad, protegió más en la crisis de 2020 (2,3% vs 1,0%) y cayó más en el alza de tasas de 2022 (-25,3% vs -13,0%). La duración larga es una decisión estratégica coherente con metas a 14-50 años, y por eso el benchmark de la clase es de largo plazo y no el AGG.</w:t>
+        <w:t>Decisión de duración. Frente a los bonos amplios de EE.UU. (AGG, duración ~6), la renta fija larga de Nexum rindió casi lo mismo en 2013-2026 (1,4% vs 1,7%) con el doble de volatilidad, protegió más en la crisis de 2020 (2,3% vs 1,0%) y cayó más en el alza de tasas de 2022 (-25,3% vs -13,0%). La duración larga es una decisión estratégica coherente con metas a 14-50 años, y por eso el benchmark de la clase es el Bloomberg U.S. Long Government/Credit Index (duración ~14, igual a la nuestra) y no el Bloomberg U.S. Aggregate (AGG).</w:t>
       </w:r>
     </w:p>
     <w:p>
@@ -12317,7 +12317,7 @@
               <w:rPr>
                 <w:sz w:val="15"/>
               </w:rPr>
-              <w:t>TLH/VCLT 50/50</w:t>
+              <w:t>Bloomberg U.S. Long Gov/Credit (proxy TLH/VCLT 50/50)</w:t>
             </w:r>
           </w:p>
         </w:tc>
@@ -13790,7 +13790,7 @@
         <w:rPr>
           <w:i w:val="0"/>
         </w:rPr>
-        <w:t>Renta variable contra el S&amp;P 500, renta fija larga contra un índice de bonos largos de gobierno y corporativos, commodities contra la mezcla de sus 5 ETF y la reserva contra T-Bills. Frente a ese benchmark, Nexum rindió 9,9% vs 10,7% en 2016-2026, con menos volatilidad y caídas más bajas: el satélite de renta variable baja el riesgo, no busca superar al índice en un mercado alcista.</w:t>
+        <w:t>Renta variable contra el S&amp;P 500, renta fija larga contra el Bloomberg U.S. Long Government/Credit Index (el que sigue el ETF BLV), commodities contra la mezcla de sus 5 ETF y la reserva contra T-Bills. Frente a ese benchmark, Nexum rindió 9,9% vs 10,7% en 2016-2026, con menos volatilidad y caídas más bajas: el satélite de renta variable baja el riesgo, no busca superar al índice en un mercado alcista.</w:t>
       </w:r>
     </w:p>
     <w:p>

</xml_diff>

<commit_message>
Benchmark de commodities: DJP (Bloomberg Commodity Index TR)
- config/portafolio/run_all/excel_modelo: el sleeve de commodities se mide contra DJP en
  vez de la mezcla igual ponderada de los 5 ETF; serie DJP agregada a extra_prices.parquet.
- benchmark_djp.py (nuevo): recalcula solo benchmark de política, métricas, tracking error
  y estrategias sobre los retornos oficiales, sin rehacer backtests (estrategias, BL y
  Montecarlo quedan idénticos).
- analisis_adicional e informe: benchmark por clase de commodities = DJP; en vivo sigue la
  mezcla de 5 ETF por falta de precios de DJP posteriores al 11-sep.
- Excel, figuras e informe regenerados; LEEME actualizado.

Co-Authored-By: Claude Opus 5.5 <noreply@anthropic.com>
Claude-Session: https://claude.ai/code/session_01T5hAYzxrHpdpyuLVyANGG6
</commit_message>
<xml_diff>
--- a/nexum_proyecto_final/informe/Informe_Final_Nexum.docx
+++ b/nexum_proyecto_final/informe/Informe_Final_Nexum.docx
@@ -182,7 +182,7 @@
         <w:t xml:space="preserve">Gestión activa. </w:t>
       </w:r>
       <w:r>
-        <w:t>Tracking error ex-ante 2,0% (objetivo 3%, máximo 4%) e information ratio 0,18 frente al benchmark de política en 2016-2026.</w:t>
+        <w:t>Tracking error ex-ante 2,1% (objetivo 3%, máximo 4%) e information ratio 0,27 frente al benchmark de política en 2016-2026.</w:t>
       </w:r>
     </w:p>
     <w:p>
@@ -2145,7 +2145,7 @@
               <w:rPr>
                 <w:sz w:val="17"/>
               </w:rPr>
-              <w:t>9,5%</w:t>
+              <w:t>9,3%</w:t>
             </w:r>
           </w:p>
         </w:tc>
@@ -2220,7 +2220,7 @@
               <w:rPr>
                 <w:sz w:val="17"/>
               </w:rPr>
-              <w:t>11,0%</w:t>
+              <w:t>10,9%</w:t>
             </w:r>
           </w:p>
         </w:tc>
@@ -2294,7 +2294,7 @@
               <w:rPr>
                 <w:sz w:val="17"/>
               </w:rPr>
-              <w:t>0,69</w:t>
+              <w:t>0,68</w:t>
             </w:r>
           </w:p>
         </w:tc>
@@ -2369,7 +2369,7 @@
               <w:rPr>
                 <w:sz w:val="17"/>
               </w:rPr>
-              <w:t>0,59</w:t>
+              <w:t>0,58</w:t>
             </w:r>
           </w:p>
         </w:tc>
@@ -2518,7 +2518,7 @@
               <w:rPr>
                 <w:sz w:val="17"/>
               </w:rPr>
-              <w:t>-21,4%</w:t>
+              <w:t>-20,3%</w:t>
             </w:r>
           </w:p>
         </w:tc>
@@ -2592,7 +2592,7 @@
               <w:rPr>
                 <w:sz w:val="17"/>
               </w:rPr>
-              <w:t>4,4%</w:t>
+              <w:t>4,5%</w:t>
             </w:r>
           </w:p>
         </w:tc>
@@ -2727,7 +2727,7 @@
               <w:rPr>
                 <w:sz w:val="17"/>
               </w:rPr>
-              <w:t>2,0%</w:t>
+              <w:t>2,1%</w:t>
             </w:r>
           </w:p>
         </w:tc>
@@ -2755,7 +2755,7 @@
               <w:rPr>
                 <w:sz w:val="17"/>
               </w:rPr>
-              <w:t>4,2%</w:t>
+              <w:t>4,1%</w:t>
             </w:r>
           </w:p>
         </w:tc>
@@ -2769,7 +2769,7 @@
               <w:rPr>
                 <w:sz w:val="17"/>
               </w:rPr>
-              <w:t>6,2%</w:t>
+              <w:t>6,1%</w:t>
             </w:r>
           </w:p>
         </w:tc>
@@ -2801,7 +2801,7 @@
               <w:rPr>
                 <w:sz w:val="17"/>
               </w:rPr>
-              <w:t>0,18</w:t>
+              <w:t>0,27</w:t>
             </w:r>
           </w:p>
         </w:tc>
@@ -2831,7 +2831,7 @@
               <w:rPr>
                 <w:sz w:val="17"/>
               </w:rPr>
-              <w:t>0,75</w:t>
+              <w:t>0,81</w:t>
             </w:r>
           </w:p>
         </w:tc>
@@ -2846,7 +2846,7 @@
               <w:rPr>
                 <w:sz w:val="17"/>
               </w:rPr>
-              <w:t>0,90</w:t>
+              <w:t>0,94</w:t>
             </w:r>
           </w:p>
         </w:tc>
@@ -4130,7 +4130,7 @@
               <w:rPr>
                 <w:sz w:val="16"/>
               </w:rPr>
-              <w:t>Mezcla 5 ETF</w:t>
+              <w:t>DJP</w:t>
             </w:r>
           </w:p>
         </w:tc>
@@ -4214,7 +4214,7 @@
               <w:rPr>
                 <w:sz w:val="16"/>
               </w:rPr>
-              <w:t>17,5%</w:t>
+              <w:t>19,6%</w:t>
             </w:r>
           </w:p>
         </w:tc>
@@ -4228,7 +4228,7 @@
               <w:rPr>
                 <w:sz w:val="16"/>
               </w:rPr>
-              <w:t>-0,04</w:t>
+              <w:t>0,12</w:t>
             </w:r>
           </w:p>
         </w:tc>
@@ -4543,7 +4543,7 @@
               <w:rPr>
                 <w:sz w:val="15"/>
               </w:rPr>
-              <w:t>1,9%</w:t>
+              <w:t>2,0%</w:t>
             </w:r>
           </w:p>
         </w:tc>
@@ -4663,7 +4663,7 @@
               <w:rPr>
                 <w:sz w:val="15"/>
               </w:rPr>
-              <w:t>2,2%</w:t>
+              <w:t>2,1%</w:t>
             </w:r>
           </w:p>
         </w:tc>
@@ -6407,7 +6407,7 @@
               <w:rPr>
                 <w:sz w:val="17"/>
               </w:rPr>
-              <w:t>Mezcla igual ponderada GLD/USO/DBA/SLV/CPER</w:t>
+              <w:t>Bloomberg Commodity Index Total Return (DJP)</w:t>
             </w:r>
           </w:p>
         </w:tc>
@@ -6854,7 +6854,7 @@
               <w:rPr>
                 <w:sz w:val="15"/>
               </w:rPr>
-              <w:t>Mezcla igual ponderada GLD/USO/DBA/SLV/CPER</w:t>
+              <w:t>Bloomberg Commodity Index TR (DJP)</w:t>
             </w:r>
           </w:p>
         </w:tc>
@@ -6882,7 +6882,7 @@
               <w:rPr>
                 <w:sz w:val="15"/>
               </w:rPr>
-              <w:t>12,1%</w:t>
+              <w:t>8,5%</w:t>
             </w:r>
           </w:p>
         </w:tc>
@@ -6896,7 +6896,7 @@
               <w:rPr>
                 <w:sz w:val="15"/>
               </w:rPr>
-              <w:t>19,2% / 15,3%</w:t>
+              <w:t>19,2% / 16,3%</w:t>
             </w:r>
           </w:p>
         </w:tc>
@@ -6910,7 +6910,7 @@
               <w:rPr>
                 <w:sz w:val="15"/>
               </w:rPr>
-              <w:t>-31,4% / -29,8%</w:t>
+              <w:t>-31,4% / -36,2%</w:t>
             </w:r>
           </w:p>
         </w:tc>
@@ -6924,7 +6924,7 @@
               <w:rPr>
                 <w:sz w:val="15"/>
               </w:rPr>
-              <w:t>17,5%</w:t>
+              <w:t>19,6%</w:t>
             </w:r>
           </w:p>
         </w:tc>
@@ -6938,7 +6938,7 @@
               <w:rPr>
                 <w:sz w:val="15"/>
               </w:rPr>
-              <w:t>-0,04 pp</w:t>
+              <w:t>0,15 pp</w:t>
             </w:r>
           </w:p>
         </w:tc>
@@ -7072,7 +7072,7 @@
           <w:i/>
           <w:sz w:val="16"/>
         </w:rPr>
-        <w:t>2016-2026, USD. Renta fija: 50% TLH + 50% VCLT como proxy invertible del Bloomberg U.S. Long Government/Credit (BLV no está en la base de datos). Commodities: el Bloomberg Commodity Index sería el índice amplio, pero no está en la base; se usa la mezcla igual ponderada de los 5 ETF. Fuente: codigo/analisis_adicional.py.</w:t>
+        <w:t>2016-2026, USD. Renta fija: 50% TLH + 50% VCLT como proxy invertible del Bloomberg U.S. Long Government/Credit (BLV no está en la base de datos). Commodities: Bloomberg Commodity Index Total Return, vía el ETN DJP (24 materias primas en energía, metales y agricultura). Fuente: codigo/analisis_adicional.py.</w:t>
       </w:r>
     </w:p>
     <w:p>
@@ -7080,7 +7080,7 @@
         <w:rPr>
           <w:i w:val="0"/>
         </w:rPr>
-        <w:t>Lectura. El benchmark por clase rindió 10,7% anual frente a 9,9% de Nexum (tracking error 2,9%, dentro del objetivo de 3%). Casi toda la diferencia viene de la renta variable: Low-Volatility y Momentum rindieron 1,26 puntos menos al año que el S&amp;P 500 en una década excepcional para el índice, pero con menos volatilidad (13,7% vs 15,1%), una caída máxima menor (-19,5% vs -23,9%) y el mismo Sharpe (0,87 vs 0,87). Es decir, el satélite de renta variable cumplió su función de bajar el riesgo, no de superar al índice. La renta fija es pasiva y replica su benchmark (TE 0,3%). En 2013-2026 el resultado es similar (10,0% vs 10,3%), con un aporte positivo de commodities.</w:t>
+        <w:t>Lectura. El benchmark por clase rindió 10,5% anual frente a 9,9% de Nexum (tracking error 2,9%, dentro del objetivo de 3%). Casi toda la diferencia viene de la renta variable: Low-Volatility y Momentum rindieron 1,26 puntos menos al año que el S&amp;P 500 en una década excepcional para el índice, pero con menos volatilidad (13,7% vs 15,1%), una caída máxima menor (-19,5% vs -23,9%) y el mismo Sharpe (0,87 vs 0,87). Es decir, el satélite de renta variable cumplió su función de bajar el riesgo, no de superar al índice. La renta fija es pasiva y replica su benchmark (TE 0,3%). En 2013-2026 el resultado es similar (10,0% vs 10,1%), con un aporte positivo de commodities.</w:t>
       </w:r>
     </w:p>
     <w:p>
@@ -7496,7 +7496,7 @@
         <w:rPr>
           <w:i w:val="0"/>
         </w:rPr>
-        <w:t>El límite se deriva del presupuesto de riesgo activo (Grinold y Kahn, 2000): con un alfa objetivo de 1,5% anual y un information ratio objetivo de 0,5, el TE objetivo es 1,5% / 0,5 = 3,0%; el máximo es 4% (alfa de 2% con el mismo IR). El TE ex-ante con los pesos aprobados es 2,0% (2016-2026) y 2,4% en los últimos 36 meses, dentro del objetivo; el information ratio realizado es 0,18.</w:t>
+        <w:t>El límite se deriva del presupuesto de riesgo activo (Grinold y Kahn, 2000): con un alfa objetivo de 1,5% anual y un information ratio objetivo de 0,5, el TE objetivo es 1,5% / 0,5 = 3,0%; el máximo es 4% (alfa de 2% con el mismo IR). El TE ex-ante con los pesos aprobados es 2,1% (2016-2026) y 2,5% en los últimos 36 meses, dentro del objetivo; el information ratio realizado es 0,27.</w:t>
       </w:r>
     </w:p>
     <w:p>
@@ -12419,7 +12419,7 @@
               <w:rPr>
                 <w:sz w:val="15"/>
               </w:rPr>
-              <w:t>Mezcla de 5 ETF</w:t>
+              <w:t>Mezcla de 5 ETF (DJP sin precios en vivo)</w:t>
             </w:r>
           </w:p>
         </w:tc>
@@ -13790,7 +13790,7 @@
         <w:rPr>
           <w:i w:val="0"/>
         </w:rPr>
-        <w:t>Renta variable contra el S&amp;P 500, renta fija larga contra el Bloomberg U.S. Long Government/Credit Index (el que sigue el ETF BLV), commodities contra la mezcla de sus 5 ETF y la reserva contra T-Bills. Frente a ese benchmark, Nexum rindió 9,9% vs 10,7% en 2016-2026, con menos volatilidad y caídas más bajas: el satélite de renta variable baja el riesgo, no busca superar al índice en un mercado alcista.</w:t>
+        <w:t>Renta variable contra el S&amp;P 500, renta fija larga contra el Bloomberg U.S. Long Government/Credit Index (el que sigue el ETF BLV), commodities contra el Bloomberg Commodity Index (DJP) y la reserva contra T-Bills. Frente a ese benchmark, Nexum rindió 9,9% vs 10,5% en 2016-2026, con menos volatilidad y caídas más bajas: el satélite de renta variable baja el riesgo, no busca superar al índice en un mercado alcista.</w:t>
       </w:r>
     </w:p>
     <w:p>

</xml_diff>

<commit_message>
Commodities en vivo contra DJP (precios de Nasdaq.com al 8-oct)
Co-Authored-By: Claude Opus 5.5 <noreply@anthropic.com>
Claude-Session: https://claude.ai/code/session_01T5hAYzxrHpdpyuLVyANGG6
</commit_message>
<xml_diff>
--- a/nexum_proyecto_final/informe/Informe_Final_Nexum.docx
+++ b/nexum_proyecto_final/informe/Informe_Final_Nexum.docx
@@ -12419,7 +12419,7 @@
               <w:rPr>
                 <w:sz w:val="15"/>
               </w:rPr>
-              <w:t>Mezcla de 5 ETF (DJP sin precios en vivo)</w:t>
+              <w:t>Bloomberg Commodity Index TR (DJP)</w:t>
             </w:r>
           </w:p>
         </w:tc>
@@ -12433,7 +12433,7 @@
               <w:rPr>
                 <w:sz w:val="15"/>
               </w:rPr>
-              <w:t>-1,54%</w:t>
+              <w:t>-1,33%</w:t>
             </w:r>
           </w:p>
         </w:tc>
@@ -12447,7 +12447,7 @@
               <w:rPr>
                 <w:sz w:val="15"/>
               </w:rPr>
-              <w:t>-6,58 pp</w:t>
+              <w:t>-6,78 pp</w:t>
             </w:r>
           </w:p>
         </w:tc>
@@ -12574,7 +12574,7 @@
         <w:rPr>
           <w:i w:val="0"/>
         </w:rPr>
-        <w:t>Por clase de activo: la renta fija replica su benchmark, como corresponde a un núcleo pasivo; la renta variable queda 1,9 puntos bajo el S&amp;P 500, en parte por las comisiones (48 operaciones, USD 480) y en parte por el sesgo defensivo de Low-Volatility en un mercado al alza; commodities queda 6,6 puntos bajo su benchmark por la pérdida en USO, ya liquidado.</w:t>
+        <w:t>Por clase de activo: la renta fija replica su benchmark, como corresponde a un núcleo pasivo; la renta variable queda 1,9 puntos bajo el S&amp;P 500, en parte por las comisiones (48 operaciones, USD 480) y en parte por el sesgo defensivo de Low-Volatility en un mercado al alza; commodities queda 6,8 puntos bajo su benchmark por la pérdida en USO, ya liquidado.</w:t>
       </w:r>
     </w:p>
     <w:p>

</xml_diff>

<commit_message>
TIR requerida sobre el capital invertido (USD 144.000)
Acordado con el profesor guía: la reserva de 4% no financia metas, así que la TIR y la
factibilidad usan el mismo capital que el Montecarlo. TIR base 4,56% -> 4,65%; escenario
exigente 5,6% -> 5,7%; cobertura 0,61x -> 0,60x. objetivos.py, fórmula del Excel (02_Objetivos_TIR),
tir_capital_invertido.py (actualiza solo las tablas de objetivos), informe e insumos.

Co-Authored-By: Claude Opus 5.5 <noreply@anthropic.com>
Claude-Session: https://claude.ai/code/session_01T5hAYzxrHpdpyuLVyANGG6
</commit_message>
<xml_diff>
--- a/nexum_proyecto_final/informe/Informe_Final_Nexum.docx
+++ b/nexum_proyecto_final/informe/Informe_Final_Nexum.docx
@@ -112,7 +112,7 @@
         <w:t xml:space="preserve">Retorno requerido. </w:t>
       </w:r>
       <w:r>
-        <w:t>Para financiar Educación, Villarrica y la herencia con USD 150.000 y 19 aportes de USD 10.000, la cartera debe rendir 4,56% real anual (TIR de los flujos del enunciado). Con supuestos más exigentes y fieles al caso —aportes en USD nominales, arancel creciendo 2% real, 14 años efectivos de aportes— el requerimiento sube a 5,6%.</w:t>
+        <w:t>Para financiar Educación, Villarrica y la herencia con los USD 144.000 invertidos (USD 150.000 menos la reserva de 4%, que no financia metas) y 19 aportes de USD 10.000, la cartera debe rendir 4,65% real anual (TIR de los flujos del enunciado). Con supuestos más exigentes y fieles al caso —aportes en USD nominales, arancel creciendo 2% real, 14 años efectivos de aportes— el requerimiento sube a 5,7%.</w:t>
       </w:r>
     </w:p>
     <w:p>
@@ -126,7 +126,7 @@
         <w:t xml:space="preserve">Factibilidad. </w:t>
       </w:r>
       <w:r>
-        <w:t>A la tasa real libre de riesgo (2,5%), los objetivos valen USD 492.981 y los recursos USD 299.789: cobertura de 0,61x. El plan exige capturar prima por riesgo. Villarrica explica 56% del valor presente de los objetivos.</w:t>
+        <w:t>A la tasa real libre de riesgo (2,5%), los objetivos valen USD 492.981 y los recursos USD 293.789: cobertura de 0,60x. El plan exige capturar prima por riesgo. Villarrica explica 56% del valor presente de los objetivos.</w:t>
       </w:r>
     </w:p>
     <w:p>
@@ -154,7 +154,7 @@
         <w:t xml:space="preserve">Probabilidad de éxito. </w:t>
       </w:r>
       <w:r>
-        <w:t>Educación se cumple en ~100% de los escenarios simulados, en USD y en UF. Con retornos históricos 2013-2026, los tres objetivos se cumplen con 96,0% (89,6% medido en UF). Con supuestos prospectivos prudentes —retorno real esperado 4,6%, prácticamente igual al requerido— la probabilidad conjunta es 46,5%.</w:t>
+        <w:t>Educación se cumple en ~100% de los escenarios simulados, en USD y en UF. Con retornos históricos 2013-2026, los tres objetivos se cumplen con 96,0% (89,6% medido en UF). Con supuestos prospectivos prudentes —retorno real esperado 4,6%, levemente bajo el requerido— la probabilidad conjunta es 46,5%.</w:t>
       </w:r>
     </w:p>
     <w:p>
@@ -1232,7 +1232,7 @@
         <w:rPr>
           <w:i w:val="0"/>
         </w:rPr>
-        <w:t>A la tasa real libre de riesgo, los recursos cubren 0,61 veces los objetivos: el plan es factible solo si la cartera captura prima por riesgo. Valorizados a la TIR, Villarrica representa 56% de la exigencia, Educación 24% y la herencia 20%. No se usa la venta de la casa de Santiago más allá de las UF 15.000 que el enunciado asigna a Villarrica.</w:t>
+        <w:t>A la tasa real libre de riesgo, los recursos cubren 0,60 veces los objetivos: el plan es factible solo si la cartera captura prima por riesgo. Valorizados a la TIR, Villarrica representa 56% de la exigencia, Educación 25% y la herencia 19%. No se usa la venta de la casa de Santiago más allá de las UF 15.000 que el enunciado asigna a Villarrica.</w:t>
       </w:r>
     </w:p>
     <w:tbl>
@@ -2858,7 +2858,7 @@
         <w:rPr>
           <w:i w:val="0"/>
         </w:rPr>
-        <w:t>Retorno esperado vs requerido: el retorno histórico real 2013-2026 fue 7,8%, muy sobre el requerido. Con supuestos prospectivos (tasa real ~2,5% más primas moderadas; sección 4.3) el retorno real esperado es 4,6%, igual al requerido de 4,56%. Nivel de riesgo aceptable: volatilidad anual de 10-12%, máxima caída tolerada de 25% y probabilidad de Educación de al menos 90%.</w:t>
+        <w:t>Retorno esperado vs requerido: el retorno histórico real 2013-2026 fue 7,8%, muy sobre el requerido. Con supuestos prospectivos (tasa real ~2,5% más primas moderadas; sección 4.3) el retorno real esperado es 4,6%, levemente bajo el requerido de 4,65%: el plan es exigente y depende de las palancas. Nivel de riesgo aceptable: volatilidad anual de 10-12%, máxima caída tolerada de 25% y probabilidad de Educación de al menos 90%.</w:t>
       </w:r>
     </w:p>
     <w:p>
@@ -8733,7 +8733,7 @@
         <w:rPr>
           <w:i w:val="0"/>
         </w:rPr>
-        <w:t>Interpretación: Educación se cumple en prácticamente todos los escenarios, por lo que el piso de diseño (90-95%) se satisface con holgura. La incertidumbre se concentra en Villarrica y la herencia, que el IPS define como flexibles. Con retornos históricos el plan es holgado; con supuestos prudentes la probabilidad conjunta es menor a 50%, coherente con un retorno esperado que apenas iguala al requerido. Esta es la conclusión que se presenta a los clientes, junto con las palancas de ajuste:</w:t>
+        <w:t>Interpretación: Educación se cumple en prácticamente todos los escenarios, por lo que el piso de diseño (90-95%) se satisface con holgura. La incertidumbre se concentra en Villarrica y la herencia, que el IPS define como flexibles. Con retornos históricos el plan es holgado; con supuestos prudentes la probabilidad conjunta es menor a 50%, coherente con un retorno esperado levemente bajo el requerido. Esta es la conclusión que se presenta a los clientes, junto con las palancas de ajuste:</w:t>
       </w:r>
     </w:p>
     <w:tbl>
@@ -13748,7 +13748,7 @@
         <w:rPr>
           <w:i w:val="0"/>
         </w:rPr>
-        <w:t>Porque con supuestos prudentes el retorno real esperado (~4,6%) apenas iguala al requerido (4,56%). Lo presentamos con transparencia en vez de mostrar solo el 96% histórico. Educación está asegurada en todos los escenarios; para Villarrica y la herencia se acordaron palancas que elevan la probabilidad a ~75%.</w:t>
+        <w:t>Porque con supuestos prudentes el retorno real esperado (~4,6%) queda levemente bajo el requerido (4,65%). Lo presentamos con transparencia en vez de mostrar solo el 96% histórico. Educación está asegurada en todos los escenarios; para Villarrica y la herencia se acordaron palancas que elevan la probabilidad a ~75%.</w:t>
       </w:r>
     </w:p>
     <w:p>

</xml_diff>

<commit_message>
Informe: sección 'Por qué la cartera no rindió como esperábamos' y desviaciones del 6-oct
Co-Authored-By: Claude Opus 5.5 <noreply@anthropic.com>
Claude-Session: https://claude.ai/code/session_01T5hAYzxrHpdpyuLVyANGG6
</commit_message>
<xml_diff>
--- a/nexum_proyecto_final/informe/Informe_Final_Nexum.docx
+++ b/nexum_proyecto_final/informe/Informe_Final_Nexum.docx
@@ -11586,7 +11586,7 @@
         <w:pStyle w:val="Heading1"/>
       </w:pPr>
       <w:r>
-        <w:t>5. Implementación en StockTrak (al 5-oct-2026)</w:t>
+        <w:t>5. Implementación en StockTrak (al 6-oct-2026)</w:t>
       </w:r>
     </w:p>
     <w:p>
@@ -11998,6 +11998,126 @@
           </w:p>
         </w:tc>
       </w:tr>
+      <w:tr>
+        <w:tc>
+          <w:tcPr>
+            <w:tcW w:type="dxa" w:w="850"/>
+          </w:tcPr>
+          <w:p>
+            <w:r/>
+            <w:r>
+              <w:rPr>
+                <w:sz w:val="15"/>
+              </w:rPr>
+              <w:t>6-oct</w:t>
+            </w:r>
+          </w:p>
+        </w:tc>
+        <w:tc>
+          <w:tcPr>
+            <w:tcW w:type="dxa" w:w="1474"/>
+          </w:tcPr>
+          <w:p>
+            <w:r/>
+            <w:r>
+              <w:rPr>
+                <w:sz w:val="15"/>
+              </w:rPr>
+              <w:t>Momentum</w:t>
+            </w:r>
+          </w:p>
+        </w:tc>
+        <w:tc>
+          <w:tcPr>
+            <w:tcW w:type="dxa" w:w="3061"/>
+          </w:tcPr>
+          <w:p>
+            <w:r/>
+            <w:r>
+              <w:rPr>
+                <w:sz w:val="15"/>
+              </w:rPr>
+              <w:t>Se pasa de 10 a 7 acciones (máximo 2 por sector)</w:t>
+            </w:r>
+          </w:p>
+        </w:tc>
+        <w:tc>
+          <w:tcPr>
+            <w:tcW w:type="dxa" w:w="3685"/>
+          </w:tcPr>
+          <w:p>
+            <w:r/>
+            <w:r>
+              <w:rPr>
+                <w:sz w:val="15"/>
+              </w:rPr>
+              <w:t>Con ~USD 10.000 en el sleeve, las comisiones costaban ~2,4 puntos; con 7 acciones el backtest rinde 17,4% vs 16,2%. Única regla modificada: desde aquí no se cambian reglas, para validar la estrategia estudiada</w:t>
+            </w:r>
+          </w:p>
+        </w:tc>
+      </w:tr>
+      <w:tr>
+        <w:tc>
+          <w:tcPr>
+            <w:tcW w:type="dxa" w:w="850"/>
+            <w:shd w:val="clear" w:color="auto" w:fill="F2F5F9"/>
+          </w:tcPr>
+          <w:p>
+            <w:r/>
+            <w:r>
+              <w:rPr>
+                <w:sz w:val="15"/>
+              </w:rPr>
+              <w:t>6-oct</w:t>
+            </w:r>
+          </w:p>
+        </w:tc>
+        <w:tc>
+          <w:tcPr>
+            <w:tcW w:type="dxa" w:w="1474"/>
+            <w:shd w:val="clear" w:color="auto" w:fill="F2F5F9"/>
+          </w:tcPr>
+          <w:p>
+            <w:r/>
+            <w:r>
+              <w:rPr>
+                <w:sz w:val="15"/>
+              </w:rPr>
+              <w:t>Momentum</w:t>
+            </w:r>
+          </w:p>
+        </w:tc>
+        <w:tc>
+          <w:tcPr>
+            <w:tcW w:type="dxa" w:w="3061"/>
+            <w:shd w:val="clear" w:color="auto" w:fill="F2F5F9"/>
+          </w:tcPr>
+          <w:p>
+            <w:r/>
+            <w:r>
+              <w:rPr>
+                <w:sz w:val="15"/>
+              </w:rPr>
+              <w:t>HUM reemplaza a CRL</w:t>
+            </w:r>
+          </w:p>
+        </w:tc>
+        <w:tc>
+          <w:tcPr>
+            <w:tcW w:type="dxa" w:w="3685"/>
+            <w:shd w:val="clear" w:color="auto" w:fill="F2F5F9"/>
+          </w:tcPr>
+          <w:p>
+            <w:r/>
+            <w:r>
+              <w:rPr>
+                <w:sz w:val="15"/>
+              </w:rPr>
+              <w:t>CRL tuvo una reversión intradía de 11%; la regla de ejecución indica postergar la compra, no reemplazarla. Desviación discrecional</w:t>
+            </w:r>
+          </w:p>
+        </w:tc>
+      </w:tr>
     </w:tbl>
     <w:p/>
     <w:p>
@@ -12579,6 +12699,343 @@
     </w:p>
     <w:p>
       <w:pPr>
+        <w:pStyle w:val="Heading3"/>
+      </w:pPr>
+      <w:r>
+        <w:t>Por qué la cartera no rindió como esperábamos</w:t>
+      </w:r>
+    </w:p>
+    <w:p>
+      <w:r>
+        <w:rPr>
+          <w:i w:val="0"/>
+        </w:rPr>
+        <w:t>Entre el 14-sep y el 6-oct la cartera perdió USD 1.718 (-1,15% sobre el capital), mientras el S&amp;P 500 subió 2,5%. La pérdida tiene tres explicaciones, todas medibles:</w:t>
+      </w:r>
+    </w:p>
+    <w:tbl>
+      <w:tblPr>
+        <w:tblStyle w:val="TableGrid"/>
+        <w:tblW w:type="auto" w:w="0"/>
+        <w:jc w:val="center"/>
+        <w:tblLook w:firstColumn="1" w:firstRow="1" w:lastColumn="0" w:lastRow="0" w:noHBand="0" w:noVBand="1" w:val="04A0"/>
+      </w:tblPr>
+      <w:tblGrid>
+        <w:gridCol w:w="3211"/>
+        <w:gridCol w:w="3211"/>
+        <w:gridCol w:w="3211"/>
+      </w:tblGrid>
+      <w:tr>
+        <w:tc>
+          <w:tcPr>
+            <w:tcW w:type="dxa" w:w="2381"/>
+            <w:shd w:val="clear" w:color="auto" w:fill="1F3A5F"/>
+          </w:tcPr>
+          <w:p>
+            <w:r/>
+            <w:r>
+              <w:rPr>
+                <w:b/>
+                <w:color w:val="FFFFFF"/>
+                <w:sz w:val="16"/>
+              </w:rPr>
+              <w:t>Bloque</w:t>
+            </w:r>
+          </w:p>
+        </w:tc>
+        <w:tc>
+          <w:tcPr>
+            <w:tcW w:type="dxa" w:w="1361"/>
+            <w:shd w:val="clear" w:color="auto" w:fill="1F3A5F"/>
+          </w:tcPr>
+          <w:p>
+            <w:r/>
+            <w:r>
+              <w:rPr>
+                <w:b/>
+                <w:color w:val="FFFFFF"/>
+                <w:sz w:val="16"/>
+              </w:rPr>
+              <w:t>Resultado (USD)</w:t>
+            </w:r>
+          </w:p>
+        </w:tc>
+        <w:tc>
+          <w:tcPr>
+            <w:tcW w:type="dxa" w:w="5329"/>
+            <w:shd w:val="clear" w:color="auto" w:fill="1F3A5F"/>
+          </w:tcPr>
+          <w:p>
+            <w:r/>
+            <w:r>
+              <w:rPr>
+                <w:b/>
+                <w:color w:val="FFFFFF"/>
+                <w:sz w:val="16"/>
+              </w:rPr>
+              <w:t>Qué pasó</w:t>
+            </w:r>
+          </w:p>
+        </w:tc>
+      </w:tr>
+      <w:tr>
+        <w:tc>
+          <w:tcPr>
+            <w:tcW w:type="dxa" w:w="2381"/>
+          </w:tcPr>
+          <w:p>
+            <w:r/>
+            <w:r>
+              <w:rPr>
+                <w:sz w:val="16"/>
+              </w:rPr>
+              <w:t>Bonos largos (TLH + VCLT, ~31%)</w:t>
+            </w:r>
+          </w:p>
+        </w:tc>
+        <w:tc>
+          <w:tcPr>
+            <w:tcW w:type="dxa" w:w="1361"/>
+          </w:tcPr>
+          <w:p>
+            <w:r/>
+            <w:r>
+              <w:rPr>
+                <w:sz w:val="16"/>
+              </w:rPr>
+              <w:t>-1.505</w:t>
+            </w:r>
+          </w:p>
+        </w:tc>
+        <w:tc>
+          <w:tcPr>
+            <w:tcW w:type="dxa" w:w="5329"/>
+          </w:tcPr>
+          <w:p>
+            <w:r/>
+            <w:r>
+              <w:rPr>
+                <w:sz w:val="16"/>
+              </w:rPr>
+              <w:t>La tasa a 10 años subió hasta 5,3%, su nivel más alto desde 2002, y los bonos cayeron 3,3%, lo mismo que su índice. No fue un error de ejecución: es el riesgo de duración que asumimos</w:t>
+            </w:r>
+          </w:p>
+        </w:tc>
+      </w:tr>
+      <w:tr>
+        <w:tc>
+          <w:tcPr>
+            <w:tcW w:type="dxa" w:w="2381"/>
+            <w:shd w:val="clear" w:color="auto" w:fill="F2F5F9"/>
+          </w:tcPr>
+          <w:p>
+            <w:r/>
+            <w:r>
+              <w:rPr>
+                <w:sz w:val="16"/>
+              </w:rPr>
+              <w:t>Commodities (~6%)</w:t>
+            </w:r>
+          </w:p>
+        </w:tc>
+        <w:tc>
+          <w:tcPr>
+            <w:tcW w:type="dxa" w:w="1361"/>
+            <w:shd w:val="clear" w:color="auto" w:fill="F2F5F9"/>
+          </w:tcPr>
+          <w:p>
+            <w:r/>
+            <w:r>
+              <w:rPr>
+                <w:sz w:val="16"/>
+              </w:rPr>
+              <w:t>-707</w:t>
+            </w:r>
+          </w:p>
+        </w:tc>
+        <w:tc>
+          <w:tcPr>
+            <w:tcW w:type="dxa" w:w="5329"/>
+            <w:shd w:val="clear" w:color="auto" w:fill="F2F5F9"/>
+          </w:tcPr>
+          <w:p>
+            <w:r/>
+            <w:r>
+              <w:rPr>
+                <w:sz w:val="16"/>
+              </w:rPr>
+              <w:t>USO cayó con el petróleo y se vendió el 2-oct; el sleeve perdió 8,1% frente a 1,3% de DJP</w:t>
+            </w:r>
+          </w:p>
+        </w:tc>
+      </w:tr>
+      <w:tr>
+        <w:tc>
+          <w:tcPr>
+            <w:tcW w:type="dxa" w:w="2381"/>
+          </w:tcPr>
+          <w:p>
+            <w:r/>
+            <w:r>
+              <w:rPr>
+                <w:sz w:val="16"/>
+              </w:rPr>
+              <w:t>Acciones (~62%)</w:t>
+            </w:r>
+          </w:p>
+        </w:tc>
+        <w:tc>
+          <w:tcPr>
+            <w:tcW w:type="dxa" w:w="1361"/>
+          </w:tcPr>
+          <w:p>
+            <w:r/>
+            <w:r>
+              <w:rPr>
+                <w:sz w:val="16"/>
+              </w:rPr>
+              <w:t>488</w:t>
+            </w:r>
+          </w:p>
+        </w:tc>
+        <w:tc>
+          <w:tcPr>
+            <w:tcW w:type="dxa" w:w="5329"/>
+          </w:tcPr>
+          <w:p>
+            <w:r/>
+            <w:r>
+              <w:rPr>
+                <w:sz w:val="16"/>
+              </w:rPr>
+              <w:t>Ganaron 0,6%, menos que el S&amp;P 500: Low-Volatility es defensiva en un mercado al alza y las comisiones restan</w:t>
+            </w:r>
+          </w:p>
+        </w:tc>
+      </w:tr>
+      <w:tr>
+        <w:tc>
+          <w:tcPr>
+            <w:tcW w:type="dxa" w:w="2381"/>
+            <w:shd w:val="clear" w:color="auto" w:fill="F2F5F9"/>
+          </w:tcPr>
+          <w:p>
+            <w:r/>
+            <w:r>
+              <w:rPr>
+                <w:sz w:val="16"/>
+              </w:rPr>
+              <w:t>Liquidez (SGOV)</w:t>
+            </w:r>
+          </w:p>
+        </w:tc>
+        <w:tc>
+          <w:tcPr>
+            <w:tcW w:type="dxa" w:w="1361"/>
+            <w:shd w:val="clear" w:color="auto" w:fill="F2F5F9"/>
+          </w:tcPr>
+          <w:p>
+            <w:r/>
+            <w:r>
+              <w:rPr>
+                <w:sz w:val="16"/>
+              </w:rPr>
+              <w:t>6</w:t>
+            </w:r>
+          </w:p>
+        </w:tc>
+        <w:tc>
+          <w:tcPr>
+            <w:tcW w:type="dxa" w:w="5329"/>
+            <w:shd w:val="clear" w:color="auto" w:fill="F2F5F9"/>
+          </w:tcPr>
+          <w:p>
+            <w:r/>
+            <w:r>
+              <w:rPr>
+                <w:sz w:val="16"/>
+              </w:rPr>
+              <w:t>Rinde como las letras del Tesoro</w:t>
+            </w:r>
+          </w:p>
+        </w:tc>
+      </w:tr>
+    </w:tbl>
+    <w:p>
+      <w:r>
+        <w:rPr>
+          <w:i/>
+          <w:sz w:val="16"/>
+        </w:rPr>
+        <w:t>Los bloques suman USD -1.718, igual que StockTrak. Incluyen dividendos y comisiones (55 operaciones, USD 550); sin comisiones, la cartera iría -0,8%.</w:t>
+      </w:r>
+    </w:p>
+    <w:p>
+      <w:r>
+        <w:rPr>
+          <w:i w:val="0"/>
+        </w:rPr>
+        <w:t>Lo que esperábamos y lo que pasó. La estrategia se diseñó para metas a 14-50 años, no para ganarle al S&amp;P 500 en cuatro semanas. Los bonos largos se eligieron porque protegen cuando las acciones caen (en febrero y marzo de 2020 subieron 2,3% mientras el S&amp;P 500 caía 19%); su costo es caer cuando suben las tasas, que es exactamente lo que ocurrió en septiembre. La beta realizada de la cartera (0,58) muestra que se movió menos que el mercado, como se diseñó, y el tracking error frente a la política (2,1%) está dentro del objetivo de 3%.</w:t>
+      </w:r>
+    </w:p>
+    <w:p>
+      <w:pPr>
+        <w:pStyle w:val="ListBullet"/>
+      </w:pPr>
+      <w:r>
+        <w:rPr>
+          <w:b/>
+        </w:rPr>
+        <w:t xml:space="preserve">Diversificar se nota en los días malos: </w:t>
+      </w:r>
+      <w:r>
+        <w:t>el 28-sep el S&amp;P 500 cayó 0,74% y Low-Volatility quedó prácticamente plana (−0,09%).</w:t>
+      </w:r>
+    </w:p>
+    <w:p>
+      <w:pPr>
+        <w:pStyle w:val="ListBullet"/>
+      </w:pPr>
+      <w:r>
+        <w:rPr>
+          <w:b/>
+        </w:rPr>
+        <w:t xml:space="preserve">Las reglas evitan decisiones por impulso: </w:t>
+      </w:r>
+      <w:r>
+        <w:t>la única venta fuera de la señal (el petróleo, 2-oct) se tomó por riesgo de concentración y quedó documentada con su motivo.</w:t>
+      </w:r>
+    </w:p>
+    <w:p>
+      <w:pPr>
+        <w:pStyle w:val="ListBullet"/>
+      </w:pPr>
+      <w:r>
+        <w:rPr>
+          <w:b/>
+        </w:rPr>
+        <w:t xml:space="preserve">En una cartera chica las comisiones pesan: </w:t>
+      </w:r>
+      <w:r>
+        <w:t>por eso Momentum pasó de 10 a 7 acciones; fue la única regla modificada.</w:t>
+      </w:r>
+    </w:p>
+    <w:p>
+      <w:pPr>
+        <w:pStyle w:val="ListBullet"/>
+      </w:pPr>
+      <w:r>
+        <w:rPr>
+          <w:b/>
+        </w:rPr>
+        <w:t xml:space="preserve">Validar antes que ajustar: </w:t>
+      </w:r>
+      <w:r>
+        <w:t>aunque hoy commodities quede invertido solo en cobre, no se cambian las reglas a mitad de la simulación; el objetivo es probar la estrategia que se estudió, no optimizarla mirando el resultado.</w:t>
+      </w:r>
+    </w:p>
+    <w:p>
+      <w:pPr>
         <w:pStyle w:val="Heading1"/>
       </w:pPr>
       <w:r>
@@ -12721,7 +13178,7 @@
               <w:rPr>
                 <w:sz w:val="17"/>
               </w:rPr>
-              <w:t>Retorno esperado ≈ requerido</w:t>
+              <w:t>Retorno esperado (4,6%) levemente bajo el requerido</w:t>
             </w:r>
           </w:p>
         </w:tc>

</xml_diff>

<commit_message>
Implementación al 14-oct: exports de StockTrak, precios de benchmarks y nuevas desviaciones
Co-Authored-By: Claude Opus 5.5 <noreply@anthropic.com>
Claude-Session: https://claude.ai/code/session_01T5hAYzxrHpdpyuLVyANGG6
</commit_message>
<xml_diff>
--- a/nexum_proyecto_final/informe/Informe_Final_Nexum.docx
+++ b/nexum_proyecto_final/informe/Informe_Final_Nexum.docx
@@ -11586,7 +11586,7 @@
         <w:pStyle w:val="Heading1"/>
       </w:pPr>
       <w:r>
-        <w:t>5. Implementación en StockTrak (al 6-oct-2026)</w:t>
+        <w:t>5. Implementación en StockTrak (al 14-oct-2026)</w:t>
       </w:r>
     </w:p>
     <w:p>
@@ -12118,6 +12118,184 @@
           </w:p>
         </w:tc>
       </w:tr>
+      <w:tr>
+        <w:tc>
+          <w:tcPr>
+            <w:tcW w:type="dxa" w:w="850"/>
+          </w:tcPr>
+          <w:p>
+            <w:r/>
+            <w:r>
+              <w:rPr>
+                <w:sz w:val="15"/>
+              </w:rPr>
+              <w:t>8-oct</w:t>
+            </w:r>
+          </w:p>
+        </w:tc>
+        <w:tc>
+          <w:tcPr>
+            <w:tcW w:type="dxa" w:w="1474"/>
+          </w:tcPr>
+          <w:p>
+            <w:r/>
+            <w:r>
+              <w:rPr>
+                <w:sz w:val="15"/>
+              </w:rPr>
+              <w:t>Commodities</w:t>
+            </w:r>
+          </w:p>
+        </w:tc>
+        <w:tc>
+          <w:tcPr>
+            <w:tcW w:type="dxa" w:w="3061"/>
+          </w:tcPr>
+          <w:p>
+            <w:r/>
+            <w:r>
+              <w:rPr>
+                <w:sz w:val="15"/>
+              </w:rPr>
+              <w:t>Compra de 76 DJP (USD 3.982) con la caja del sleeve</w:t>
+            </w:r>
+          </w:p>
+        </w:tc>
+        <w:tc>
+          <w:tcPr>
+            <w:tcW w:type="dxa" w:w="3685"/>
+          </w:tcPr>
+          <w:p>
+            <w:r/>
+            <w:r>
+              <w:rPr>
+                <w:sz w:val="15"/>
+              </w:rPr>
+              <w:t>[Completar motivo] DJP es el benchmark del sleeve, no parte de su universo: equivale a invertir pasivamente la caja. Desviación discrecional</w:t>
+            </w:r>
+          </w:p>
+        </w:tc>
+      </w:tr>
+      <w:tr>
+        <w:tc>
+          <w:tcPr>
+            <w:tcW w:type="dxa" w:w="850"/>
+            <w:shd w:val="clear" w:color="auto" w:fill="F2F5F9"/>
+          </w:tcPr>
+          <w:p>
+            <w:r/>
+            <w:r>
+              <w:rPr>
+                <w:sz w:val="15"/>
+              </w:rPr>
+              <w:t>8 al 14-oct</w:t>
+            </w:r>
+          </w:p>
+        </w:tc>
+        <w:tc>
+          <w:tcPr>
+            <w:tcW w:type="dxa" w:w="1474"/>
+            <w:shd w:val="clear" w:color="auto" w:fill="F2F5F9"/>
+          </w:tcPr>
+          <w:p>
+            <w:r/>
+            <w:r>
+              <w:rPr>
+                <w:sz w:val="15"/>
+              </w:rPr>
+              <w:t>Momentum</w:t>
+            </w:r>
+          </w:p>
+        </w:tc>
+        <w:tc>
+          <w:tcPr>
+            <w:tcW w:type="dxa" w:w="3061"/>
+            <w:shd w:val="clear" w:color="auto" w:fill="F2F5F9"/>
+          </w:tcPr>
+          <w:p>
+            <w:r/>
+            <w:r>
+              <w:rPr>
+                <w:sz w:val="15"/>
+              </w:rPr>
+              <w:t>Compra de AMD y MU; venta de MU (14-oct) y de CPAY (13-oct)</w:t>
+            </w:r>
+          </w:p>
+        </w:tc>
+        <w:tc>
+          <w:tcPr>
+            <w:tcW w:type="dxa" w:w="3685"/>
+            <w:shd w:val="clear" w:color="auto" w:fill="F2F5F9"/>
+          </w:tcPr>
+          <w:p>
+            <w:r/>
+            <w:r>
+              <w:rPr>
+                <w:sz w:val="15"/>
+              </w:rPr>
+              <w:t>[Completar motivo] CPAY estaba fuera del top 25 (regla de permanencia)</w:t>
+            </w:r>
+          </w:p>
+        </w:tc>
+      </w:tr>
+      <w:tr>
+        <w:tc>
+          <w:tcPr>
+            <w:tcW w:type="dxa" w:w="850"/>
+          </w:tcPr>
+          <w:p>
+            <w:r/>
+            <w:r>
+              <w:rPr>
+                <w:sz w:val="15"/>
+              </w:rPr>
+              <w:t>13-oct</w:t>
+            </w:r>
+          </w:p>
+        </w:tc>
+        <w:tc>
+          <w:tcPr>
+            <w:tcW w:type="dxa" w:w="1474"/>
+          </w:tcPr>
+          <w:p>
+            <w:r/>
+            <w:r>
+              <w:rPr>
+                <w:sz w:val="15"/>
+              </w:rPr>
+              <w:t>Low-Volatility</w:t>
+            </w:r>
+          </w:p>
+        </w:tc>
+        <w:tc>
+          <w:tcPr>
+            <w:tcW w:type="dxa" w:w="3061"/>
+          </w:tcPr>
+          <w:p>
+            <w:r/>
+            <w:r>
+              <w:rPr>
+                <w:sz w:val="15"/>
+              </w:rPr>
+              <w:t>Venta de AFL y PG sin reemplazo (quedan 9 acciones)</w:t>
+            </w:r>
+          </w:p>
+        </w:tc>
+        <w:tc>
+          <w:tcPr>
+            <w:tcW w:type="dxa" w:w="3685"/>
+          </w:tcPr>
+          <w:p>
+            <w:r/>
+            <w:r>
+              <w:rPr>
+                <w:sz w:val="15"/>
+              </w:rPr>
+              <w:t>[Completar motivo] AFL era desviación desde el 21-sep; la regla pide 10 acciones a peso igual</w:t>
+            </w:r>
+          </w:p>
+        </w:tc>
+      </w:tr>
     </w:tbl>
     <w:p/>
     <w:p>
@@ -12304,7 +12482,7 @@
               <w:rPr>
                 <w:sz w:val="15"/>
               </w:rPr>
-              <w:t>488</w:t>
+              <w:t>-11</w:t>
             </w:r>
           </w:p>
         </w:tc>
@@ -12318,7 +12496,7 @@
               <w:rPr>
                 <w:sz w:val="15"/>
               </w:rPr>
-              <w:t>0,56%</w:t>
+              <w:t>-0,01%</w:t>
             </w:r>
           </w:p>
         </w:tc>
@@ -12346,7 +12524,7 @@
               <w:rPr>
                 <w:sz w:val="15"/>
               </w:rPr>
-              <w:t>2,49%</w:t>
+              <w:t>1,16%</w:t>
             </w:r>
           </w:p>
         </w:tc>
@@ -12360,7 +12538,7 @@
               <w:rPr>
                 <w:sz w:val="15"/>
               </w:rPr>
-              <w:t>-1,93 pp</w:t>
+              <w:t>-1,18 pp</w:t>
             </w:r>
           </w:p>
         </w:tc>
@@ -12407,7 +12585,7 @@
               <w:rPr>
                 <w:sz w:val="15"/>
               </w:rPr>
-              <w:t>-1.505</w:t>
+              <w:t>-1.021</w:t>
             </w:r>
           </w:p>
         </w:tc>
@@ -12422,7 +12600,7 @@
               <w:rPr>
                 <w:sz w:val="15"/>
               </w:rPr>
-              <w:t>-3,33%</w:t>
+              <w:t>-2,26%</w:t>
             </w:r>
           </w:p>
         </w:tc>
@@ -12452,7 +12630,7 @@
               <w:rPr>
                 <w:sz w:val="15"/>
               </w:rPr>
-              <w:t>-3,27%</w:t>
+              <w:t>-2,21%</w:t>
             </w:r>
           </w:p>
         </w:tc>
@@ -12467,7 +12645,7 @@
               <w:rPr>
                 <w:sz w:val="15"/>
               </w:rPr>
-              <w:t>-0,06 pp</w:t>
+              <w:t>-0,05 pp</w:t>
             </w:r>
           </w:p>
         </w:tc>
@@ -12511,7 +12689,7 @@
               <w:rPr>
                 <w:sz w:val="15"/>
               </w:rPr>
-              <w:t>-707</w:t>
+              <w:t>-713</w:t>
             </w:r>
           </w:p>
         </w:tc>
@@ -12525,7 +12703,7 @@
               <w:rPr>
                 <w:sz w:val="15"/>
               </w:rPr>
-              <w:t>-8,12%</w:t>
+              <w:t>-8,19%</w:t>
             </w:r>
           </w:p>
         </w:tc>
@@ -12553,7 +12731,7 @@
               <w:rPr>
                 <w:sz w:val="15"/>
               </w:rPr>
-              <w:t>-1,33%</w:t>
+              <w:t>-0,59%</w:t>
             </w:r>
           </w:p>
         </w:tc>
@@ -12567,7 +12745,7 @@
               <w:rPr>
                 <w:sz w:val="15"/>
               </w:rPr>
-              <w:t>-6,78 pp</w:t>
+              <w:t>-7,61 pp</w:t>
             </w:r>
           </w:p>
         </w:tc>
@@ -12614,7 +12792,7 @@
               <w:rPr>
                 <w:sz w:val="15"/>
               </w:rPr>
-              <w:t>6</w:t>
+              <w:t>11</w:t>
             </w:r>
           </w:p>
         </w:tc>
@@ -12629,7 +12807,7 @@
               <w:rPr>
                 <w:sz w:val="15"/>
               </w:rPr>
-              <w:t>0,09%</w:t>
+              <w:t>0,16%</w:t>
             </w:r>
           </w:p>
         </w:tc>
@@ -12659,7 +12837,7 @@
               <w:rPr>
                 <w:sz w:val="15"/>
               </w:rPr>
-              <w:t>0,23%</w:t>
+              <w:t>0,30%</w:t>
             </w:r>
           </w:p>
         </w:tc>
@@ -12686,7 +12864,7 @@
           <w:i/>
           <w:sz w:val="16"/>
         </w:rPr>
-        <w:t>Desde el 14-sep hasta el 6-oct (exports de StockTrak). El resultado incluye dividendos y comisiones de USD 10; los benchmarks parten de nuestro precio de entrada (o del cierre del 14-sep) con dividendos reinvertidos. La suma de los resultados cuadra con la pérdida total de la cuenta. Fuente: codigo/analisis_adicional.py.</w:t>
+        <w:t>Desde el 14-sep hasta el 14-oct (exports de StockTrak; benchmarks con el último precio del export). El resultado incluye dividendos y comisiones de USD 10; los benchmarks parten de nuestro precio de entrada (o del cierre del 14-sep) con dividendos reinvertidos. La suma de los resultados cuadra con la pérdida total de la cuenta. Fuente: codigo/analisis_adicional.py.</w:t>
       </w:r>
     </w:p>
     <w:p>
@@ -12694,7 +12872,7 @@
         <w:rPr>
           <w:i w:val="0"/>
         </w:rPr>
-        <w:t>Por clase de activo: la renta fija replica su benchmark, como corresponde a un núcleo pasivo; la renta variable queda 1,9 puntos bajo el S&amp;P 500, en parte por las comisiones (48 operaciones, USD 480) y en parte por el sesgo defensivo de Low-Volatility en un mercado al alza; commodities queda 6,8 puntos bajo su benchmark por la pérdida en USO, ya liquidado.</w:t>
+        <w:t>Por clase de activo: la renta fija replica su benchmark, como corresponde a un núcleo pasivo; la renta variable queda 1,2 puntos bajo el S&amp;P 500, en parte por las comisiones (54 operaciones, USD 540) y en parte por el sesgo defensivo de Low-Volatility en un mercado al alza; commodities queda 7,6 puntos bajo su benchmark por la pérdida en USO, ya liquidado.</w:t>
       </w:r>
     </w:p>
     <w:p>
@@ -12710,7 +12888,7 @@
         <w:rPr>
           <w:i w:val="0"/>
         </w:rPr>
-        <w:t>Entre el 14-sep y el 6-oct la cartera perdió USD 1.718 (-1,15% sobre el capital), mientras el S&amp;P 500 subió 2,5%. La pérdida tiene tres explicaciones, todas medibles:</w:t>
+        <w:t>Entre el 14-sep y el 14-oct la cartera perdió USD 1.734 (-1,16% sobre el capital), mientras el S&amp;P 500 subió 1,2%. La pérdida tiene tres explicaciones, todas medibles:</w:t>
       </w:r>
     </w:p>
     <w:tbl>
@@ -12803,7 +12981,7 @@
               <w:rPr>
                 <w:sz w:val="16"/>
               </w:rPr>
-              <w:t>-1.505</w:t>
+              <w:t>-1.021</w:t>
             </w:r>
           </w:p>
         </w:tc>
@@ -12817,7 +12995,7 @@
               <w:rPr>
                 <w:sz w:val="16"/>
               </w:rPr>
-              <w:t>La tasa a 10 años subió hasta 5,3%, su nivel más alto desde 2002, y los bonos cayeron 3,3%, lo mismo que su índice. No fue un error de ejecución: es el riesgo de duración que asumimos</w:t>
+              <w:t>La tasa a 10 años subió hasta 5,3%, su nivel más alto desde 2002, y los bonos cayeron 2,3%, lo mismo que su índice. No fue un error de ejecución: es el riesgo de duración que asumimos</w:t>
             </w:r>
           </w:p>
         </w:tc>
@@ -12849,7 +13027,7 @@
               <w:rPr>
                 <w:sz w:val="16"/>
               </w:rPr>
-              <w:t>-707</w:t>
+              <w:t>-713</w:t>
             </w:r>
           </w:p>
         </w:tc>
@@ -12864,7 +13042,7 @@
               <w:rPr>
                 <w:sz w:val="16"/>
               </w:rPr>
-              <w:t>USO cayó con el petróleo y se vendió el 2-oct; el sleeve perdió 8,1% frente a 1,3% de DJP</w:t>
+              <w:t>USO cayó con el petróleo y se vendió el 2-oct; el sleeve perdió 8,2% frente a 0,6% de DJP</w:t>
             </w:r>
           </w:p>
         </w:tc>
@@ -12894,7 +13072,7 @@
               <w:rPr>
                 <w:sz w:val="16"/>
               </w:rPr>
-              <w:t>488</w:t>
+              <w:t>-11</w:t>
             </w:r>
           </w:p>
         </w:tc>
@@ -12908,7 +13086,7 @@
               <w:rPr>
                 <w:sz w:val="16"/>
               </w:rPr>
-              <w:t>Ganaron 0,6%, menos que el S&amp;P 500: Low-Volatility es defensiva en un mercado al alza y las comisiones restan</w:t>
+              <w:t>Rindieron -0,0%, menos que el S&amp;P 500 (1,2%): Low-Volatility es defensiva en un mercado al alza y las comisiones restan</w:t>
             </w:r>
           </w:p>
         </w:tc>
@@ -12940,7 +13118,7 @@
               <w:rPr>
                 <w:sz w:val="16"/>
               </w:rPr>
-              <w:t>6</w:t>
+              <w:t>11</w:t>
             </w:r>
           </w:p>
         </w:tc>
@@ -12967,7 +13145,7 @@
           <w:i/>
           <w:sz w:val="16"/>
         </w:rPr>
-        <w:t>Los bloques suman USD -1.718, igual que StockTrak. Incluyen dividendos y comisiones (55 operaciones, USD 550); sin comisiones, la cartera iría -0,8%.</w:t>
+        <w:t>Los bloques suman USD -1.734, igual que StockTrak. Incluyen dividendos y comisiones (62 operaciones, USD 620); sin comisiones, la cartera iría -0,7%.</w:t>
       </w:r>
     </w:p>
     <w:p>

</xml_diff>

<commit_message>
Perfil del inversionista: moderado, con Grable-Lytton (30/47) y Anexo D
Alinea la sección 2.3 con el IPS de la Parte I: disposición moderada
(antes moderada-agresiva), conclusión explícita del perfil, nota sobre el
cuestionario respondido con IA con autorización del profesor, pregunta
anticipada en el Anexo B y respuestas del cuestionario en el Anexo D.

Co-Authored-By: Claude Opus 5.5 <noreply@anthropic.com>
Claude-Session: https://claude.ai/code/session_01T5hAYzxrHpdpyuLVyANGG6
</commit_message>
<xml_diff>
--- a/nexum_proyecto_final/informe/Informe_Final_Nexum.docx
+++ b/nexum_proyecto_final/informe/Informe_Final_Nexum.docx
@@ -506,7 +506,7 @@
         <w:rPr>
           <w:i w:val="0"/>
         </w:rPr>
-        <w:t>María Ignacia (40 años, abogada en consumo masivo) y Tomás (46, ingeniero en software) tienen dos hijos (Vicente, 4; Emilia, 2), ingresos estables y educación financiera media, sin experiencia en derivados ni criptoactivos. El perfil distingue dos dimensiones:</w:t>
+        <w:t>María Ignacia (40 años, abogada en consumo masivo) y Tomás (46, ingeniero en software) tienen dos hijos (Vicente, 4; Emilia, 2), ingresos estables y educación financiera media, sin experiencia en derivados ni criptoactivos. El perfil separa lo que pueden asumir (capacidad) de lo que quieren asumir (disposición) y considera además su capital humano y la aversión al riesgo implícita:</w:t>
       </w:r>
     </w:p>
     <w:tbl>
@@ -645,7 +645,7 @@
               <w:rPr>
                 <w:sz w:val="17"/>
               </w:rPr>
-              <w:t>Toleran hoy 85% en activos de riesgo (cartera AGF) y piden activamente commodities y alternativos</w:t>
+              <w:t>Cuestionario de Grable y Lytton (1999): 30 de 47 puntos. Aceptan riesgo después de informarse y asocian riesgo con oportunidad, pero prefieren una ganancia segura frente a una apuesta y se declaran solo algo cómodos invirtiendo en acciones. Hoy tienen 85% en activos de riesgo en la AGF y piden commodities y alternativos</w:t>
             </w:r>
           </w:p>
         </w:tc>
@@ -660,7 +660,7 @@
               <w:rPr>
                 <w:sz w:val="17"/>
               </w:rPr>
-              <w:t>Moderada-agresiva; renta variable de 60-65%</w:t>
+              <w:t>Moderada: toman riesgo para crecer, sin especular; renta variable de 60-65%</w:t>
             </w:r>
           </w:p>
         </w:tc>
@@ -751,7 +751,7 @@
               <w:rPr>
                 <w:sz w:val="17"/>
               </w:rPr>
-              <w:t>El cliente acepta más riesgo que el inversionista promedio, coherente con su horizonte</w:t>
+              <w:t>La cartera pide algo más de riesgo que el promedio del mercado; lo acotan los límites de volatilidad (10-12%) y de caída (25%)</w:t>
             </w:r>
           </w:p>
         </w:tc>
@@ -761,10 +761,18 @@
     <w:p>
       <w:r>
         <w:rPr>
+          <w:i w:val="0"/>
+        </w:rPr>
+        <w:t>Conclusión: perfil moderado, el mismo del IPS de la Parte I. La capacidad es alta en el largo plazo, pero la acota Educación, un objetivo rígido que empieza en el año 14; la disposición es moderada. El perfil se traduce en 60-65% de renta variable, cerca de 30% de renta fija larga, volatilidad anual de 10-12% y una caída máxima tolerada de 25%.</w:t>
+      </w:r>
+    </w:p>
+    <w:p>
+      <w:r>
+        <w:rPr>
           <w:i/>
           <w:sz w:val="18"/>
         </w:rPr>
-        <w:t>El cuestionario de tolerancia al riesgo (Grable y Lytton) se aplicará directamente a ambos clientes en la reunión de inicio; si su resultado difiere de este perfil, se revisará el IPS. No se usan respuestas simuladas.</w:t>
+        <w:t>El cuestionario de Grable y Lytton (13 preguntas, de 13 a 47 puntos) se respondió con inteligencia artificial a partir del perfil del enunciado, con autorización del profesor, porque los clientes son ficticios. El resultado se contrastó con el cuestionario de perfil de Banchile Inversiones. Con 30 puntos, el puntaje queda en el límite superior de la tolerancia media; como Educación limita la capacidad y los clientes no tienen experiencia en derivados, el perfil final es moderado. Las respuestas están en el Anexo D.</w:t>
       </w:r>
     </w:p>
     <w:p>
@@ -2917,7 +2925,7 @@
         <w:rPr>
           <w:i w:val="0"/>
         </w:rPr>
-        <w:t>Contribución al riesgo: el S&amp;P 500 pesa 37,9% pero aporta 49,5% del riesgo; Momentum pesa 7,1% y aporta 11,9%. Los bonos del Tesoro diversifican: con 16,9% del capital aportan solo 7,4%. El presupuesto de riesgo está dominado por la renta variable, coherente con un perfil moderado-agresivo que necesita prima por riesgo para cumplir sus objetivos.</w:t>
+        <w:t>Contribución al riesgo: el S&amp;P 500 pesa 37,9% pero aporta 49,5% del riesgo; Momentum pesa 7,1% y aporta 11,9%. Los bonos del Tesoro diversifican: con 16,9% del capital aportan solo 7,4%. El presupuesto de riesgo está dominado por la renta variable, coherente con un perfil moderado de horizonte largo que necesita prima por riesgo para cumplir sus objetivos.</w:t>
       </w:r>
     </w:p>
     <w:p>
@@ -14433,6 +14441,20 @@
         <w:rPr>
           <w:b/>
         </w:rPr>
+        <w:t xml:space="preserve">Si el Grable-Lytton da 30 puntos y hoy tienen 85% en riesgo, ¿por qué el perfil es moderado y no agresivo? </w:t>
+      </w:r>
+      <w:r>
+        <w:rPr>
+          <w:i w:val="0"/>
+        </w:rPr>
+        <w:t>Porque el perfil combina disposición y capacidad. El cuestionario muestra disposición a tomar riesgo después de informarse, pero también preferencia por la ganancia segura y poca experiencia en acciones. La capacidad es alta a 50 años, pero Educación es rígida y empieza en el año 14. El 85% de la AGF muestra que soportan volatilidad, pero esa cartera no considera que Educación empieza en el año 14. Por eso recomendamos 60-65% de renta variable, con volatilidad de 10-12%.</w:t>
+      </w:r>
+    </w:p>
+    <w:p>
+      <w:r>
+        <w:rPr>
+          <w:b/>
+        </w:rPr>
         <w:t xml:space="preserve">¿Por qué no usan Markowitz si tiene mayor Sharpe? </w:t>
       </w:r>
       <w:r>
@@ -14504,6 +14526,945 @@
         <w:t>La versión portada de los backtests reproduce exactamente los resultados del modelo anterior (diferencia máxima 10⁻¹⁶) antes de aplicar las correcciones.</w:t>
       </w:r>
     </w:p>
+    <w:p>
+      <w:pPr>
+        <w:pStyle w:val="Heading1"/>
+      </w:pPr>
+      <w:r>
+        <w:t>Anexo D. Cuestionario de Grable y Lytton (1999)</w:t>
+      </w:r>
+    </w:p>
+    <w:p>
+      <w:r>
+        <w:rPr>
+          <w:i w:val="0"/>
+        </w:rPr>
+        <w:t>Respuestas obtenidas con inteligencia artificial a partir del perfil del cliente del enunciado, con autorización del profesor (los clientes son ficticios). Cada pregunta asigna de 1 a 4 puntos; el total va de 13 a 47.</w:t>
+      </w:r>
+    </w:p>
+    <w:tbl>
+      <w:tblPr>
+        <w:tblStyle w:val="TableGrid"/>
+        <w:tblW w:type="auto" w:w="0"/>
+        <w:jc w:val="center"/>
+        <w:tblLook w:firstColumn="1" w:firstRow="1" w:lastColumn="0" w:lastRow="0" w:noHBand="0" w:noVBand="1" w:val="04A0"/>
+      </w:tblPr>
+      <w:tblGrid>
+        <w:gridCol w:w="2408"/>
+        <w:gridCol w:w="2408"/>
+        <w:gridCol w:w="2408"/>
+        <w:gridCol w:w="2408"/>
+      </w:tblGrid>
+      <w:tr>
+        <w:tc>
+          <w:tcPr>
+            <w:tcW w:type="dxa" w:w="567"/>
+            <w:shd w:val="clear" w:color="auto" w:fill="1F3A5F"/>
+          </w:tcPr>
+          <w:p>
+            <w:r/>
+            <w:r>
+              <w:rPr>
+                <w:b/>
+                <w:color w:val="FFFFFF"/>
+                <w:sz w:val="17"/>
+              </w:rPr>
+              <w:t>N°</w:t>
+            </w:r>
+          </w:p>
+        </w:tc>
+        <w:tc>
+          <w:tcPr>
+            <w:tcW w:type="dxa" w:w="3685"/>
+            <w:shd w:val="clear" w:color="auto" w:fill="1F3A5F"/>
+          </w:tcPr>
+          <w:p>
+            <w:r/>
+            <w:r>
+              <w:rPr>
+                <w:b/>
+                <w:color w:val="FFFFFF"/>
+                <w:sz w:val="17"/>
+              </w:rPr>
+              <w:t>Pregunta (resumen)</w:t>
+            </w:r>
+          </w:p>
+        </w:tc>
+        <w:tc>
+          <w:tcPr>
+            <w:tcW w:type="dxa" w:w="3969"/>
+            <w:shd w:val="clear" w:color="auto" w:fill="1F3A5F"/>
+          </w:tcPr>
+          <w:p>
+            <w:r/>
+            <w:r>
+              <w:rPr>
+                <w:b/>
+                <w:color w:val="FFFFFF"/>
+                <w:sz w:val="17"/>
+              </w:rPr>
+              <w:t>Respuesta</w:t>
+            </w:r>
+          </w:p>
+        </w:tc>
+        <w:tc>
+          <w:tcPr>
+            <w:tcW w:type="dxa" w:w="850"/>
+            <w:shd w:val="clear" w:color="auto" w:fill="1F3A5F"/>
+          </w:tcPr>
+          <w:p>
+            <w:r/>
+            <w:r>
+              <w:rPr>
+                <w:b/>
+                <w:color w:val="FFFFFF"/>
+                <w:sz w:val="17"/>
+              </w:rPr>
+              <w:t>Puntos</w:t>
+            </w:r>
+          </w:p>
+        </w:tc>
+      </w:tr>
+      <w:tr>
+        <w:tc>
+          <w:tcPr>
+            <w:tcW w:type="dxa" w:w="567"/>
+          </w:tcPr>
+          <w:p>
+            <w:r/>
+            <w:r>
+              <w:rPr>
+                <w:sz w:val="17"/>
+              </w:rPr>
+              <w:t>1</w:t>
+            </w:r>
+          </w:p>
+        </w:tc>
+        <w:tc>
+          <w:tcPr>
+            <w:tcW w:type="dxa" w:w="3685"/>
+          </w:tcPr>
+          <w:p>
+            <w:r/>
+            <w:r>
+              <w:rPr>
+                <w:sz w:val="17"/>
+              </w:rPr>
+              <w:t>¿Cómo lo describiría su mejor amigo frente al riesgo?</w:t>
+            </w:r>
+          </w:p>
+        </w:tc>
+        <w:tc>
+          <w:tcPr>
+            <w:tcW w:type="dxa" w:w="3969"/>
+          </w:tcPr>
+          <w:p>
+            <w:r/>
+            <w:r>
+              <w:rPr>
+                <w:sz w:val="17"/>
+              </w:rPr>
+              <w:t>Dispuesto a tomar riesgos después de investigar</w:t>
+            </w:r>
+          </w:p>
+        </w:tc>
+        <w:tc>
+          <w:tcPr>
+            <w:tcW w:type="dxa" w:w="850"/>
+          </w:tcPr>
+          <w:p>
+            <w:r/>
+            <w:r>
+              <w:rPr>
+                <w:sz w:val="17"/>
+              </w:rPr>
+              <w:t>3</w:t>
+            </w:r>
+          </w:p>
+        </w:tc>
+      </w:tr>
+      <w:tr>
+        <w:tc>
+          <w:tcPr>
+            <w:tcW w:type="dxa" w:w="567"/>
+            <w:shd w:val="clear" w:color="auto" w:fill="F2F5F9"/>
+          </w:tcPr>
+          <w:p>
+            <w:r/>
+            <w:r>
+              <w:rPr>
+                <w:sz w:val="17"/>
+              </w:rPr>
+              <w:t>2</w:t>
+            </w:r>
+          </w:p>
+        </w:tc>
+        <w:tc>
+          <w:tcPr>
+            <w:tcW w:type="dxa" w:w="3685"/>
+            <w:shd w:val="clear" w:color="auto" w:fill="F2F5F9"/>
+          </w:tcPr>
+          <w:p>
+            <w:r/>
+            <w:r>
+              <w:rPr>
+                <w:sz w:val="17"/>
+              </w:rPr>
+              <w:t>Concurso de televisión: ¿qué premio elige?</w:t>
+            </w:r>
+          </w:p>
+        </w:tc>
+        <w:tc>
+          <w:tcPr>
+            <w:tcW w:type="dxa" w:w="3969"/>
+            <w:shd w:val="clear" w:color="auto" w:fill="F2F5F9"/>
+          </w:tcPr>
+          <w:p>
+            <w:r/>
+            <w:r>
+              <w:rPr>
+                <w:sz w:val="17"/>
+              </w:rPr>
+              <w:t>50% de probabilidad de ganar USD 5.000</w:t>
+            </w:r>
+          </w:p>
+        </w:tc>
+        <w:tc>
+          <w:tcPr>
+            <w:tcW w:type="dxa" w:w="850"/>
+            <w:shd w:val="clear" w:color="auto" w:fill="F2F5F9"/>
+          </w:tcPr>
+          <w:p>
+            <w:r/>
+            <w:r>
+              <w:rPr>
+                <w:sz w:val="17"/>
+              </w:rPr>
+              <w:t>2</w:t>
+            </w:r>
+          </w:p>
+        </w:tc>
+      </w:tr>
+      <w:tr>
+        <w:tc>
+          <w:tcPr>
+            <w:tcW w:type="dxa" w:w="567"/>
+          </w:tcPr>
+          <w:p>
+            <w:r/>
+            <w:r>
+              <w:rPr>
+                <w:sz w:val="17"/>
+              </w:rPr>
+              <w:t>3</w:t>
+            </w:r>
+          </w:p>
+        </w:tc>
+        <w:tc>
+          <w:tcPr>
+            <w:tcW w:type="dxa" w:w="3685"/>
+          </w:tcPr>
+          <w:p>
+            <w:r/>
+            <w:r>
+              <w:rPr>
+                <w:sz w:val="17"/>
+              </w:rPr>
+              <w:t>Pierde el trabajo tres semanas antes de unas vacaciones soñadas</w:t>
+            </w:r>
+          </w:p>
+        </w:tc>
+        <w:tc>
+          <w:tcPr>
+            <w:tcW w:type="dxa" w:w="3969"/>
+          </w:tcPr>
+          <w:p>
+            <w:r/>
+            <w:r>
+              <w:rPr>
+                <w:sz w:val="17"/>
+              </w:rPr>
+              <w:t>Toma unas vacaciones mucho más modestas</w:t>
+            </w:r>
+          </w:p>
+        </w:tc>
+        <w:tc>
+          <w:tcPr>
+            <w:tcW w:type="dxa" w:w="850"/>
+          </w:tcPr>
+          <w:p>
+            <w:r/>
+            <w:r>
+              <w:rPr>
+                <w:sz w:val="17"/>
+              </w:rPr>
+              <w:t>2</w:t>
+            </w:r>
+          </w:p>
+        </w:tc>
+      </w:tr>
+      <w:tr>
+        <w:tc>
+          <w:tcPr>
+            <w:tcW w:type="dxa" w:w="567"/>
+            <w:shd w:val="clear" w:color="auto" w:fill="F2F5F9"/>
+          </w:tcPr>
+          <w:p>
+            <w:r/>
+            <w:r>
+              <w:rPr>
+                <w:sz w:val="17"/>
+              </w:rPr>
+              <w:t>4</w:t>
+            </w:r>
+          </w:p>
+        </w:tc>
+        <w:tc>
+          <w:tcPr>
+            <w:tcW w:type="dxa" w:w="3685"/>
+            <w:shd w:val="clear" w:color="auto" w:fill="F2F5F9"/>
+          </w:tcPr>
+          <w:p>
+            <w:r/>
+            <w:r>
+              <w:rPr>
+                <w:sz w:val="17"/>
+              </w:rPr>
+              <w:t>Recibe USD 20.000 inesperados para invertir</w:t>
+            </w:r>
+          </w:p>
+        </w:tc>
+        <w:tc>
+          <w:tcPr>
+            <w:tcW w:type="dxa" w:w="3969"/>
+            <w:shd w:val="clear" w:color="auto" w:fill="F2F5F9"/>
+          </w:tcPr>
+          <w:p>
+            <w:r/>
+            <w:r>
+              <w:rPr>
+                <w:sz w:val="17"/>
+              </w:rPr>
+              <w:t>Acciones o fondos de acciones</w:t>
+            </w:r>
+          </w:p>
+        </w:tc>
+        <w:tc>
+          <w:tcPr>
+            <w:tcW w:type="dxa" w:w="850"/>
+            <w:shd w:val="clear" w:color="auto" w:fill="F2F5F9"/>
+          </w:tcPr>
+          <w:p>
+            <w:r/>
+            <w:r>
+              <w:rPr>
+                <w:sz w:val="17"/>
+              </w:rPr>
+              <w:t>3</w:t>
+            </w:r>
+          </w:p>
+        </w:tc>
+      </w:tr>
+      <w:tr>
+        <w:tc>
+          <w:tcPr>
+            <w:tcW w:type="dxa" w:w="567"/>
+          </w:tcPr>
+          <w:p>
+            <w:r/>
+            <w:r>
+              <w:rPr>
+                <w:sz w:val="17"/>
+              </w:rPr>
+              <w:t>5</w:t>
+            </w:r>
+          </w:p>
+        </w:tc>
+        <w:tc>
+          <w:tcPr>
+            <w:tcW w:type="dxa" w:w="3685"/>
+          </w:tcPr>
+          <w:p>
+            <w:r/>
+            <w:r>
+              <w:rPr>
+                <w:sz w:val="17"/>
+              </w:rPr>
+              <w:t>¿Qué tan cómodo se siente invirtiendo en acciones?</w:t>
+            </w:r>
+          </w:p>
+        </w:tc>
+        <w:tc>
+          <w:tcPr>
+            <w:tcW w:type="dxa" w:w="3969"/>
+          </w:tcPr>
+          <w:p>
+            <w:r/>
+            <w:r>
+              <w:rPr>
+                <w:sz w:val="17"/>
+              </w:rPr>
+              <w:t>Algo cómodo</w:t>
+            </w:r>
+          </w:p>
+        </w:tc>
+        <w:tc>
+          <w:tcPr>
+            <w:tcW w:type="dxa" w:w="850"/>
+          </w:tcPr>
+          <w:p>
+            <w:r/>
+            <w:r>
+              <w:rPr>
+                <w:sz w:val="17"/>
+              </w:rPr>
+              <w:t>2</w:t>
+            </w:r>
+          </w:p>
+        </w:tc>
+      </w:tr>
+      <w:tr>
+        <w:tc>
+          <w:tcPr>
+            <w:tcW w:type="dxa" w:w="567"/>
+            <w:shd w:val="clear" w:color="auto" w:fill="F2F5F9"/>
+          </w:tcPr>
+          <w:p>
+            <w:r/>
+            <w:r>
+              <w:rPr>
+                <w:sz w:val="17"/>
+              </w:rPr>
+              <w:t>6</w:t>
+            </w:r>
+          </w:p>
+        </w:tc>
+        <w:tc>
+          <w:tcPr>
+            <w:tcW w:type="dxa" w:w="3685"/>
+            <w:shd w:val="clear" w:color="auto" w:fill="F2F5F9"/>
+          </w:tcPr>
+          <w:p>
+            <w:r/>
+            <w:r>
+              <w:rPr>
+                <w:sz w:val="17"/>
+              </w:rPr>
+              <w:t>¿Qué palabra asocia primero con "riesgo"?</w:t>
+            </w:r>
+          </w:p>
+        </w:tc>
+        <w:tc>
+          <w:tcPr>
+            <w:tcW w:type="dxa" w:w="3969"/>
+            <w:shd w:val="clear" w:color="auto" w:fill="F2F5F9"/>
+          </w:tcPr>
+          <w:p>
+            <w:r/>
+            <w:r>
+              <w:rPr>
+                <w:sz w:val="17"/>
+              </w:rPr>
+              <w:t>Oportunidad</w:t>
+            </w:r>
+          </w:p>
+        </w:tc>
+        <w:tc>
+          <w:tcPr>
+            <w:tcW w:type="dxa" w:w="850"/>
+            <w:shd w:val="clear" w:color="auto" w:fill="F2F5F9"/>
+          </w:tcPr>
+          <w:p>
+            <w:r/>
+            <w:r>
+              <w:rPr>
+                <w:sz w:val="17"/>
+              </w:rPr>
+              <w:t>3</w:t>
+            </w:r>
+          </w:p>
+        </w:tc>
+      </w:tr>
+      <w:tr>
+        <w:tc>
+          <w:tcPr>
+            <w:tcW w:type="dxa" w:w="567"/>
+          </w:tcPr>
+          <w:p>
+            <w:r/>
+            <w:r>
+              <w:rPr>
+                <w:sz w:val="17"/>
+              </w:rPr>
+              <w:t>7</w:t>
+            </w:r>
+          </w:p>
+        </w:tc>
+        <w:tc>
+          <w:tcPr>
+            <w:tcW w:type="dxa" w:w="3685"/>
+          </w:tcPr>
+          <w:p>
+            <w:r/>
+            <w:r>
+              <w:rPr>
+                <w:sz w:val="17"/>
+              </w:rPr>
+              <w:t>Se espera que suban los activos reales y caigan los bonos; usted tiene bonos</w:t>
+            </w:r>
+          </w:p>
+        </w:tc>
+        <w:tc>
+          <w:tcPr>
+            <w:tcW w:type="dxa" w:w="3969"/>
+          </w:tcPr>
+          <w:p>
+            <w:r/>
+            <w:r>
+              <w:rPr>
+                <w:sz w:val="17"/>
+              </w:rPr>
+              <w:t>Vende los bonos: mitad a money market y mitad a activos reales</w:t>
+            </w:r>
+          </w:p>
+        </w:tc>
+        <w:tc>
+          <w:tcPr>
+            <w:tcW w:type="dxa" w:w="850"/>
+          </w:tcPr>
+          <w:p>
+            <w:r/>
+            <w:r>
+              <w:rPr>
+                <w:sz w:val="17"/>
+              </w:rPr>
+              <w:t>2</w:t>
+            </w:r>
+          </w:p>
+        </w:tc>
+      </w:tr>
+      <w:tr>
+        <w:tc>
+          <w:tcPr>
+            <w:tcW w:type="dxa" w:w="567"/>
+            <w:shd w:val="clear" w:color="auto" w:fill="F2F5F9"/>
+          </w:tcPr>
+          <w:p>
+            <w:r/>
+            <w:r>
+              <w:rPr>
+                <w:sz w:val="17"/>
+              </w:rPr>
+              <w:t>8</w:t>
+            </w:r>
+          </w:p>
+        </w:tc>
+        <w:tc>
+          <w:tcPr>
+            <w:tcW w:type="dxa" w:w="3685"/>
+            <w:shd w:val="clear" w:color="auto" w:fill="F2F5F9"/>
+          </w:tcPr>
+          <w:p>
+            <w:r/>
+            <w:r>
+              <w:rPr>
+                <w:sz w:val="17"/>
+              </w:rPr>
+              <w:t>Elija entre cuatro inversiones según su mejor y peor resultado</w:t>
+            </w:r>
+          </w:p>
+        </w:tc>
+        <w:tc>
+          <w:tcPr>
+            <w:tcW w:type="dxa" w:w="3969"/>
+            <w:shd w:val="clear" w:color="auto" w:fill="F2F5F9"/>
+          </w:tcPr>
+          <w:p>
+            <w:r/>
+            <w:r>
+              <w:rPr>
+                <w:sz w:val="17"/>
+              </w:rPr>
+              <w:t>Ganancia de USD 2.600 en el mejor caso; pérdida de USD 800 en el peor</w:t>
+            </w:r>
+          </w:p>
+        </w:tc>
+        <w:tc>
+          <w:tcPr>
+            <w:tcW w:type="dxa" w:w="850"/>
+            <w:shd w:val="clear" w:color="auto" w:fill="F2F5F9"/>
+          </w:tcPr>
+          <w:p>
+            <w:r/>
+            <w:r>
+              <w:rPr>
+                <w:sz w:val="17"/>
+              </w:rPr>
+              <w:t>3</w:t>
+            </w:r>
+          </w:p>
+        </w:tc>
+      </w:tr>
+      <w:tr>
+        <w:tc>
+          <w:tcPr>
+            <w:tcW w:type="dxa" w:w="567"/>
+          </w:tcPr>
+          <w:p>
+            <w:r/>
+            <w:r>
+              <w:rPr>
+                <w:sz w:val="17"/>
+              </w:rPr>
+              <w:t>9</w:t>
+            </w:r>
+          </w:p>
+        </w:tc>
+        <w:tc>
+          <w:tcPr>
+            <w:tcW w:type="dxa" w:w="3685"/>
+          </w:tcPr>
+          <w:p>
+            <w:r/>
+            <w:r>
+              <w:rPr>
+                <w:sz w:val="17"/>
+              </w:rPr>
+              <w:t>Le dan USD 1.000: ¿ganancia segura o apuesta?</w:t>
+            </w:r>
+          </w:p>
+        </w:tc>
+        <w:tc>
+          <w:tcPr>
+            <w:tcW w:type="dxa" w:w="3969"/>
+          </w:tcPr>
+          <w:p>
+            <w:r/>
+            <w:r>
+              <w:rPr>
+                <w:sz w:val="17"/>
+              </w:rPr>
+              <w:t>Ganancia segura de USD 500</w:t>
+            </w:r>
+          </w:p>
+        </w:tc>
+        <w:tc>
+          <w:tcPr>
+            <w:tcW w:type="dxa" w:w="850"/>
+          </w:tcPr>
+          <w:p>
+            <w:r/>
+            <w:r>
+              <w:rPr>
+                <w:sz w:val="17"/>
+              </w:rPr>
+              <w:t>1</w:t>
+            </w:r>
+          </w:p>
+        </w:tc>
+      </w:tr>
+      <w:tr>
+        <w:tc>
+          <w:tcPr>
+            <w:tcW w:type="dxa" w:w="567"/>
+            <w:shd w:val="clear" w:color="auto" w:fill="F2F5F9"/>
+          </w:tcPr>
+          <w:p>
+            <w:r/>
+            <w:r>
+              <w:rPr>
+                <w:sz w:val="17"/>
+              </w:rPr>
+              <w:t>10</w:t>
+            </w:r>
+          </w:p>
+        </w:tc>
+        <w:tc>
+          <w:tcPr>
+            <w:tcW w:type="dxa" w:w="3685"/>
+            <w:shd w:val="clear" w:color="auto" w:fill="F2F5F9"/>
+          </w:tcPr>
+          <w:p>
+            <w:r/>
+            <w:r>
+              <w:rPr>
+                <w:sz w:val="17"/>
+              </w:rPr>
+              <w:t>Le dan USD 2.000: ¿pérdida segura o apuesta?</w:t>
+            </w:r>
+          </w:p>
+        </w:tc>
+        <w:tc>
+          <w:tcPr>
+            <w:tcW w:type="dxa" w:w="3969"/>
+            <w:shd w:val="clear" w:color="auto" w:fill="F2F5F9"/>
+          </w:tcPr>
+          <w:p>
+            <w:r/>
+            <w:r>
+              <w:rPr>
+                <w:sz w:val="17"/>
+              </w:rPr>
+              <w:t>50% de perder USD 1.000 y 50% de no perder nada</w:t>
+            </w:r>
+          </w:p>
+        </w:tc>
+        <w:tc>
+          <w:tcPr>
+            <w:tcW w:type="dxa" w:w="850"/>
+            <w:shd w:val="clear" w:color="auto" w:fill="F2F5F9"/>
+          </w:tcPr>
+          <w:p>
+            <w:r/>
+            <w:r>
+              <w:rPr>
+                <w:sz w:val="17"/>
+              </w:rPr>
+              <w:t>3</w:t>
+            </w:r>
+          </w:p>
+        </w:tc>
+      </w:tr>
+      <w:tr>
+        <w:tc>
+          <w:tcPr>
+            <w:tcW w:type="dxa" w:w="567"/>
+          </w:tcPr>
+          <w:p>
+            <w:r/>
+            <w:r>
+              <w:rPr>
+                <w:sz w:val="17"/>
+              </w:rPr>
+              <w:t>11</w:t>
+            </w:r>
+          </w:p>
+        </w:tc>
+        <w:tc>
+          <w:tcPr>
+            <w:tcW w:type="dxa" w:w="3685"/>
+          </w:tcPr>
+          <w:p>
+            <w:r/>
+            <w:r>
+              <w:rPr>
+                <w:sz w:val="17"/>
+              </w:rPr>
+              <w:t>Hereda USD 100.000 y debe ponerlos en una sola alternativa</w:t>
+            </w:r>
+          </w:p>
+        </w:tc>
+        <w:tc>
+          <w:tcPr>
+            <w:tcW w:type="dxa" w:w="3969"/>
+          </w:tcPr>
+          <w:p>
+            <w:r/>
+            <w:r>
+              <w:rPr>
+                <w:sz w:val="17"/>
+              </w:rPr>
+              <w:t>Fondo mutuo de acciones y bonos</w:t>
+            </w:r>
+          </w:p>
+        </w:tc>
+        <w:tc>
+          <w:tcPr>
+            <w:tcW w:type="dxa" w:w="850"/>
+          </w:tcPr>
+          <w:p>
+            <w:r/>
+            <w:r>
+              <w:rPr>
+                <w:sz w:val="17"/>
+              </w:rPr>
+              <w:t>2</w:t>
+            </w:r>
+          </w:p>
+        </w:tc>
+      </w:tr>
+      <w:tr>
+        <w:tc>
+          <w:tcPr>
+            <w:tcW w:type="dxa" w:w="567"/>
+            <w:shd w:val="clear" w:color="auto" w:fill="F2F5F9"/>
+          </w:tcPr>
+          <w:p>
+            <w:r/>
+            <w:r>
+              <w:rPr>
+                <w:sz w:val="17"/>
+              </w:rPr>
+              <w:t>12</w:t>
+            </w:r>
+          </w:p>
+        </w:tc>
+        <w:tc>
+          <w:tcPr>
+            <w:tcW w:type="dxa" w:w="3685"/>
+            <w:shd w:val="clear" w:color="auto" w:fill="F2F5F9"/>
+          </w:tcPr>
+          <w:p>
+            <w:r/>
+            <w:r>
+              <w:rPr>
+                <w:sz w:val="17"/>
+              </w:rPr>
+              <w:t>¿Cómo invertiría USD 20.000?</w:t>
+            </w:r>
+          </w:p>
+        </w:tc>
+        <w:tc>
+          <w:tcPr>
+            <w:tcW w:type="dxa" w:w="3969"/>
+            <w:shd w:val="clear" w:color="auto" w:fill="F2F5F9"/>
+          </w:tcPr>
+          <w:p>
+            <w:r/>
+            <w:r>
+              <w:rPr>
+                <w:sz w:val="17"/>
+              </w:rPr>
+              <w:t>30% bajo riesgo, 40% riesgo medio y 30% alto riesgo</w:t>
+            </w:r>
+          </w:p>
+        </w:tc>
+        <w:tc>
+          <w:tcPr>
+            <w:tcW w:type="dxa" w:w="850"/>
+            <w:shd w:val="clear" w:color="auto" w:fill="F2F5F9"/>
+          </w:tcPr>
+          <w:p>
+            <w:r/>
+            <w:r>
+              <w:rPr>
+                <w:sz w:val="17"/>
+              </w:rPr>
+              <w:t>2</w:t>
+            </w:r>
+          </w:p>
+        </w:tc>
+      </w:tr>
+      <w:tr>
+        <w:tc>
+          <w:tcPr>
+            <w:tcW w:type="dxa" w:w="567"/>
+          </w:tcPr>
+          <w:p>
+            <w:r/>
+            <w:r>
+              <w:rPr>
+                <w:sz w:val="17"/>
+              </w:rPr>
+              <w:t>13</w:t>
+            </w:r>
+          </w:p>
+        </w:tc>
+        <w:tc>
+          <w:tcPr>
+            <w:tcW w:type="dxa" w:w="3685"/>
+          </w:tcPr>
+          <w:p>
+            <w:r/>
+            <w:r>
+              <w:rPr>
+                <w:sz w:val="17"/>
+              </w:rPr>
+              <w:t>Mina de oro con 20% de éxito que paga 50 a 100 veces</w:t>
+            </w:r>
+          </w:p>
+        </w:tc>
+        <w:tc>
+          <w:tcPr>
+            <w:tcW w:type="dxa" w:w="3969"/>
+          </w:tcPr>
+          <w:p>
+            <w:r/>
+            <w:r>
+              <w:rPr>
+                <w:sz w:val="17"/>
+              </w:rPr>
+              <w:t>Un mes de sueldo</w:t>
+            </w:r>
+          </w:p>
+        </w:tc>
+        <w:tc>
+          <w:tcPr>
+            <w:tcW w:type="dxa" w:w="850"/>
+          </w:tcPr>
+          <w:p>
+            <w:r/>
+            <w:r>
+              <w:rPr>
+                <w:sz w:val="17"/>
+              </w:rPr>
+              <w:t>2</w:t>
+            </w:r>
+          </w:p>
+        </w:tc>
+      </w:tr>
+      <w:tr>
+        <w:tc>
+          <w:tcPr>
+            <w:tcW w:type="dxa" w:w="567"/>
+            <w:shd w:val="clear" w:color="auto" w:fill="F2F5F9"/>
+          </w:tcPr>
+          <w:p>
+            <w:r/>
+            <w:r>
+              <w:rPr>
+                <w:sz w:val="17"/>
+              </w:rPr>
+            </w:r>
+          </w:p>
+        </w:tc>
+        <w:tc>
+          <w:tcPr>
+            <w:tcW w:type="dxa" w:w="3685"/>
+            <w:shd w:val="clear" w:color="auto" w:fill="F2F5F9"/>
+          </w:tcPr>
+          <w:p>
+            <w:r/>
+            <w:r>
+              <w:rPr>
+                <w:sz w:val="17"/>
+              </w:rPr>
+              <w:t>Total</w:t>
+            </w:r>
+          </w:p>
+        </w:tc>
+        <w:tc>
+          <w:tcPr>
+            <w:tcW w:type="dxa" w:w="3969"/>
+            <w:shd w:val="clear" w:color="auto" w:fill="F2F5F9"/>
+          </w:tcPr>
+          <w:p>
+            <w:r/>
+            <w:r>
+              <w:rPr>
+                <w:sz w:val="17"/>
+              </w:rPr>
+            </w:r>
+          </w:p>
+        </w:tc>
+        <w:tc>
+          <w:tcPr>
+            <w:tcW w:type="dxa" w:w="850"/>
+            <w:shd w:val="clear" w:color="auto" w:fill="F2F5F9"/>
+          </w:tcPr>
+          <w:p>
+            <w:r/>
+            <w:r>
+              <w:rPr>
+                <w:sz w:val="17"/>
+              </w:rPr>
+              <w:t>30</w:t>
+            </w:r>
+          </w:p>
+        </w:tc>
+      </w:tr>
+    </w:tbl>
+    <w:p/>
     <w:sectPr>
       <w:pgSz w:w="12240" w:h="15840"/>
       <w:pgMar w:top="1134" w:right="1304" w:bottom="1134" w:left="1304" w:header="720" w:footer="720" w:gutter="0"/>

</xml_diff>

<commit_message>
Agrega fichas de Quantpedia de momentum (acciones y commodities) a 3.2 y referencias
Co-Authored-By: Claude Opus 5.5 <noreply@anthropic.com>
Claude-Session: https://claude.ai/code/session_01T5hAYzxrHpdpyuLVyANGG6
</commit_message>
<xml_diff>
--- a/nexum_proyecto_final/informe/Informe_Final_Nexum.docx
+++ b/nexum_proyecto_final/informe/Informe_Final_Nexum.docx
@@ -3534,7 +3534,7 @@
               <w:rPr>
                 <w:sz w:val="16"/>
               </w:rPr>
-              <w:t>Jegadeesh y Titman (1993); Carhart (1997); Asness, Moskowitz y Pedersen (2013)</w:t>
+              <w:t>Jegadeesh y Titman (1993); Carhart (1997); Asness, Moskowitz y Pedersen (2013); ficha en Quantpedia (s. f.-b)</w:t>
             </w:r>
           </w:p>
         </w:tc>
@@ -3654,7 +3654,7 @@
               <w:rPr>
                 <w:sz w:val="16"/>
               </w:rPr>
-              <w:t>Erb y Harvey (2006); Miffre y Rallis (2007); Moskowitz, Ooi y Pedersen (2012)</w:t>
+              <w:t>Erb y Harvey (2006); Miffre y Rallis (2007); Moskowitz, Ooi y Pedersen (2012); ficha en Quantpedia (s. f.-a)</w:t>
             </w:r>
           </w:p>
         </w:tc>
@@ -13832,6 +13832,28 @@
           <w:sz w:val="17"/>
         </w:rPr>
         <w:t>McLean, R. y Pontiff, J. (2016). Does Academic Research Destroy Stock Return Predictability? Journal of Finance, 71(1), 5-32.</w:t>
+      </w:r>
+    </w:p>
+    <w:p>
+      <w:pPr>
+        <w:ind w:left="340" w:hanging="340"/>
+      </w:pPr>
+      <w:r>
+        <w:rPr>
+          <w:sz w:val="17"/>
+        </w:rPr>
+        <w:t>Quantpedia. (s. f.-a). Momentum Effect in Commodities. https://quantpedia.com/strategies/momentum-effect-in-commodities</w:t>
+      </w:r>
+    </w:p>
+    <w:p>
+      <w:pPr>
+        <w:ind w:left="340" w:hanging="340"/>
+      </w:pPr>
+      <w:r>
+        <w:rPr>
+          <w:sz w:val="17"/>
+        </w:rPr>
+        <w:t>Quantpedia. (s. f.-b). Momentum Factor Effect in Stocks. https://quantpedia.com/strategies/momentum-factor-effect-in-stocks</w:t>
       </w:r>
     </w:p>
     <w:p>

</xml_diff>

<commit_message>
Corrige cierre de la lista de referencias
Co-Authored-By: Claude Opus 5.5 <noreply@anthropic.com>
Claude-Session: https://claude.ai/code/session_01T5hAYzxrHpdpyuLVyANGG6
</commit_message>
<xml_diff>
--- a/nexum_proyecto_final/informe/Informe_Final_Nexum.docx
+++ b/nexum_proyecto_final/informe/Informe_Final_Nexum.docx
@@ -13842,6 +13842,28 @@
         <w:rPr>
           <w:sz w:val="17"/>
         </w:rPr>
+        <w:t>Miffre, J. y Rallis, G. (2007). Momentum Strategies in Commodity Futures Markets. Journal of Banking &amp; Finance, 31(6), 1863-1886.</w:t>
+      </w:r>
+    </w:p>
+    <w:p>
+      <w:pPr>
+        <w:ind w:left="340" w:hanging="340"/>
+      </w:pPr>
+      <w:r>
+        <w:rPr>
+          <w:sz w:val="17"/>
+        </w:rPr>
+        <w:t>Moskowitz, T., Ooi, Y. y Pedersen, L. (2012). Time Series Momentum. Journal of Financial Economics, 104(2), 228-250.</w:t>
+      </w:r>
+    </w:p>
+    <w:p>
+      <w:pPr>
+        <w:ind w:left="340" w:hanging="340"/>
+      </w:pPr>
+      <w:r>
+        <w:rPr>
+          <w:sz w:val="17"/>
+        </w:rPr>
         <w:t>Quantpedia. (s. f.-a). Momentum Effect in Commodities. https://quantpedia.com/strategies/momentum-effect-in-commodities</w:t>
       </w:r>
     </w:p>
@@ -13854,28 +13876,6 @@
           <w:sz w:val="17"/>
         </w:rPr>
         <w:t>Quantpedia. (s. f.-b). Momentum Factor Effect in Stocks. https://quantpedia.com/strategies/momentum-factor-effect-in-stocks</w:t>
-      </w:r>
-    </w:p>
-    <w:p>
-      <w:pPr>
-        <w:ind w:left="340" w:hanging="340"/>
-      </w:pPr>
-      <w:r>
-        <w:rPr>
-          <w:sz w:val="17"/>
-        </w:rPr>
-        <w:t>Miffre, J. y Rallis, G. (2007). Momentum Strategies in Commodity Futures Markets. Journal of Banking &amp; Finance, 31(6), 1863-1886.</w:t>
-      </w:r>
-    </w:p>
-    <w:p>
-      <w:pPr>
-        <w:ind w:left="340" w:hanging="340"/>
-      </w:pPr>
-      <w:r>
-        <w:rPr>
-          <w:sz w:val="17"/>
-        </w:rPr>
-        <w:t>Moskowitz, T., Ooi, Y. y Pedersen, L. (2012). Time Series Momentum. Journal of Financial Economics, 104(2), 228-250.</w:t>
       </w:r>
     </w:p>
     <w:p>

</xml_diff>

<commit_message>
Agrega política de cobertura cambiaria por meta con forward renovado
Sección 3.4: cobertura según horizonte de cada meta, costos y riesgos
del roll-over, límite (inflación chilena) y swap CLF/USD como mejora
para la próxima revisión del IPS. Nueva pregunta en el Anexo B y
referencias de cobertura cambiaria.

Co-Authored-By: Claude Opus 5.5 <noreply@anthropic.com>
Claude-Session: https://claude.ai/code/session_01T5hAYzxrHpdpyuLVyANGG6
</commit_message>
<xml_diff>
--- a/nexum_proyecto_final/informe/Informe_Final_Nexum.docx
+++ b/nexum_proyecto_final/informe/Informe_Final_Nexum.docx
@@ -6076,6 +6076,389 @@
     </w:p>
     <w:p>
       <w:pPr>
+        <w:pStyle w:val="Heading3"/>
+      </w:pPr>
+      <w:r>
+        <w:t>Política de cobertura por meta</w:t>
+      </w:r>
+    </w:p>
+    <w:p>
+      <w:r>
+        <w:rPr>
+          <w:i w:val="0"/>
+        </w:rPr>
+        <w:t>La cobertura se define por meta, siguiendo la lógica de calce de activos y obligaciones (Sharpe y Tint, 1990): cuánto se cubre depende de la moneda y de la cercanía de cada pago. Como toda la gestión se hace en StockTrak, que solo opera instrumentos en USD, la herramienta es el forward USD/CLP renovado al vencer cada contrato (roll-over). Lo que se paga en el contrato cuando el dólar sube no es una pérdida neta, porque los activos en USD valen más en pesos. El riesgo cambiario está incluido en la simulación: medido en UF, la probabilidad prospectiva de cumplir los tres objetivos es 45,3%, frente a 46,5% en USD.</w:t>
+      </w:r>
+    </w:p>
+    <w:tbl>
+      <w:tblPr>
+        <w:tblStyle w:val="TableGrid"/>
+        <w:tblW w:type="auto" w:w="0"/>
+        <w:jc w:val="center"/>
+        <w:tblLook w:firstColumn="1" w:firstRow="1" w:lastColumn="0" w:lastRow="0" w:noHBand="0" w:noVBand="1" w:val="04A0"/>
+      </w:tblPr>
+      <w:tblGrid>
+        <w:gridCol w:w="2408"/>
+        <w:gridCol w:w="2408"/>
+        <w:gridCol w:w="2408"/>
+        <w:gridCol w:w="2408"/>
+      </w:tblGrid>
+      <w:tr>
+        <w:tc>
+          <w:tcPr>
+            <w:tcW w:type="dxa" w:w="1928"/>
+            <w:shd w:val="clear" w:color="auto" w:fill="1F3A5F"/>
+          </w:tcPr>
+          <w:p>
+            <w:r/>
+            <w:r>
+              <w:rPr>
+                <w:b/>
+                <w:color w:val="FFFFFF"/>
+                <w:sz w:val="17"/>
+              </w:rPr>
+              <w:t>Meta</w:t>
+            </w:r>
+          </w:p>
+        </w:tc>
+        <w:tc>
+          <w:tcPr>
+            <w:tcW w:type="dxa" w:w="1134"/>
+            <w:shd w:val="clear" w:color="auto" w:fill="1F3A5F"/>
+          </w:tcPr>
+          <w:p>
+            <w:r/>
+            <w:r>
+              <w:rPr>
+                <w:b/>
+                <w:color w:val="FFFFFF"/>
+                <w:sz w:val="17"/>
+              </w:rPr>
+              <w:t>Horizonte</w:t>
+            </w:r>
+          </w:p>
+        </w:tc>
+        <w:tc>
+          <w:tcPr>
+            <w:tcW w:type="dxa" w:w="2608"/>
+            <w:shd w:val="clear" w:color="auto" w:fill="1F3A5F"/>
+          </w:tcPr>
+          <w:p>
+            <w:r/>
+            <w:r>
+              <w:rPr>
+                <w:b/>
+                <w:color w:val="FFFFFF"/>
+                <w:sz w:val="17"/>
+              </w:rPr>
+              <w:t>Cobertura con forward USD/CLP renovado</w:t>
+            </w:r>
+          </w:p>
+        </w:tc>
+        <w:tc>
+          <w:tcPr>
+            <w:tcW w:type="dxa" w:w="3402"/>
+            <w:shd w:val="clear" w:color="auto" w:fill="1F3A5F"/>
+          </w:tcPr>
+          <w:p>
+            <w:r/>
+            <w:r>
+              <w:rPr>
+                <w:b/>
+                <w:color w:val="FFFFFF"/>
+                <w:sz w:val="17"/>
+              </w:rPr>
+              <w:t>Fundamento</w:t>
+            </w:r>
+          </w:p>
+        </w:tc>
+      </w:tr>
+      <w:tr>
+        <w:tc>
+          <w:tcPr>
+            <w:tcW w:type="dxa" w:w="1928"/>
+          </w:tcPr>
+          <w:p>
+            <w:r/>
+            <w:r>
+              <w:rPr>
+                <w:sz w:val="17"/>
+              </w:rPr>
+              <w:t>Valor total de la cartera (hoy)</w:t>
+            </w:r>
+          </w:p>
+        </w:tc>
+        <w:tc>
+          <w:tcPr>
+            <w:tcW w:type="dxa" w:w="1134"/>
+          </w:tcPr>
+          <w:p>
+            <w:r/>
+            <w:r>
+              <w:rPr>
+                <w:sz w:val="17"/>
+              </w:rPr>
+              <w:t>Años 1-10</w:t>
+            </w:r>
+          </w:p>
+        </w:tc>
+        <w:tc>
+          <w:tcPr>
+            <w:tcW w:type="dxa" w:w="2608"/>
+          </w:tcPr>
+          <w:p>
+            <w:r/>
+            <w:r>
+              <w:rPr>
+                <w:sz w:val="17"/>
+              </w:rPr>
+              <w:t>~70% (rango 50-75%), renovado cada año</w:t>
+            </w:r>
+          </w:p>
+        </w:tc>
+        <w:tc>
+          <w:tcPr>
+            <w:tcW w:type="dxa" w:w="3402"/>
+          </w:tcPr>
+          <w:p>
+            <w:r/>
+            <w:r>
+              <w:rPr>
+                <w:sz w:val="17"/>
+              </w:rPr>
+              <w:t>El dólar sube cuando caen las bolsas; la parte no cubierta amortigua las caídas en pesos (Campbell, Serfaty-de Medeiros y Viceira, 2010)</w:t>
+            </w:r>
+          </w:p>
+        </w:tc>
+      </w:tr>
+      <w:tr>
+        <w:tc>
+          <w:tcPr>
+            <w:tcW w:type="dxa" w:w="1928"/>
+            <w:shd w:val="clear" w:color="auto" w:fill="F2F5F9"/>
+          </w:tcPr>
+          <w:p>
+            <w:r/>
+            <w:r>
+              <w:rPr>
+                <w:sz w:val="17"/>
+              </w:rPr>
+              <w:t>Educación</w:t>
+            </w:r>
+          </w:p>
+        </w:tc>
+        <w:tc>
+          <w:tcPr>
+            <w:tcW w:type="dxa" w:w="1134"/>
+            <w:shd w:val="clear" w:color="auto" w:fill="F2F5F9"/>
+          </w:tcPr>
+          <w:p>
+            <w:r/>
+            <w:r>
+              <w:rPr>
+                <w:sz w:val="17"/>
+              </w:rPr>
+              <w:t>Años 14-20</w:t>
+            </w:r>
+          </w:p>
+        </w:tc>
+        <w:tc>
+          <w:tcPr>
+            <w:tcW w:type="dxa" w:w="2608"/>
+            <w:shd w:val="clear" w:color="auto" w:fill="F2F5F9"/>
+          </w:tcPr>
+          <w:p>
+            <w:r/>
+            <w:r>
+              <w:rPr>
+                <w:sz w:val="17"/>
+              </w:rPr>
+              <w:t>100% del valor presente de cada pago desde 3 años antes</w:t>
+            </w:r>
+          </w:p>
+        </w:tc>
+        <w:tc>
+          <w:tcPr>
+            <w:tcW w:type="dxa" w:w="3402"/>
+            <w:shd w:val="clear" w:color="auto" w:fill="F2F5F9"/>
+          </w:tcPr>
+          <w:p>
+            <w:r/>
+            <w:r>
+              <w:rPr>
+                <w:sz w:val="17"/>
+              </w:rPr>
+              <w:t>Meta rígida en UF: el descalce cambiario cercano al pago no alcanza a corregirse</w:t>
+            </w:r>
+          </w:p>
+        </w:tc>
+      </w:tr>
+      <w:tr>
+        <w:tc>
+          <w:tcPr>
+            <w:tcW w:type="dxa" w:w="1928"/>
+          </w:tcPr>
+          <w:p>
+            <w:r/>
+            <w:r>
+              <w:rPr>
+                <w:sz w:val="17"/>
+              </w:rPr>
+              <w:t>Villarrica</w:t>
+            </w:r>
+          </w:p>
+        </w:tc>
+        <w:tc>
+          <w:tcPr>
+            <w:tcW w:type="dxa" w:w="1134"/>
+          </w:tcPr>
+          <w:p>
+            <w:r/>
+            <w:r>
+              <w:rPr>
+                <w:sz w:val="17"/>
+              </w:rPr>
+              <w:t>Año 25</w:t>
+            </w:r>
+          </w:p>
+        </w:tc>
+        <w:tc>
+          <w:tcPr>
+            <w:tcW w:type="dxa" w:w="2608"/>
+          </w:tcPr>
+          <w:p>
+            <w:r/>
+            <w:r>
+              <w:rPr>
+                <w:sz w:val="17"/>
+              </w:rPr>
+              <w:t>100% del valor presente del pago desde 3 años antes</w:t>
+            </w:r>
+          </w:p>
+        </w:tc>
+        <w:tc>
+          <w:tcPr>
+            <w:tcW w:type="dxa" w:w="3402"/>
+          </w:tcPr>
+          <w:p>
+            <w:r/>
+            <w:r>
+              <w:rPr>
+                <w:sz w:val="17"/>
+              </w:rPr>
+              <w:t>Meta en UF con fecha conocida</w:t>
+            </w:r>
+          </w:p>
+        </w:tc>
+      </w:tr>
+      <w:tr>
+        <w:tc>
+          <w:tcPr>
+            <w:tcW w:type="dxa" w:w="1928"/>
+            <w:shd w:val="clear" w:color="auto" w:fill="F2F5F9"/>
+          </w:tcPr>
+          <w:p>
+            <w:r/>
+            <w:r>
+              <w:rPr>
+                <w:sz w:val="17"/>
+              </w:rPr>
+              <w:t>Herencia</w:t>
+            </w:r>
+          </w:p>
+        </w:tc>
+        <w:tc>
+          <w:tcPr>
+            <w:tcW w:type="dxa" w:w="1134"/>
+            <w:shd w:val="clear" w:color="auto" w:fill="F2F5F9"/>
+          </w:tcPr>
+          <w:p>
+            <w:r/>
+            <w:r>
+              <w:rPr>
+                <w:sz w:val="17"/>
+              </w:rPr>
+              <w:t>Año 50</w:t>
+            </w:r>
+          </w:p>
+        </w:tc>
+        <w:tc>
+          <w:tcPr>
+            <w:tcW w:type="dxa" w:w="2608"/>
+            <w:shd w:val="clear" w:color="auto" w:fill="F2F5F9"/>
+          </w:tcPr>
+          <w:p>
+            <w:r/>
+            <w:r>
+              <w:rPr>
+                <w:sz w:val="17"/>
+              </w:rPr>
+              <w:t>Parcial o nula</w:t>
+            </w:r>
+          </w:p>
+        </w:tc>
+        <w:tc>
+          <w:tcPr>
+            <w:tcW w:type="dxa" w:w="3402"/>
+            <w:shd w:val="clear" w:color="auto" w:fill="F2F5F9"/>
+          </w:tcPr>
+          <w:p>
+            <w:r/>
+            <w:r>
+              <w:rPr>
+                <w:sz w:val="17"/>
+              </w:rPr>
+              <w:t>A plazos largos el peso tiende a ajustarse por la diferencia de inflación (Rogoff, 1996) y el beneficio de cubrir cae (Froot, 1993)</w:t>
+            </w:r>
+          </w:p>
+        </w:tc>
+      </w:tr>
+    </w:tbl>
+    <w:p/>
+    <w:p>
+      <w:pPr>
+        <w:pStyle w:val="ListBullet"/>
+      </w:pPr>
+      <w:r>
+        <w:rPr>
+          <w:b/>
+        </w:rPr>
+        <w:t xml:space="preserve">Costos y riesgos que se aceptan: </w:t>
+      </w:r>
+      <w:r>
+        <w:t>los puntos forward (0,44% del monto hoy) dependen del diferencial de tasas y se revisan en cada renovación; el contrato puede renovarse en peores condiciones; y las compensaciones exigen liquidez, que se cubre con la reserva, SGOV y el rebalanceo, sin vender acciones después de una caída.</w:t>
+      </w:r>
+    </w:p>
+    <w:p>
+      <w:pPr>
+        <w:pStyle w:val="ListBullet"/>
+      </w:pPr>
+      <w:r>
+        <w:rPr>
+          <w:b/>
+        </w:rPr>
+        <w:t xml:space="preserve">Lo que el forward no cubre: </w:t>
+      </w:r>
+      <w:r>
+        <w:t>la inflación chilena. Es el componente menor del riesgo frente a la UF y en el largo plazo queda recogido porque el modelo trabaja en USD reales.</w:t>
+      </w:r>
+    </w:p>
+    <w:p>
+      <w:pPr>
+        <w:pStyle w:val="ListBullet"/>
+      </w:pPr>
+      <w:r>
+        <w:rPr>
+          <w:b/>
+        </w:rPr>
+        <w:t xml:space="preserve">Mejora para la próxima revisión del IPS: </w:t>
+      </w:r>
+      <w:r>
+        <w:t>para los pagos fijos de Educación, un swap CLF/USD contra SOFR convertiría flujos en USD en flujos en UF a plazos largos. Se recomienda evaluarlo antes del año 11, porque es una herramienta más precisa que el forward para flujos conocidos.</w:t>
+      </w:r>
+    </w:p>
+    <w:p>
+      <w:pPr>
         <w:pStyle w:val="Heading2"/>
       </w:pPr>
       <w:r>
@@ -13710,6 +14093,17 @@
         <w:rPr>
           <w:sz w:val="17"/>
         </w:rPr>
+        <w:t>Campbell, J. Y., Serfaty-de Medeiros, K. y Viceira, L. M. (2010). Global Currency Hedging. Journal of Finance, 65(1), 87-121.</w:t>
+      </w:r>
+    </w:p>
+    <w:p>
+      <w:pPr>
+        <w:ind w:left="340" w:hanging="340"/>
+      </w:pPr>
+      <w:r>
+        <w:rPr>
+          <w:sz w:val="17"/>
+        </w:rPr>
         <w:t>Carhart, M. (1997). On Persistence in Mutual Fund Performance. Journal of Finance, 52(1), 57-82.</w:t>
       </w:r>
     </w:p>
@@ -13766,6 +14160,17 @@
           <w:sz w:val="17"/>
         </w:rPr>
         <w:t>Frazzini, A. y Pedersen, L. (2014). Betting Against Beta. Journal of Financial Economics, 111(1), 1-25.</w:t>
+      </w:r>
+    </w:p>
+    <w:p>
+      <w:pPr>
+        <w:ind w:left="340" w:hanging="340"/>
+      </w:pPr>
+      <w:r>
+        <w:rPr>
+          <w:sz w:val="17"/>
+        </w:rPr>
+        <w:t>Froot, K. A. (1993). Currency Hedging over Long Horizons. NBER Working Paper 4355.</w:t>
       </w:r>
     </w:p>
     <w:p>
@@ -13879,6 +14284,28 @@
       </w:r>
     </w:p>
     <w:p>
+      <w:pPr>
+        <w:ind w:left="340" w:hanging="340"/>
+      </w:pPr>
+      <w:r>
+        <w:rPr>
+          <w:sz w:val="17"/>
+        </w:rPr>
+        <w:t>Rogoff, K. (1996). The Purchasing Power Parity Puzzle. Journal of Economic Literature, 34(2), 647-668.</w:t>
+      </w:r>
+    </w:p>
+    <w:p>
+      <w:pPr>
+        <w:ind w:left="340" w:hanging="340"/>
+      </w:pPr>
+      <w:r>
+        <w:rPr>
+          <w:sz w:val="17"/>
+        </w:rPr>
+        <w:t>Sharpe, W. F. y Tint, L. G. (1990). Liabilities: A New Approach. Journal of Portfolio Management, 16(2), 5-10.</w:t>
+      </w:r>
+    </w:p>
+    <w:p>
       <w:r>
         <w:br w:type="page"/>
       </w:r>
@@ -14428,6 +14855,20 @@
           <w:i w:val="0"/>
         </w:rPr>
         <w:t>Todo el universo de inversión cotiza en USD. El peso se deprecia cuando caen los mercados (cobertura natural) y el ahorro en USD diversifica el riesgo país de una familia cuyo capital humano y vivienda están en Chile. Las simulaciones se presentan también en UF, y el riesgo cambiario de corto plazo se cubre parcialmente con un forward.</w:t>
+      </w:r>
+    </w:p>
+    <w:p>
+      <w:r>
+        <w:rPr>
+          <w:b/>
+        </w:rPr>
+        <w:t xml:space="preserve">¿Por qué solo un forward a un año, si las metas son de largo plazo? </w:t>
+      </w:r>
+      <w:r>
+        <w:rPr>
+          <w:i w:val="0"/>
+        </w:rPr>
+        <w:t>Porque se renueva al vencer cada contrato (roll-over) y la gestión debe hacerse con instrumentos de StockTrak, que están en USD. La cobertura es parcial a propósito: el dólar sube cuando caen las bolsas y la parte no cubierta amortigua las caídas en pesos. El riesgo cambiario está en la simulación (en UF la probabilidad de los tres objetivos es 45,3% frente a 46,5% en USD). A medida que se acerque cada pago en UF, la cobertura sube al 100% de ese monto, y para Educación recomendamos evaluar un swap CLF/USD en la próxima revisión del IPS.</w:t>
       </w:r>
     </w:p>
     <w:p>

</xml_diff>

<commit_message>
Agrega cotizaciones forward de Banco de Chile y BCI
Co-Authored-By: Claude Opus 5.5 <noreply@anthropic.com>
Claude-Session: https://claude.ai/code/session_01T5hAYzxrHpdpyuLVyANGG6
</commit_message>
<xml_diff>
--- a/nexum_proyecto_final/informe/Informe_Final_Nexum.docx
+++ b/nexum_proyecto_final/informe/Informe_Final_Nexum.docx
@@ -5052,6 +5052,360 @@
           <w:i w:val="0"/>
         </w:rPr>
         <w:t>El 28 de septiembre de 2026 Nexum contrató un forward con BDCH: vende USD 104.000 a CLP 963,08 por dólar, con vencimiento el 30 de septiembre de 2027. El precio es el spot de CLP 967,32 menos 4,24 puntos forward. Los puntos negativos reflejan que la tasa en pesos es menor que la tasa en dólares (paridad cubierta de tasas): cubrirse cuesta 0,44% del monto, unos USD 456 si el dólar no se mueve. El contrato no se opera en StockTrak; se registra y valoriza aparte.</w:t>
+      </w:r>
+    </w:p>
+    <w:tbl>
+      <w:tblPr>
+        <w:tblStyle w:val="TableGrid"/>
+        <w:tblW w:type="auto" w:w="0"/>
+        <w:jc w:val="center"/>
+        <w:tblLook w:firstColumn="1" w:firstRow="1" w:lastColumn="0" w:lastRow="0" w:noHBand="0" w:noVBand="1" w:val="04A0"/>
+      </w:tblPr>
+      <w:tblGrid>
+        <w:gridCol w:w="1376"/>
+        <w:gridCol w:w="1376"/>
+        <w:gridCol w:w="1376"/>
+        <w:gridCol w:w="1376"/>
+        <w:gridCol w:w="1376"/>
+        <w:gridCol w:w="1376"/>
+        <w:gridCol w:w="1376"/>
+      </w:tblGrid>
+      <w:tr>
+        <w:tc>
+          <w:tcPr>
+            <w:tcW w:type="dxa" w:w="1587"/>
+            <w:shd w:val="clear" w:color="auto" w:fill="1F3A5F"/>
+          </w:tcPr>
+          <w:p>
+            <w:r/>
+            <w:r>
+              <w:rPr>
+                <w:b/>
+                <w:color w:val="FFFFFF"/>
+                <w:sz w:val="17"/>
+              </w:rPr>
+              <w:t>Banco</w:t>
+            </w:r>
+          </w:p>
+        </w:tc>
+        <w:tc>
+          <w:tcPr>
+            <w:tcW w:type="dxa" w:w="1247"/>
+            <w:shd w:val="clear" w:color="auto" w:fill="1F3A5F"/>
+          </w:tcPr>
+          <w:p>
+            <w:r/>
+            <w:r>
+              <w:rPr>
+                <w:b/>
+                <w:color w:val="FFFFFF"/>
+                <w:sz w:val="17"/>
+              </w:rPr>
+              <w:t>Fecha de cotización</w:t>
+            </w:r>
+          </w:p>
+        </w:tc>
+        <w:tc>
+          <w:tcPr>
+            <w:tcW w:type="dxa" w:w="1587"/>
+            <w:shd w:val="clear" w:color="auto" w:fill="1F3A5F"/>
+          </w:tcPr>
+          <w:p>
+            <w:r/>
+            <w:r>
+              <w:rPr>
+                <w:b/>
+                <w:color w:val="FFFFFF"/>
+                <w:sz w:val="17"/>
+              </w:rPr>
+              <w:t>Plazo</w:t>
+            </w:r>
+          </w:p>
+        </w:tc>
+        <w:tc>
+          <w:tcPr>
+            <w:tcW w:type="dxa" w:w="1020"/>
+            <w:shd w:val="clear" w:color="auto" w:fill="1F3A5F"/>
+          </w:tcPr>
+          <w:p>
+            <w:r/>
+            <w:r>
+              <w:rPr>
+                <w:b/>
+                <w:color w:val="FFFFFF"/>
+                <w:sz w:val="17"/>
+              </w:rPr>
+              <w:t>Spot (CLP)</w:t>
+            </w:r>
+          </w:p>
+        </w:tc>
+        <w:tc>
+          <w:tcPr>
+            <w:tcW w:type="dxa" w:w="1474"/>
+            <w:shd w:val="clear" w:color="auto" w:fill="1F3A5F"/>
+          </w:tcPr>
+          <w:p>
+            <w:r/>
+            <w:r>
+              <w:rPr>
+                <w:b/>
+                <w:color w:val="FFFFFF"/>
+                <w:sz w:val="17"/>
+              </w:rPr>
+              <w:t>Puntos forward (venta USD)</w:t>
+            </w:r>
+          </w:p>
+        </w:tc>
+        <w:tc>
+          <w:tcPr>
+            <w:tcW w:type="dxa" w:w="1361"/>
+            <w:shd w:val="clear" w:color="auto" w:fill="1F3A5F"/>
+          </w:tcPr>
+          <w:p>
+            <w:r/>
+            <w:r>
+              <w:rPr>
+                <w:b/>
+                <w:color w:val="FFFFFF"/>
+                <w:sz w:val="17"/>
+              </w:rPr>
+              <w:t>Forward (CLP por USD)</w:t>
+            </w:r>
+          </w:p>
+        </w:tc>
+        <w:tc>
+          <w:tcPr>
+            <w:tcW w:type="dxa" w:w="907"/>
+            <w:shd w:val="clear" w:color="auto" w:fill="1F3A5F"/>
+          </w:tcPr>
+          <w:p>
+            <w:r/>
+            <w:r>
+              <w:rPr>
+                <w:b/>
+                <w:color w:val="FFFFFF"/>
+                <w:sz w:val="17"/>
+              </w:rPr>
+              <w:t>Uso</w:t>
+            </w:r>
+          </w:p>
+        </w:tc>
+      </w:tr>
+      <w:tr>
+        <w:tc>
+          <w:tcPr>
+            <w:tcW w:type="dxa" w:w="1587"/>
+          </w:tcPr>
+          <w:p>
+            <w:r/>
+            <w:r>
+              <w:rPr>
+                <w:sz w:val="17"/>
+              </w:rPr>
+              <w:t>Banco de Chile (BDCH)</w:t>
+            </w:r>
+          </w:p>
+        </w:tc>
+        <w:tc>
+          <w:tcPr>
+            <w:tcW w:type="dxa" w:w="1247"/>
+          </w:tcPr>
+          <w:p>
+            <w:r/>
+            <w:r>
+              <w:rPr>
+                <w:sz w:val="17"/>
+              </w:rPr>
+              <w:t>28-sep-2026</w:t>
+            </w:r>
+          </w:p>
+        </w:tc>
+        <w:tc>
+          <w:tcPr>
+            <w:tcW w:type="dxa" w:w="1587"/>
+          </w:tcPr>
+          <w:p>
+            <w:r/>
+            <w:r>
+              <w:rPr>
+                <w:sz w:val="17"/>
+              </w:rPr>
+              <w:t>1 año (vence 30-sep-2027)</w:t>
+            </w:r>
+          </w:p>
+        </w:tc>
+        <w:tc>
+          <w:tcPr>
+            <w:tcW w:type="dxa" w:w="1020"/>
+          </w:tcPr>
+          <w:p>
+            <w:r/>
+            <w:r>
+              <w:rPr>
+                <w:sz w:val="17"/>
+              </w:rPr>
+              <w:t>967,32</w:t>
+            </w:r>
+          </w:p>
+        </w:tc>
+        <w:tc>
+          <w:tcPr>
+            <w:tcW w:type="dxa" w:w="1474"/>
+          </w:tcPr>
+          <w:p>
+            <w:r/>
+            <w:r>
+              <w:rPr>
+                <w:sz w:val="17"/>
+              </w:rPr>
+              <w:t>−4,24</w:t>
+            </w:r>
+          </w:p>
+        </w:tc>
+        <w:tc>
+          <w:tcPr>
+            <w:tcW w:type="dxa" w:w="1361"/>
+          </w:tcPr>
+          <w:p>
+            <w:r/>
+            <w:r>
+              <w:rPr>
+                <w:sz w:val="17"/>
+              </w:rPr>
+              <w:t>963,08</w:t>
+            </w:r>
+          </w:p>
+        </w:tc>
+        <w:tc>
+          <w:tcPr>
+            <w:tcW w:type="dxa" w:w="907"/>
+          </w:tcPr>
+          <w:p>
+            <w:r/>
+            <w:r>
+              <w:rPr>
+                <w:sz w:val="17"/>
+              </w:rPr>
+              <w:t>Contratado</w:t>
+            </w:r>
+          </w:p>
+        </w:tc>
+      </w:tr>
+      <w:tr>
+        <w:tc>
+          <w:tcPr>
+            <w:tcW w:type="dxa" w:w="1587"/>
+            <w:shd w:val="clear" w:color="auto" w:fill="F2F5F9"/>
+          </w:tcPr>
+          <w:p>
+            <w:r/>
+            <w:r>
+              <w:rPr>
+                <w:sz w:val="17"/>
+              </w:rPr>
+              <w:t>BCI</w:t>
+            </w:r>
+          </w:p>
+        </w:tc>
+        <w:tc>
+          <w:tcPr>
+            <w:tcW w:type="dxa" w:w="1247"/>
+            <w:shd w:val="clear" w:color="auto" w:fill="F2F5F9"/>
+          </w:tcPr>
+          <w:p>
+            <w:r/>
+            <w:r>
+              <w:rPr>
+                <w:sz w:val="17"/>
+              </w:rPr>
+              <w:t>28-sep-2026</w:t>
+            </w:r>
+          </w:p>
+        </w:tc>
+        <w:tc>
+          <w:tcPr>
+            <w:tcW w:type="dxa" w:w="1587"/>
+            <w:shd w:val="clear" w:color="auto" w:fill="F2F5F9"/>
+          </w:tcPr>
+          <w:p>
+            <w:r/>
+            <w:r>
+              <w:rPr>
+                <w:sz w:val="17"/>
+              </w:rPr>
+              <w:t>1 año (vence 30-sep-2027)</w:t>
+            </w:r>
+          </w:p>
+        </w:tc>
+        <w:tc>
+          <w:tcPr>
+            <w:tcW w:type="dxa" w:w="1020"/>
+            <w:shd w:val="clear" w:color="auto" w:fill="F2F5F9"/>
+          </w:tcPr>
+          <w:p>
+            <w:r/>
+            <w:r>
+              <w:rPr>
+                <w:sz w:val="17"/>
+              </w:rPr>
+              <w:t>967,33 (bid)</w:t>
+            </w:r>
+          </w:p>
+        </w:tc>
+        <w:tc>
+          <w:tcPr>
+            <w:tcW w:type="dxa" w:w="1474"/>
+            <w:shd w:val="clear" w:color="auto" w:fill="F2F5F9"/>
+          </w:tcPr>
+          <w:p>
+            <w:r/>
+            <w:r>
+              <w:rPr>
+                <w:sz w:val="17"/>
+              </w:rPr>
+              <w:t>−0,30 / +0,30 (bid/ask)</w:t>
+            </w:r>
+          </w:p>
+        </w:tc>
+        <w:tc>
+          <w:tcPr>
+            <w:tcW w:type="dxa" w:w="1361"/>
+            <w:shd w:val="clear" w:color="auto" w:fill="F2F5F9"/>
+          </w:tcPr>
+          <w:p>
+            <w:r/>
+            <w:r>
+              <w:rPr>
+                <w:sz w:val="17"/>
+              </w:rPr>
+              <w:t>967,03 / 968,45</w:t>
+            </w:r>
+          </w:p>
+        </w:tc>
+        <w:tc>
+          <w:tcPr>
+            <w:tcW w:type="dxa" w:w="907"/>
+            <w:shd w:val="clear" w:color="auto" w:fill="F2F5F9"/>
+          </w:tcPr>
+          <w:p>
+            <w:r/>
+            <w:r>
+              <w:rPr>
+                <w:sz w:val="17"/>
+              </w:rPr>
+              <w:t>Referencia</w:t>
+            </w:r>
+          </w:p>
+        </w:tc>
+      </w:tr>
+    </w:tbl>
+    <w:p>
+      <w:r>
+        <w:rPr>
+          <w:i/>
+          <w:sz w:val="16"/>
+        </w:rPr>
+        <w:t>Fuente: Bloomberg, FX Forward Calculator (USD/CLP NDF, fuente forward BCI; spot REGN). Se contrató con Banco de Chile porque sus puntos son coherentes con la paridad cubierta de tasas (tasa en pesos menor que en dólares implica puntos negativos de ~0,4% anual). La curva de BCI mostró puntos simétricos y redondos (±0,30 a 1 año, ±1,00 a 2 años, ±3,00 a 5 años), propios de una cotización indicativa, por lo que no se usó para contratar.</w:t>
       </w:r>
     </w:p>
     <w:tbl>

</xml_diff>

<commit_message>
Agrega desempeño semanal vs benchmark de política a la sección 5
Co-Authored-By: Claude Opus 5.5 <noreply@anthropic.com>
Claude-Session: https://claude.ai/code/session_01T5hAYzxrHpdpyuLVyANGG6
</commit_message>
<xml_diff>
--- a/nexum_proyecto_final/informe/Informe_Final_Nexum.docx
+++ b/nexum_proyecto_final/informe/Informe_Final_Nexum.docx
@@ -13618,6 +13618,593 @@
           <w:i w:val="0"/>
         </w:rPr>
         <w:t>Por clase de activo: la renta fija replica su benchmark, como corresponde a un núcleo pasivo; la renta variable queda 1,2 puntos bajo el S&amp;P 500, en parte por las comisiones (54 operaciones, USD 540) y en parte por el sesgo defensivo de Low-Volatility en un mercado al alza; commodities queda 7,6 puntos bajo su benchmark por la pérdida en USO, ya liquidado.</w:t>
+      </w:r>
+    </w:p>
+    <w:p>
+      <w:pPr>
+        <w:pStyle w:val="Heading3"/>
+      </w:pPr>
+      <w:r>
+        <w:t>Desempeño semanal frente al benchmark</w:t>
+      </w:r>
+    </w:p>
+    <w:tbl>
+      <w:tblPr>
+        <w:tblStyle w:val="TableGrid"/>
+        <w:tblW w:type="auto" w:w="0"/>
+        <w:jc w:val="center"/>
+        <w:tblLook w:firstColumn="1" w:firstRow="1" w:lastColumn="0" w:lastRow="0" w:noHBand="0" w:noVBand="1" w:val="04A0"/>
+      </w:tblPr>
+      <w:tblGrid>
+        <w:gridCol w:w="1605"/>
+        <w:gridCol w:w="1605"/>
+        <w:gridCol w:w="1605"/>
+        <w:gridCol w:w="1605"/>
+        <w:gridCol w:w="1605"/>
+        <w:gridCol w:w="1605"/>
+      </w:tblGrid>
+      <w:tr>
+        <w:tc>
+          <w:tcPr>
+            <w:tcW w:type="dxa" w:w="1701"/>
+            <w:shd w:val="clear" w:color="auto" w:fill="1F3A5F"/>
+          </w:tcPr>
+          <w:p>
+            <w:r/>
+            <w:r>
+              <w:rPr>
+                <w:b/>
+                <w:color w:val="FFFFFF"/>
+                <w:sz w:val="17"/>
+              </w:rPr>
+              <w:t>Semana</w:t>
+            </w:r>
+          </w:p>
+        </w:tc>
+        <w:tc>
+          <w:tcPr>
+            <w:tcW w:type="dxa" w:w="1474"/>
+            <w:shd w:val="clear" w:color="auto" w:fill="1F3A5F"/>
+          </w:tcPr>
+          <w:p>
+            <w:r/>
+            <w:r>
+              <w:rPr>
+                <w:b/>
+                <w:color w:val="FFFFFF"/>
+                <w:sz w:val="17"/>
+              </w:rPr>
+              <w:t>Nexum en la semana</w:t>
+            </w:r>
+          </w:p>
+        </w:tc>
+        <w:tc>
+          <w:tcPr>
+            <w:tcW w:type="dxa" w:w="1474"/>
+            <w:shd w:val="clear" w:color="auto" w:fill="1F3A5F"/>
+          </w:tcPr>
+          <w:p>
+            <w:r/>
+            <w:r>
+              <w:rPr>
+                <w:b/>
+                <w:color w:val="FFFFFF"/>
+                <w:sz w:val="17"/>
+              </w:rPr>
+              <w:t>Benchmark en la semana</w:t>
+            </w:r>
+          </w:p>
+        </w:tc>
+        <w:tc>
+          <w:tcPr>
+            <w:tcW w:type="dxa" w:w="1474"/>
+            <w:shd w:val="clear" w:color="auto" w:fill="1F3A5F"/>
+          </w:tcPr>
+          <w:p>
+            <w:r/>
+            <w:r>
+              <w:rPr>
+                <w:b/>
+                <w:color w:val="FFFFFF"/>
+                <w:sz w:val="17"/>
+              </w:rPr>
+              <w:t>Nexum acumulado</w:t>
+            </w:r>
+          </w:p>
+        </w:tc>
+        <w:tc>
+          <w:tcPr>
+            <w:tcW w:type="dxa" w:w="1474"/>
+            <w:shd w:val="clear" w:color="auto" w:fill="1F3A5F"/>
+          </w:tcPr>
+          <w:p>
+            <w:r/>
+            <w:r>
+              <w:rPr>
+                <w:b/>
+                <w:color w:val="FFFFFF"/>
+                <w:sz w:val="17"/>
+              </w:rPr>
+              <w:t>Benchmark acumulado</w:t>
+            </w:r>
+          </w:p>
+        </w:tc>
+        <w:tc>
+          <w:tcPr>
+            <w:tcW w:type="dxa" w:w="1474"/>
+            <w:shd w:val="clear" w:color="auto" w:fill="1F3A5F"/>
+          </w:tcPr>
+          <w:p>
+            <w:r/>
+            <w:r>
+              <w:rPr>
+                <w:b/>
+                <w:color w:val="FFFFFF"/>
+                <w:sz w:val="17"/>
+              </w:rPr>
+              <w:t>Diferencia acumulada</w:t>
+            </w:r>
+          </w:p>
+        </w:tc>
+      </w:tr>
+      <w:tr>
+        <w:tc>
+          <w:tcPr>
+            <w:tcW w:type="dxa" w:w="1701"/>
+          </w:tcPr>
+          <w:p>
+            <w:r/>
+            <w:r>
+              <w:rPr>
+                <w:sz w:val="17"/>
+              </w:rPr>
+              <w:t>11 al 18-sep</w:t>
+            </w:r>
+          </w:p>
+        </w:tc>
+        <w:tc>
+          <w:tcPr>
+            <w:tcW w:type="dxa" w:w="1474"/>
+          </w:tcPr>
+          <w:p>
+            <w:r/>
+            <w:r>
+              <w:rPr>
+                <w:sz w:val="17"/>
+              </w:rPr>
+              <w:t>−0,29%</w:t>
+            </w:r>
+          </w:p>
+        </w:tc>
+        <w:tc>
+          <w:tcPr>
+            <w:tcW w:type="dxa" w:w="1474"/>
+          </w:tcPr>
+          <w:p>
+            <w:r/>
+            <w:r>
+              <w:rPr>
+                <w:sz w:val="17"/>
+              </w:rPr>
+              <w:t>−0,15%</w:t>
+            </w:r>
+          </w:p>
+        </w:tc>
+        <w:tc>
+          <w:tcPr>
+            <w:tcW w:type="dxa" w:w="1474"/>
+          </w:tcPr>
+          <w:p>
+            <w:r/>
+            <w:r>
+              <w:rPr>
+                <w:sz w:val="17"/>
+              </w:rPr>
+              <w:t>−0,29%</w:t>
+            </w:r>
+          </w:p>
+        </w:tc>
+        <w:tc>
+          <w:tcPr>
+            <w:tcW w:type="dxa" w:w="1474"/>
+          </w:tcPr>
+          <w:p>
+            <w:r/>
+            <w:r>
+              <w:rPr>
+                <w:sz w:val="17"/>
+              </w:rPr>
+              <w:t>−0,15%</w:t>
+            </w:r>
+          </w:p>
+        </w:tc>
+        <w:tc>
+          <w:tcPr>
+            <w:tcW w:type="dxa" w:w="1474"/>
+          </w:tcPr>
+          <w:p>
+            <w:r/>
+            <w:r>
+              <w:rPr>
+                <w:sz w:val="17"/>
+              </w:rPr>
+              <w:t>−0,14 pp</w:t>
+            </w:r>
+          </w:p>
+        </w:tc>
+      </w:tr>
+      <w:tr>
+        <w:tc>
+          <w:tcPr>
+            <w:tcW w:type="dxa" w:w="1701"/>
+            <w:shd w:val="clear" w:color="auto" w:fill="F2F5F9"/>
+          </w:tcPr>
+          <w:p>
+            <w:r/>
+            <w:r>
+              <w:rPr>
+                <w:sz w:val="17"/>
+              </w:rPr>
+              <w:t>19 al 25-sep</w:t>
+            </w:r>
+          </w:p>
+        </w:tc>
+        <w:tc>
+          <w:tcPr>
+            <w:tcW w:type="dxa" w:w="1474"/>
+            <w:shd w:val="clear" w:color="auto" w:fill="F2F5F9"/>
+          </w:tcPr>
+          <w:p>
+            <w:r/>
+            <w:r>
+              <w:rPr>
+                <w:sz w:val="17"/>
+              </w:rPr>
+              <w:t>−0,56%</w:t>
+            </w:r>
+          </w:p>
+        </w:tc>
+        <w:tc>
+          <w:tcPr>
+            <w:tcW w:type="dxa" w:w="1474"/>
+            <w:shd w:val="clear" w:color="auto" w:fill="F2F5F9"/>
+          </w:tcPr>
+          <w:p>
+            <w:r/>
+            <w:r>
+              <w:rPr>
+                <w:sz w:val="17"/>
+              </w:rPr>
+              <w:t>−0,37%</w:t>
+            </w:r>
+          </w:p>
+        </w:tc>
+        <w:tc>
+          <w:tcPr>
+            <w:tcW w:type="dxa" w:w="1474"/>
+            <w:shd w:val="clear" w:color="auto" w:fill="F2F5F9"/>
+          </w:tcPr>
+          <w:p>
+            <w:r/>
+            <w:r>
+              <w:rPr>
+                <w:sz w:val="17"/>
+              </w:rPr>
+              <w:t>−0,85%</w:t>
+            </w:r>
+          </w:p>
+        </w:tc>
+        <w:tc>
+          <w:tcPr>
+            <w:tcW w:type="dxa" w:w="1474"/>
+            <w:shd w:val="clear" w:color="auto" w:fill="F2F5F9"/>
+          </w:tcPr>
+          <w:p>
+            <w:r/>
+            <w:r>
+              <w:rPr>
+                <w:sz w:val="17"/>
+              </w:rPr>
+              <w:t>−0,52%</w:t>
+            </w:r>
+          </w:p>
+        </w:tc>
+        <w:tc>
+          <w:tcPr>
+            <w:tcW w:type="dxa" w:w="1474"/>
+            <w:shd w:val="clear" w:color="auto" w:fill="F2F5F9"/>
+          </w:tcPr>
+          <w:p>
+            <w:r/>
+            <w:r>
+              <w:rPr>
+                <w:sz w:val="17"/>
+              </w:rPr>
+              <w:t>−0,33 pp</w:t>
+            </w:r>
+          </w:p>
+        </w:tc>
+      </w:tr>
+      <w:tr>
+        <w:tc>
+          <w:tcPr>
+            <w:tcW w:type="dxa" w:w="1701"/>
+          </w:tcPr>
+          <w:p>
+            <w:r/>
+            <w:r>
+              <w:rPr>
+                <w:sz w:val="17"/>
+              </w:rPr>
+              <w:t>26-sep al 2-oct</w:t>
+            </w:r>
+          </w:p>
+        </w:tc>
+        <w:tc>
+          <w:tcPr>
+            <w:tcW w:type="dxa" w:w="1474"/>
+          </w:tcPr>
+          <w:p>
+            <w:r/>
+            <w:r>
+              <w:rPr>
+                <w:sz w:val="17"/>
+              </w:rPr>
+              <w:t>−0,95%</w:t>
+            </w:r>
+          </w:p>
+        </w:tc>
+        <w:tc>
+          <w:tcPr>
+            <w:tcW w:type="dxa" w:w="1474"/>
+          </w:tcPr>
+          <w:p>
+            <w:r/>
+            <w:r>
+              <w:rPr>
+                <w:sz w:val="17"/>
+              </w:rPr>
+              <w:t>−0,64%</w:t>
+            </w:r>
+          </w:p>
+        </w:tc>
+        <w:tc>
+          <w:tcPr>
+            <w:tcW w:type="dxa" w:w="1474"/>
+          </w:tcPr>
+          <w:p>
+            <w:r/>
+            <w:r>
+              <w:rPr>
+                <w:sz w:val="17"/>
+              </w:rPr>
+              <w:t>−1,79%</w:t>
+            </w:r>
+          </w:p>
+        </w:tc>
+        <w:tc>
+          <w:tcPr>
+            <w:tcW w:type="dxa" w:w="1474"/>
+          </w:tcPr>
+          <w:p>
+            <w:r/>
+            <w:r>
+              <w:rPr>
+                <w:sz w:val="17"/>
+              </w:rPr>
+              <w:t>−1,16%</w:t>
+            </w:r>
+          </w:p>
+        </w:tc>
+        <w:tc>
+          <w:tcPr>
+            <w:tcW w:type="dxa" w:w="1474"/>
+          </w:tcPr>
+          <w:p>
+            <w:r/>
+            <w:r>
+              <w:rPr>
+                <w:sz w:val="17"/>
+              </w:rPr>
+              <w:t>−0,63 pp</w:t>
+            </w:r>
+          </w:p>
+        </w:tc>
+      </w:tr>
+      <w:tr>
+        <w:tc>
+          <w:tcPr>
+            <w:tcW w:type="dxa" w:w="1701"/>
+            <w:shd w:val="clear" w:color="auto" w:fill="F2F5F9"/>
+          </w:tcPr>
+          <w:p>
+            <w:r/>
+            <w:r>
+              <w:rPr>
+                <w:sz w:val="17"/>
+              </w:rPr>
+              <w:t>3 al 9-oct</w:t>
+            </w:r>
+          </w:p>
+        </w:tc>
+        <w:tc>
+          <w:tcPr>
+            <w:tcW w:type="dxa" w:w="1474"/>
+            <w:shd w:val="clear" w:color="auto" w:fill="F2F5F9"/>
+          </w:tcPr>
+          <w:p>
+            <w:r/>
+            <w:r>
+              <w:rPr>
+                <w:sz w:val="17"/>
+              </w:rPr>
+              <w:t>+1,03%</w:t>
+            </w:r>
+          </w:p>
+        </w:tc>
+        <w:tc>
+          <w:tcPr>
+            <w:tcW w:type="dxa" w:w="1474"/>
+            <w:shd w:val="clear" w:color="auto" w:fill="F2F5F9"/>
+          </w:tcPr>
+          <w:p>
+            <w:r/>
+            <w:r>
+              <w:rPr>
+                <w:sz w:val="17"/>
+              </w:rPr>
+              <w:t>+1,01%</w:t>
+            </w:r>
+          </w:p>
+        </w:tc>
+        <w:tc>
+          <w:tcPr>
+            <w:tcW w:type="dxa" w:w="1474"/>
+            <w:shd w:val="clear" w:color="auto" w:fill="F2F5F9"/>
+          </w:tcPr>
+          <w:p>
+            <w:r/>
+            <w:r>
+              <w:rPr>
+                <w:sz w:val="17"/>
+              </w:rPr>
+              <w:t>−0,78%</w:t>
+            </w:r>
+          </w:p>
+        </w:tc>
+        <w:tc>
+          <w:tcPr>
+            <w:tcW w:type="dxa" w:w="1474"/>
+            <w:shd w:val="clear" w:color="auto" w:fill="F2F5F9"/>
+          </w:tcPr>
+          <w:p>
+            <w:r/>
+            <w:r>
+              <w:rPr>
+                <w:sz w:val="17"/>
+              </w:rPr>
+              <w:t>−0,16%</w:t>
+            </w:r>
+          </w:p>
+        </w:tc>
+        <w:tc>
+          <w:tcPr>
+            <w:tcW w:type="dxa" w:w="1474"/>
+            <w:shd w:val="clear" w:color="auto" w:fill="F2F5F9"/>
+          </w:tcPr>
+          <w:p>
+            <w:r/>
+            <w:r>
+              <w:rPr>
+                <w:sz w:val="17"/>
+              </w:rPr>
+              <w:t>−0,62 pp</w:t>
+            </w:r>
+          </w:p>
+        </w:tc>
+      </w:tr>
+      <w:tr>
+        <w:tc>
+          <w:tcPr>
+            <w:tcW w:type="dxa" w:w="1701"/>
+          </w:tcPr>
+          <w:p>
+            <w:r/>
+            <w:r>
+              <w:rPr>
+                <w:sz w:val="17"/>
+              </w:rPr>
+              <w:t>10 al 14-oct</w:t>
+            </w:r>
+          </w:p>
+        </w:tc>
+        <w:tc>
+          <w:tcPr>
+            <w:tcW w:type="dxa" w:w="1474"/>
+          </w:tcPr>
+          <w:p>
+            <w:r/>
+            <w:r>
+              <w:rPr>
+                <w:sz w:val="17"/>
+              </w:rPr>
+              <w:t>−0,28%</w:t>
+            </w:r>
+          </w:p>
+        </w:tc>
+        <w:tc>
+          <w:tcPr>
+            <w:tcW w:type="dxa" w:w="1474"/>
+          </w:tcPr>
+          <w:p>
+            <w:r/>
+            <w:r>
+              <w:rPr>
+                <w:sz w:val="17"/>
+              </w:rPr>
+              <w:t>−0,05%</w:t>
+            </w:r>
+          </w:p>
+        </w:tc>
+        <w:tc>
+          <w:tcPr>
+            <w:tcW w:type="dxa" w:w="1474"/>
+          </w:tcPr>
+          <w:p>
+            <w:r/>
+            <w:r>
+              <w:rPr>
+                <w:sz w:val="17"/>
+              </w:rPr>
+              <w:t>−1,05%</w:t>
+            </w:r>
+          </w:p>
+        </w:tc>
+        <w:tc>
+          <w:tcPr>
+            <w:tcW w:type="dxa" w:w="1474"/>
+          </w:tcPr>
+          <w:p>
+            <w:r/>
+            <w:r>
+              <w:rPr>
+                <w:sz w:val="17"/>
+              </w:rPr>
+              <w:t>−0,21%</w:t>
+            </w:r>
+          </w:p>
+        </w:tc>
+        <w:tc>
+          <w:tcPr>
+            <w:tcW w:type="dxa" w:w="1474"/>
+          </w:tcPr>
+          <w:p>
+            <w:r/>
+            <w:r>
+              <w:rPr>
+                <w:sz w:val="17"/>
+              </w:rPr>
+              <w:t>−0,84 pp</w:t>
+            </w:r>
+          </w:p>
+        </w:tc>
+      </w:tr>
+    </w:tbl>
+    <w:p>
+      <w:r>
+        <w:rPr>
+          <w:i/>
+          <w:sz w:val="16"/>
+        </w:rPr>
+        <w:t>Nexum: valor diario reconstruido con el historial de transacciones de StockTrak (incluye comisiones y dividendos) y precios de cierre; coincide con StockTrak al 6-oct (−1,15%). Al 14-oct da −1,05%; StockTrak informa −1,14% porque usa precios intradía del momento del export. Benchmark: benchmark de política (SPY, TLH, VCLT, QMOM, SPLV y DJP con los pesos aprobados sobre el 96% invertido, más 4% en T-Bills), retorno total. Base: cierre del 11-sep, la misma del dashboard del grupo. Fuente de precios: Yahoo Finance.</w:t>
+      </w:r>
+    </w:p>
+    <w:p>
+      <w:r>
+        <w:rPr>
+          <w:i w:val="0"/>
+        </w:rPr>
+        <w:t>Lectura. En las semanas de alza de las tasas largas y caída del petróleo (hasta el 2-oct) Nexum cayó más que el benchmark; en la recuperación del 3 al 9-oct subió lo mismo, sin recuperar la brecha. La diferencia acumulada de −0,84 puntos se explica por las comisiones (62 operaciones, USD 620, cerca de 0,4 puntos), la pérdida en USO y la caja sin invertir en Momentum y commodities. El peor punto de Nexum fue −2,2% el 30-sep, lejos del gatillo de revisión de −15% del IPS. En el mismo período la AGF 85/15 rindió +0,65% y el S&amp;P 500 +1,26%.</w:t>
       </w:r>
     </w:p>
     <w:p>

</xml_diff>

<commit_message>
Agrega versión B del informe: la casa de Villarrica como parte de la herencia
Incluye en el informe oficial el párrafo nuevo de la 3.4 y la frase del forward.

Co-Authored-By: Claude Opus 5.5 <noreply@anthropic.com>
Claude-Session: https://claude.ai/code/session_01T5hAYzxrHpdpyuLVyANGG6
</commit_message>
<xml_diff>
--- a/nexum_proyecto_final/informe/Informe_Final_Nexum.docx
+++ b/nexum_proyecto_final/informe/Informe_Final_Nexum.docx
@@ -59,7 +59,7 @@
           <w:i/>
           <w:sz w:val="18"/>
         </w:rPr>
-        <w:t>ESF 2026-2 · Universidad Adolfo Ibáñez · Datos de mercado al 31-ago-2026; implementación al 5-oct-2026</w:t>
+        <w:t>ESF 2026-2 · Universidad Adolfo Ibáñez · Datos de mercado al 31-ago-2026; implementación al 14-oct-2026</w:t>
       </w:r>
     </w:p>
     <w:p>
@@ -4997,45 +4997,11 @@
       </w:r>
     </w:p>
     <w:p>
-      <w:pPr>
-        <w:pStyle w:val="ListBullet"/>
-      </w:pPr>
       <w:r>
         <w:rPr>
-          <w:b/>
+          <w:i w:val="0"/>
         </w:rPr>
-        <w:t xml:space="preserve">Cobertura natural: </w:t>
-      </w:r>
-      <w:r>
-        <w:t>el peso se deprecia cuando caen los mercados globales (correlación S&amp;P 500 vs. USD/CLP de -0,36). En el 10% de los peores meses del S&amp;P 500 el dólar subió 2,9% en promedio: la cartera perdió -4,4% en USD pero solo -1,5% medida en pesos.</w:t>
-      </w:r>
-    </w:p>
-    <w:p>
-      <w:pPr>
-        <w:pStyle w:val="ListBullet"/>
-      </w:pPr>
-      <w:r>
-        <w:rPr>
-          <w:b/>
-        </w:rPr>
-        <w:t xml:space="preserve">Diversificación del riesgo país: </w:t>
-      </w:r>
-      <w:r>
-        <w:t>el capital humano y la vivienda de la familia ya están expuestos a Chile.</w:t>
-      </w:r>
-    </w:p>
-    <w:p>
-      <w:pPr>
-        <w:pStyle w:val="ListBullet"/>
-      </w:pPr>
-      <w:r>
-        <w:rPr>
-          <w:b/>
-        </w:rPr>
-        <w:t xml:space="preserve">Costo: </w:t>
-      </w:r>
-      <w:r>
-        <w:t>la volatilidad del USD/CLP es 12,5% anual; medida en pesos, la volatilidad de la cartera sube de 9,9% a 12,6%, y la probabilidad conjunta histórica baja de 96,0% a 89,6%. Se monitorea en cada revisión.</w:t>
+        <w:t>Mantener la cartera en dólares tiene dos ventajas para esta familia. Primero, funciona como una cobertura natural: el peso chileno tiende a depreciarse cuando caen los mercados globales (la correlación entre el S&amp;P 500 y el tipo de cambio es -0,36), de modo que en el 10% de los peores meses del S&amp;P 500 el dólar subió 2,9% en promedio y la cartera, que perdió 4,4% en dólares, perdió solo 1,5% medida en pesos. Segundo, diversifica el riesgo país, porque el empleo y la vivienda de la familia ya dependen de Chile. La contracara es el riesgo cambiario: el tipo de cambio tiene una volatilidad de 12,5% anual, por lo que, medida en pesos, la volatilidad de la cartera sube de 9,9% a 12,6% y la probabilidad histórica de cumplir los tres objetivos baja de 96,0% a 89,6%. Por eso ese costo se mide en cada revisión y se cubre en parte con el forward que se describe a continuación.</w:t>
       </w:r>
     </w:p>
     <w:p>
@@ -5406,6 +5372,14 @@
           <w:sz w:val="16"/>
         </w:rPr>
         <w:t>Fuente: Bloomberg, FX Forward Calculator (USD/CLP NDF, fuente forward BCI; spot REGN). Se contrató con Banco de Chile porque sus puntos son coherentes con la paridad cubierta de tasas (tasa en pesos menor que en dólares implica puntos negativos de ~0,4% anual). La curva de BCI mostró puntos simétricos y redondos (±0,30 a 1 año, ±1,00 a 2 años, ±3,00 a 5 años), propios de una cotización indicativa, por lo que no se usó para contratar.</w:t>
+      </w:r>
+    </w:p>
+    <w:p>
+      <w:r>
+        <w:rPr>
+          <w:i w:val="0"/>
+        </w:rPr>
+        <w:t>¿Qué significa este contrato al vencimiento? Nexum vende USD 104.000 a CLP 963,08, pase lo que pase con el dólar. La tabla muestra la compensación en distintos escenarios: si el dólar cae bajo ese precio, el banco le paga la diferencia a Nexum; si sube, Nexum la paga. En ambos casos el resultado compensa lo que le pasa a la cartera medida en pesos, que es justamente el objetivo de la cobertura.</w:t>
       </w:r>
     </w:p>
     <w:tbl>

</xml_diff>

<commit_message>
Informe: celdas completas, referencia a sección 4.3 y estilo del párrafo de la versión B
Co-Authored-By: Claude Opus 5.5 <noreply@anthropic.com>
Claude-Session: https://claude.ai/code/session_01T5hAYzxrHpdpyuLVyANGG6
</commit_message>
<xml_diff>
--- a/nexum_proyecto_final/informe/Informe_Final_Nexum.docx
+++ b/nexum_proyecto_final/informe/Informe_Final_Nexum.docx
@@ -1771,7 +1771,7 @@
               <w:rPr>
                 <w:sz w:val="17"/>
               </w:rPr>
-              <w:t>Villarrica (desembolso; UF 15.000 adicionales vienen de la venta de la casa, fue</w:t>
+              <w:t>Villarrica (desembolso; UF 15.000 adicionales vienen de la venta de la casa, fuera de la cartera)</w:t>
             </w:r>
           </w:p>
         </w:tc>
@@ -2002,7 +2002,7 @@
         <w:rPr>
           <w:i w:val="0"/>
         </w:rPr>
-        <w:t>Marco: Black-Litterman parte de un prior de equilibrio de paridad de riesgo (peso inverso a la volatilidad), deriva retornos implícitos π = δΣw y los combina con dos vistas explícitas: el S&amp;P 500 rinde 6% (prima por riesgo de largo plazo) y Low-Volatility supera a commodities en 2 puntos. La optimización restringe el núcleo pasivo entre 60% y 70%. Markowitz con medias históricas se reporta solo como referencia: concentra en lo que más rindió en el pasado (ver walk-forward, sección 4.4).</w:t>
+        <w:t>Marco: Black-Litterman parte de un prior de equilibrio de paridad de riesgo (peso inverso a la volatilidad), deriva retornos implícitos π = δΣw y los combina con dos vistas explícitas: el S&amp;P 500 rinde 6% (prima por riesgo de largo plazo) y Low-Volatility supera a commodities en 2 puntos. La optimización restringe el núcleo pasivo entre 60% y 70%. Markowitz con medias históricas se reporta solo como referencia: concentra en lo que más rindió en el pasado (ver walk-forward, sección 4.3).</w:t>
       </w:r>
     </w:p>
     <w:p>
@@ -4264,7 +4264,7 @@
         <w:rPr>
           <w:i w:val="0"/>
         </w:rPr>
-        <w:t>Discusión crítica. (i) Las primas de factores se reducen fuera de muestra y después de su publicación (McLean y Pontiff, 2016), por eso los supuestos prospectivos usan primas menores a las históricas. (ii) Momentum sufre caídas abruptas cuando el mercado rebota. (iii) Low-Volatility se concentra en utilities y REITs, sensibles a tasas; en septiembre de 2026 se observó en vivo, con la tasa a 10 años en 5,3%. (iv) Momentum en commodities es sensible a sus umbrales y su universo se amplió mirando el backtest (sección 4.4): con el universo original de 3 ETF su Sharpe cae de 0,44 a 0,23. Por eso es el sleeve con menor peso.</w:t>
+        <w:t>Discusión crítica. (i) Las primas de factores se reducen fuera de muestra y después de su publicación (McLean y Pontiff, 2016), por eso los supuestos prospectivos usan primas menores a las históricas. (ii) Momentum sufre caídas abruptas cuando el mercado rebota. (iii) Low-Volatility se concentra en utilities y REITs, sensibles a tasas; en septiembre de 2026 se observó en vivo, con la tasa a 10 años en 5,3%. (iv) Momentum en commodities es sensible a sus umbrales y su universo se amplió mirando el backtest (sección 4.3): con el universo original de 3 ETF su Sharpe cae de 0,44 a 0,23. Por eso es el sleeve con menor peso.</w:t>
       </w:r>
     </w:p>
     <w:p>
@@ -11415,7 +11415,7 @@
               <w:rPr>
                 <w:sz w:val="15"/>
               </w:rPr>
-              <w:t>+ filtro de Sharpe con vol. 12 meses (versión vigent</w:t>
+              <w:t>+ filtro de Sharpe con vol. 12 meses (versión vigente)</w:t>
             </w:r>
           </w:p>
         </w:tc>

</xml_diff>